<commit_message>
Update report with KPI Summary components
Co-Authored-By: Claude Sonnet 5.5 <noreply@anthropic.com>
Claude-Session: https://claude.ai/code/session_017RLvirTSx84UWnroqbbqTM
</commit_message>
<xml_diff>
--- a/output/Laporan_UTS_BDASC_EverMart.docx
+++ b/output/Laporan_UTS_BDASC_EverMart.docx
@@ -3928,7 +3928,7 @@
       <w:r>
         <w:drawing>
           <wp:inline distT="0" distB="0" distL="0" distR="0">
-            <wp:extent cx="5334000" cy="3028950"/>
+            <wp:extent cx="5334000" cy="742950"/>
             <wp:effectExtent t="0" r="0" b="0" l="0"/>
             <wp:docPr id="1" name="" descr="" title=""/>
             <wp:cNvGraphicFramePr>
@@ -3953,7 +3953,7 @@
                   <pic:spPr bwMode="auto">
                     <a:xfrm>
                       <a:off x="0" y="0"/>
-                      <a:ext cx="5334000" cy="3028950"/>
+                      <a:ext cx="5334000" cy="742950"/>
                     </a:xfrm>
                     <a:prstGeom prst="rect">
                       <a:avLst/>
@@ -3979,43 +3979,7 @@
           <w:sz w:val="21"/>
           <w:szCs w:val="21"/>
         </w:rPr>
-        <w:t xml:space="preserve">Gambar 4.6 Halaman KPI Summary</w:t>
-      </w:r>
-    </w:p>
-    <w:p>
-      <w:pPr>
-        <w:spacing w:after="120" w:line="300"/>
-        <w:jc w:val="both"/>
-      </w:pPr>
-      <w:r>
-        <w:rPr>
-          <w:rFonts w:ascii="Times New Roman" w:cs="Times New Roman" w:eastAsia="Times New Roman" w:hAnsi="Times New Roman"/>
-        </w:rPr>
-        <w:t xml:space="preserve">Gambar 4.6 menampilkan ringkasan kinerja dalam satu halaman. Empat kartu menyajikan Total Revenue (689.995,56), Total Transactions (1.000), Total Unique Customers (199), dan Avg Order Value (690,00). Tabel menyajikan perbandingan antar wilayah dengan Revenue per Customer, Total Revenue, dan Revenue Share %, sedangkan dua grafik menunjukkan tren bulanan dan pendapatan per kategori. Seluruh angka dihasilkan oleh measure DAX.</w:t>
-      </w:r>
-    </w:p>
-    <w:p>
-      <w:pPr>
-        <w:pStyle w:val="Heading2"/>
-        <w:spacing w:after="100" w:before="200"/>
-      </w:pPr>
-      <w:r>
-        <w:rPr>
-          <w:rFonts w:ascii="Times New Roman" w:cs="Times New Roman" w:eastAsia="Times New Roman" w:hAnsi="Times New Roman"/>
-        </w:rPr>
-        <w:t xml:space="preserve">4.1.4 Interaktivitas Dashboard</w:t>
-      </w:r>
-    </w:p>
-    <w:p>
-      <w:pPr>
-        <w:spacing w:after="120" w:line="300"/>
-        <w:jc w:val="both"/>
-      </w:pPr>
-      <w:r>
-        <w:rPr>
-          <w:rFonts w:ascii="Times New Roman" w:cs="Times New Roman" w:eastAsia="Times New Roman" w:hAnsi="Times New Roman"/>
-        </w:rPr>
-        <w:t xml:space="preserve">Slicer memungkinkan pengguna menyaring seluruh visual secara serentak. Perhitungan pada measure DAX diperbarui menurut konteks filter yang dipilih.</w:t>
+        <w:t xml:space="preserve">Gambar 4.6 Kartu KPI pada halaman Laporan Ringkasan KPI</w:t>
       </w:r>
     </w:p>
     <w:p>
@@ -4026,7 +3990,7 @@
       <w:r>
         <w:drawing>
           <wp:inline distT="0" distB="0" distL="0" distR="0">
-            <wp:extent cx="5143500" cy="2876550"/>
+            <wp:extent cx="3810000" cy="1676400"/>
             <wp:effectExtent t="0" r="0" b="0" l="0"/>
             <wp:docPr id="1" name="" descr="" title=""/>
             <wp:cNvGraphicFramePr>
@@ -4051,7 +4015,7 @@
                   <pic:spPr bwMode="auto">
                     <a:xfrm>
                       <a:off x="0" y="0"/>
-                      <a:ext cx="5143500" cy="2876550"/>
+                      <a:ext cx="3810000" cy="1676400"/>
                     </a:xfrm>
                     <a:prstGeom prst="rect">
                       <a:avLst/>
@@ -4077,19 +4041,7 @@
           <w:sz w:val="21"/>
           <w:szCs w:val="21"/>
         </w:rPr>
-        <w:t xml:space="preserve">Gambar 4.7 Hasil penyaringan wilayah South America</w:t>
-      </w:r>
-    </w:p>
-    <w:p>
-      <w:pPr>
-        <w:spacing w:after="120" w:line="300"/>
-        <w:jc w:val="both"/>
-      </w:pPr>
-      <w:r>
-        <w:rPr>
-          <w:rFonts w:ascii="Times New Roman" w:cs="Times New Roman" w:eastAsia="Times New Roman" w:hAnsi="Times New Roman"/>
-        </w:rPr>
-        <w:t xml:space="preserve">Gambar 4.7 memperlihatkan hasil ketika wilayah South America dipilih: Total Revenue 219,35 ribu, Total Transactions 304, Total Unique Customers 59, dan Avg Order Value 721,55. Angka ini lebih tinggi dari rata-rata keseluruhan (690,00) sehingga wilayah tersebut bernilai transaksi lebih besar.</w:t>
+        <w:t xml:space="preserve">Gambar 4.7 Tabel perbandingan wilayah</w:t>
       </w:r>
     </w:p>
     <w:p>
@@ -4100,7 +4052,7 @@
       <w:r>
         <w:drawing>
           <wp:inline distT="0" distB="0" distL="0" distR="0">
-            <wp:extent cx="4953000" cy="2857500"/>
+            <wp:extent cx="4953000" cy="1390650"/>
             <wp:effectExtent t="0" r="0" b="0" l="0"/>
             <wp:docPr id="1" name="" descr="" title=""/>
             <wp:cNvGraphicFramePr>
@@ -4125,6 +4077,364 @@
                   <pic:spPr bwMode="auto">
                     <a:xfrm>
                       <a:off x="0" y="0"/>
+                      <a:ext cx="4953000" cy="1390650"/>
+                    </a:xfrm>
+                    <a:prstGeom prst="rect">
+                      <a:avLst/>
+                    </a:prstGeom>
+                  </pic:spPr>
+                </pic:pic>
+              </a:graphicData>
+            </a:graphic>
+          </wp:inline>
+        </w:drawing>
+      </w:r>
+    </w:p>
+    <w:p>
+      <w:pPr>
+        <w:spacing w:after="160"/>
+        <w:jc w:val="center"/>
+      </w:pPr>
+      <w:r>
+        <w:rPr>
+          <w:rFonts w:ascii="Times New Roman" w:cs="Times New Roman" w:eastAsia="Times New Roman" w:hAnsi="Times New Roman"/>
+          <w:i/>
+          <w:iCs/>
+          <w:sz w:val="21"/>
+          <w:szCs w:val="21"/>
+        </w:rPr>
+        <w:t xml:space="preserve">Gambar 4.8 Grafik garis Total Revenue by Month</w:t>
+      </w:r>
+    </w:p>
+    <w:p>
+      <w:pPr>
+        <w:spacing w:after="60" w:before="100"/>
+        <w:jc w:val="center"/>
+      </w:pPr>
+      <w:r>
+        <w:drawing>
+          <wp:inline distT="0" distB="0" distL="0" distR="0">
+            <wp:extent cx="3810000" cy="1847850"/>
+            <wp:effectExtent t="0" r="0" b="0" l="0"/>
+            <wp:docPr id="1" name="" descr="" title=""/>
+            <wp:cNvGraphicFramePr>
+              <a:graphicFrameLocks xmlns:a="http://schemas.openxmlformats.org/drawingml/2006/main" noChangeAspect="1"/>
+            </wp:cNvGraphicFramePr>
+            <a:graphic xmlns:a="http://schemas.openxmlformats.org/drawingml/2006/main">
+              <a:graphicData uri="http://schemas.openxmlformats.org/drawingml/2006/picture">
+                <pic:pic xmlns:pic="http://schemas.openxmlformats.org/drawingml/2006/picture">
+                  <pic:nvPicPr>
+                    <pic:cNvPr id="0" name="" descr=""/>
+                    <pic:cNvPicPr>
+                      <a:picLocks noChangeAspect="1" noChangeArrowheads="1"/>
+                    </pic:cNvPicPr>
+                  </pic:nvPicPr>
+                  <pic:blipFill>
+                    <a:blip r:embed="rId14" cstate="none"/>
+                    <a:srcRect/>
+                    <a:stretch>
+                      <a:fillRect/>
+                    </a:stretch>
+                  </pic:blipFill>
+                  <pic:spPr bwMode="auto">
+                    <a:xfrm>
+                      <a:off x="0" y="0"/>
+                      <a:ext cx="3810000" cy="1847850"/>
+                    </a:xfrm>
+                    <a:prstGeom prst="rect">
+                      <a:avLst/>
+                    </a:prstGeom>
+                  </pic:spPr>
+                </pic:pic>
+              </a:graphicData>
+            </a:graphic>
+          </wp:inline>
+        </w:drawing>
+      </w:r>
+    </w:p>
+    <w:p>
+      <w:pPr>
+        <w:spacing w:after="160"/>
+        <w:jc w:val="center"/>
+      </w:pPr>
+      <w:r>
+        <w:rPr>
+          <w:rFonts w:ascii="Times New Roman" w:cs="Times New Roman" w:eastAsia="Times New Roman" w:hAnsi="Times New Roman"/>
+          <w:i/>
+          <w:iCs/>
+          <w:sz w:val="21"/>
+          <w:szCs w:val="21"/>
+        </w:rPr>
+        <w:t xml:space="preserve">Gambar 4.9 Grafik batang Total Revenue by Category</w:t>
+      </w:r>
+    </w:p>
+    <w:p>
+      <w:pPr>
+        <w:spacing w:after="60" w:before="100"/>
+        <w:jc w:val="center"/>
+      </w:pPr>
+      <w:r>
+        <w:drawing>
+          <wp:inline distT="0" distB="0" distL="0" distR="0">
+            <wp:extent cx="1619250" cy="781050"/>
+            <wp:effectExtent t="0" r="0" b="0" l="0"/>
+            <wp:docPr id="1" name="" descr="" title=""/>
+            <wp:cNvGraphicFramePr>
+              <a:graphicFrameLocks xmlns:a="http://schemas.openxmlformats.org/drawingml/2006/main" noChangeAspect="1"/>
+            </wp:cNvGraphicFramePr>
+            <a:graphic xmlns:a="http://schemas.openxmlformats.org/drawingml/2006/main">
+              <a:graphicData uri="http://schemas.openxmlformats.org/drawingml/2006/picture">
+                <pic:pic xmlns:pic="http://schemas.openxmlformats.org/drawingml/2006/picture">
+                  <pic:nvPicPr>
+                    <pic:cNvPr id="0" name="" descr=""/>
+                    <pic:cNvPicPr>
+                      <a:picLocks noChangeAspect="1" noChangeArrowheads="1"/>
+                    </pic:cNvPicPr>
+                  </pic:nvPicPr>
+                  <pic:blipFill>
+                    <a:blip r:embed="rId20" cstate="none"/>
+                    <a:srcRect/>
+                    <a:stretch>
+                      <a:fillRect/>
+                    </a:stretch>
+                  </pic:blipFill>
+                  <pic:spPr bwMode="auto">
+                    <a:xfrm>
+                      <a:off x="0" y="0"/>
+                      <a:ext cx="1619250" cy="781050"/>
+                    </a:xfrm>
+                    <a:prstGeom prst="rect">
+                      <a:avLst/>
+                    </a:prstGeom>
+                  </pic:spPr>
+                </pic:pic>
+              </a:graphicData>
+            </a:graphic>
+          </wp:inline>
+        </w:drawing>
+      </w:r>
+    </w:p>
+    <w:p>
+      <w:pPr>
+        <w:spacing w:after="160"/>
+        <w:jc w:val="center"/>
+      </w:pPr>
+      <w:r>
+        <w:rPr>
+          <w:rFonts w:ascii="Times New Roman" w:cs="Times New Roman" w:eastAsia="Times New Roman" w:hAnsi="Times New Roman"/>
+          <w:i/>
+          <w:iCs/>
+          <w:sz w:val="21"/>
+          <w:szCs w:val="21"/>
+        </w:rPr>
+        <w:t xml:space="preserve">Gambar 4.10 Slicer Region</w:t>
+      </w:r>
+    </w:p>
+    <w:p>
+      <w:pPr>
+        <w:spacing w:after="60" w:before="100"/>
+        <w:jc w:val="center"/>
+      </w:pPr>
+      <w:r>
+        <w:drawing>
+          <wp:inline distT="0" distB="0" distL="0" distR="0">
+            <wp:extent cx="1619250" cy="762000"/>
+            <wp:effectExtent t="0" r="0" b="0" l="0"/>
+            <wp:docPr id="1" name="" descr="" title=""/>
+            <wp:cNvGraphicFramePr>
+              <a:graphicFrameLocks xmlns:a="http://schemas.openxmlformats.org/drawingml/2006/main" noChangeAspect="1"/>
+            </wp:cNvGraphicFramePr>
+            <a:graphic xmlns:a="http://schemas.openxmlformats.org/drawingml/2006/main">
+              <a:graphicData uri="http://schemas.openxmlformats.org/drawingml/2006/picture">
+                <pic:pic xmlns:pic="http://schemas.openxmlformats.org/drawingml/2006/picture">
+                  <pic:nvPicPr>
+                    <pic:cNvPr id="0" name="" descr=""/>
+                    <pic:cNvPicPr>
+                      <a:picLocks noChangeAspect="1" noChangeArrowheads="1"/>
+                    </pic:cNvPicPr>
+                  </pic:nvPicPr>
+                  <pic:blipFill>
+                    <a:blip r:embed="rId21" cstate="none"/>
+                    <a:srcRect/>
+                    <a:stretch>
+                      <a:fillRect/>
+                    </a:stretch>
+                  </pic:blipFill>
+                  <pic:spPr bwMode="auto">
+                    <a:xfrm>
+                      <a:off x="0" y="0"/>
+                      <a:ext cx="1619250" cy="762000"/>
+                    </a:xfrm>
+                    <a:prstGeom prst="rect">
+                      <a:avLst/>
+                    </a:prstGeom>
+                  </pic:spPr>
+                </pic:pic>
+              </a:graphicData>
+            </a:graphic>
+          </wp:inline>
+        </w:drawing>
+      </w:r>
+    </w:p>
+    <w:p>
+      <w:pPr>
+        <w:spacing w:after="160"/>
+        <w:jc w:val="center"/>
+      </w:pPr>
+      <w:r>
+        <w:rPr>
+          <w:rFonts w:ascii="Times New Roman" w:cs="Times New Roman" w:eastAsia="Times New Roman" w:hAnsi="Times New Roman"/>
+          <w:i/>
+          <w:iCs/>
+          <w:sz w:val="21"/>
+          <w:szCs w:val="21"/>
+        </w:rPr>
+        <w:t xml:space="preserve">Gambar 4.11 Slicer Year</w:t>
+      </w:r>
+    </w:p>
+    <w:p>
+      <w:pPr>
+        <w:spacing w:after="120" w:line="300"/>
+        <w:jc w:val="both"/>
+      </w:pPr>
+      <w:r>
+        <w:rPr>
+          <w:rFonts w:ascii="Times New Roman" w:cs="Times New Roman" w:eastAsia="Times New Roman" w:hAnsi="Times New Roman"/>
+        </w:rPr>
+        <w:t xml:space="preserve">Gambar 4.6 sampai 4.10 menampilkan komponen halaman ringkasan kinerja dalam satu halaman. Empat kartu menyajikan Total Revenue (689.995,56), Total Transactions (1.000), Total Unique Customers (199), dan Avg Order Value (690,00). Tabel (Gambar 4.7) menyajikan perbandingan antar wilayah dengan Revenue per Customer, Total Revenue, dan Revenue Share %, sedangkan grafik garis (Gambar 4.8) menunjukkan tren bulanan. Slicer Region dan Year (Gambar 4.10 dan 4.10) memungkinkan pengguna menyaring seluruh visual. Seluruh angka dihasilkan oleh measure DAX.</w:t>
+      </w:r>
+    </w:p>
+    <w:p>
+      <w:pPr>
+        <w:pStyle w:val="Heading2"/>
+        <w:spacing w:after="100" w:before="200"/>
+      </w:pPr>
+      <w:r>
+        <w:rPr>
+          <w:rFonts w:ascii="Times New Roman" w:cs="Times New Roman" w:eastAsia="Times New Roman" w:hAnsi="Times New Roman"/>
+        </w:rPr>
+        <w:t xml:space="preserve">4.1.4 Interaktivitas Dashboard</w:t>
+      </w:r>
+    </w:p>
+    <w:p>
+      <w:pPr>
+        <w:spacing w:after="120" w:line="300"/>
+        <w:jc w:val="both"/>
+      </w:pPr>
+      <w:r>
+        <w:rPr>
+          <w:rFonts w:ascii="Times New Roman" w:cs="Times New Roman" w:eastAsia="Times New Roman" w:hAnsi="Times New Roman"/>
+        </w:rPr>
+        <w:t xml:space="preserve">Slicer memungkinkan pengguna menyaring seluruh visual secara serentak. Perhitungan pada measure DAX diperbarui menurut konteks filter yang dipilih.</w:t>
+      </w:r>
+    </w:p>
+    <w:p>
+      <w:pPr>
+        <w:spacing w:after="60" w:before="100"/>
+        <w:jc w:val="center"/>
+      </w:pPr>
+      <w:r>
+        <w:drawing>
+          <wp:inline distT="0" distB="0" distL="0" distR="0">
+            <wp:extent cx="5143500" cy="2876550"/>
+            <wp:effectExtent t="0" r="0" b="0" l="0"/>
+            <wp:docPr id="1" name="" descr="" title=""/>
+            <wp:cNvGraphicFramePr>
+              <a:graphicFrameLocks xmlns:a="http://schemas.openxmlformats.org/drawingml/2006/main" noChangeAspect="1"/>
+            </wp:cNvGraphicFramePr>
+            <a:graphic xmlns:a="http://schemas.openxmlformats.org/drawingml/2006/main">
+              <a:graphicData uri="http://schemas.openxmlformats.org/drawingml/2006/picture">
+                <pic:pic xmlns:pic="http://schemas.openxmlformats.org/drawingml/2006/picture">
+                  <pic:nvPicPr>
+                    <pic:cNvPr id="0" name="" descr=""/>
+                    <pic:cNvPicPr>
+                      <a:picLocks noChangeAspect="1" noChangeArrowheads="1"/>
+                    </pic:cNvPicPr>
+                  </pic:nvPicPr>
+                  <pic:blipFill>
+                    <a:blip r:embed="rId22" cstate="none"/>
+                    <a:srcRect/>
+                    <a:stretch>
+                      <a:fillRect/>
+                    </a:stretch>
+                  </pic:blipFill>
+                  <pic:spPr bwMode="auto">
+                    <a:xfrm>
+                      <a:off x="0" y="0"/>
+                      <a:ext cx="5143500" cy="2876550"/>
+                    </a:xfrm>
+                    <a:prstGeom prst="rect">
+                      <a:avLst/>
+                    </a:prstGeom>
+                  </pic:spPr>
+                </pic:pic>
+              </a:graphicData>
+            </a:graphic>
+          </wp:inline>
+        </w:drawing>
+      </w:r>
+    </w:p>
+    <w:p>
+      <w:pPr>
+        <w:spacing w:after="160"/>
+        <w:jc w:val="center"/>
+      </w:pPr>
+      <w:r>
+        <w:rPr>
+          <w:rFonts w:ascii="Times New Roman" w:cs="Times New Roman" w:eastAsia="Times New Roman" w:hAnsi="Times New Roman"/>
+          <w:i/>
+          <w:iCs/>
+          <w:sz w:val="21"/>
+          <w:szCs w:val="21"/>
+        </w:rPr>
+        <w:t xml:space="preserve">Gambar 4.12 Hasil penyaringan wilayah South America</w:t>
+      </w:r>
+    </w:p>
+    <w:p>
+      <w:pPr>
+        <w:spacing w:after="120" w:line="300"/>
+        <w:jc w:val="both"/>
+      </w:pPr>
+      <w:r>
+        <w:rPr>
+          <w:rFonts w:ascii="Times New Roman" w:cs="Times New Roman" w:eastAsia="Times New Roman" w:hAnsi="Times New Roman"/>
+        </w:rPr>
+        <w:t xml:space="preserve">Gambar 4.12 memperlihatkan hasil ketika wilayah South America dipilih: Total Revenue 219,35 ribu, Total Transactions 304, Total Unique Customers 59, dan Avg Order Value 721,55. Angka ini lebih tinggi dari rata-rata keseluruhan (690,00) sehingga wilayah tersebut bernilai transaksi lebih besar.</w:t>
+      </w:r>
+    </w:p>
+    <w:p>
+      <w:pPr>
+        <w:spacing w:after="60" w:before="100"/>
+        <w:jc w:val="center"/>
+      </w:pPr>
+      <w:r>
+        <w:drawing>
+          <wp:inline distT="0" distB="0" distL="0" distR="0">
+            <wp:extent cx="4953000" cy="2857500"/>
+            <wp:effectExtent t="0" r="0" b="0" l="0"/>
+            <wp:docPr id="1" name="" descr="" title=""/>
+            <wp:cNvGraphicFramePr>
+              <a:graphicFrameLocks xmlns:a="http://schemas.openxmlformats.org/drawingml/2006/main" noChangeAspect="1"/>
+            </wp:cNvGraphicFramePr>
+            <a:graphic xmlns:a="http://schemas.openxmlformats.org/drawingml/2006/main">
+              <a:graphicData uri="http://schemas.openxmlformats.org/drawingml/2006/picture">
+                <pic:pic xmlns:pic="http://schemas.openxmlformats.org/drawingml/2006/picture">
+                  <pic:nvPicPr>
+                    <pic:cNvPr id="0" name="" descr=""/>
+                    <pic:cNvPicPr>
+                      <a:picLocks noChangeAspect="1" noChangeArrowheads="1"/>
+                    </pic:cNvPicPr>
+                  </pic:nvPicPr>
+                  <pic:blipFill>
+                    <a:blip r:embed="rId23" cstate="none"/>
+                    <a:srcRect/>
+                    <a:stretch>
+                      <a:fillRect/>
+                    </a:stretch>
+                  </pic:blipFill>
+                  <pic:spPr bwMode="auto">
+                    <a:xfrm>
+                      <a:off x="0" y="0"/>
                       <a:ext cx="4953000" cy="2857500"/>
                     </a:xfrm>
                     <a:prstGeom prst="rect">
@@ -4151,7 +4461,7 @@
           <w:sz w:val="21"/>
           <w:szCs w:val="21"/>
         </w:rPr>
-        <w:t xml:space="preserve">Gambar 4.8 Hasil penyaringan bulan Oktober melalui grafik tren</w:t>
+        <w:t xml:space="preserve">Gambar 4.13 Hasil penyaringan bulan Oktober melalui grafik tren</w:t>
       </w:r>
     </w:p>
     <w:p>
@@ -4163,7 +4473,7 @@
         <w:rPr>
           <w:rFonts w:ascii="Times New Roman" w:cs="Times New Roman" w:eastAsia="Times New Roman" w:hAnsi="Times New Roman"/>
         </w:rPr>
-        <w:t xml:space="preserve">Gambar 4.8 memperlihatkan efek pemilihan bulan Oktober pada grafik tren: seluruh kartu dan tabel menyesuaikan, yaitu Total Revenue 47,06 ribu, 70 transaksi, 60 pelanggan, dan Avg Order Value 672,33. Fitur ini memungkinkan analisis rinci per periode tanpa membuat laporan terpisah.</w:t>
+        <w:t xml:space="preserve">Gambar 4.13 memperlihatkan efek pemilihan bulan Oktober pada grafik tren: seluruh kartu dan tabel menyesuaikan, yaitu Total Revenue 47,06 ribu, 70 transaksi, 60 pelanggan, dan Avg Order Value 672,33. Fitur ini memungkinkan analisis rinci per periode tanpa membuat laporan terpisah.</w:t>
       </w:r>
     </w:p>
     <w:p>

</xml_diff>

<commit_message>
Fix category chart aspect ratio
Co-Authored-By: Claude Sonnet 5.5 <noreply@anthropic.com>
Claude-Session: https://claude.ai/code/session_017RLvirTSx84UWnroqbbqTM
</commit_message>
<xml_diff>
--- a/output/Laporan_UTS_BDASC_EverMart.docx
+++ b/output/Laporan_UTS_BDASC_EverMart.docx
@@ -4114,7 +4114,7 @@
       <w:r>
         <w:drawing>
           <wp:inline distT="0" distB="0" distL="0" distR="0">
-            <wp:extent cx="3810000" cy="1847850"/>
+            <wp:extent cx="2857500" cy="2085975"/>
             <wp:effectExtent t="0" r="0" b="0" l="0"/>
             <wp:docPr id="1" name="" descr="" title=""/>
             <wp:cNvGraphicFramePr>
@@ -4139,7 +4139,7 @@
                   <pic:spPr bwMode="auto">
                     <a:xfrm>
                       <a:off x="0" y="0"/>
-                      <a:ext cx="3810000" cy="1847850"/>
+                      <a:ext cx="2857500" cy="2085975"/>
                     </a:xfrm>
                     <a:prstGeom prst="rect">
                       <a:avLst/>

</xml_diff>

<commit_message>
Expand report with variable and customer detail
Co-Authored-By: Claude Sonnet 5.5 <noreply@anthropic.com>
Claude-Session: https://claude.ai/code/session_017RLvirTSx84UWnroqbbqTM
</commit_message>
<xml_diff>
--- a/output/Laporan_UTS_BDASC_EverMart.docx
+++ b/output/Laporan_UTS_BDASC_EverMart.docx
@@ -2369,6 +2369,30 @@
     </w:p>
     <w:p>
       <w:pPr>
+        <w:spacing w:after="120" w:line="300"/>
+        <w:jc w:val="both"/>
+      </w:pPr>
+      <w:r>
+        <w:rPr>
+          <w:rFonts w:ascii="Times New Roman" w:cs="Times New Roman" w:eastAsia="Times New Roman" w:hAnsi="Times New Roman"/>
+        </w:rPr>
+        <w:t xml:space="preserve">Secara keseluruhan dataset terdiri atas 3 tabel dengan 15 kolom. Karena CustomerID, ProductID, dan Price masing-masing muncul pada dua tabel, jumlah variabel unik adalah 12. Variabel tersebut dikelompokkan menjadi tiga jenis: pengenal (CustomerID, ProductID, TransactionID), kategorikal (Region, Category, ProductName, CustomerName), dan numerik atau waktu (Price, Quantity, TotalValue, SignupDate, TransactionDate). Variabel numerik menjadi dasar perhitungan ukuran (measure) DAX, sedangkan variabel kategorikal digunakan sebagai sumbu, legenda, dan slicer pada dashboard.</w:t>
+      </w:r>
+    </w:p>
+    <w:p>
+      <w:pPr>
+        <w:spacing w:after="120" w:line="300"/>
+        <w:jc w:val="both"/>
+      </w:pPr>
+      <w:r>
+        <w:rPr>
+          <w:rFonts w:ascii="Times New Roman" w:cs="Times New Roman" w:eastAsia="Times New Roman" w:hAnsi="Times New Roman"/>
+        </w:rPr>
+        <w:t xml:space="preserve">Variabel Region (4 nilai) dan Category (4 nilai) memiliki kardinalitas rendah sehingga cocok untuk perbandingan antarkelompok. Variabel Quantity bernilai 1 sampai 4 unit per transaksi dengan total 2.537 unit terjual, sedangkan TotalValue merupakan hasil perkalian Quantity dan Price sehingga menjadi dasar seluruh perhitungan pendapatan.</w:t>
+      </w:r>
+    </w:p>
+    <w:p>
+      <w:pPr>
         <w:pStyle w:val="Heading2"/>
         <w:spacing w:after="100" w:before="200"/>
       </w:pPr>
@@ -2462,6 +2486,488 @@
           <w:rFonts w:ascii="Times New Roman" w:cs="Times New Roman" w:eastAsia="Times New Roman" w:hAnsi="Times New Roman"/>
         </w:rPr>
         <w:t xml:space="preserve">Terdapat 200 pelanggan terdaftar, tetapi hanya 199 yang bertransaksi (pelanggan C0180 belum pernah bertransaksi).</w:t>
+      </w:r>
+    </w:p>
+    <w:p>
+      <w:pPr>
+        <w:pStyle w:val="Heading2"/>
+        <w:spacing w:after="100" w:before="200"/>
+      </w:pPr>
+      <w:r>
+        <w:rPr>
+          <w:rFonts w:ascii="Times New Roman" w:cs="Times New Roman" w:eastAsia="Times New Roman" w:hAnsi="Times New Roman"/>
+        </w:rPr>
+        <w:t xml:space="preserve">2.4 Pelanggan Terdaftar dan Pelanggan Bertransaksi</w:t>
+      </w:r>
+    </w:p>
+    <w:p>
+      <w:pPr>
+        <w:spacing w:after="80" w:before="100"/>
+        <w:jc w:val="center"/>
+      </w:pPr>
+      <w:r>
+        <w:rPr>
+          <w:rFonts w:ascii="Times New Roman" w:cs="Times New Roman" w:eastAsia="Times New Roman" w:hAnsi="Times New Roman"/>
+          <w:b/>
+          <w:bCs/>
+          <w:sz w:val="22"/>
+          <w:szCs w:val="22"/>
+        </w:rPr>
+        <w:t xml:space="preserve">Tabel 2.3 Pelanggan terdaftar dan pelanggan aktif</w:t>
+      </w:r>
+    </w:p>
+    <w:tbl>
+      <w:tblPr>
+        <w:tblW w:type="dxa" w:w="9360"/>
+        <w:tblBorders>
+          <w:top w:val="single" w:color="auto" w:sz="4"/>
+          <w:left w:val="single" w:color="auto" w:sz="4"/>
+          <w:bottom w:val="single" w:color="auto" w:sz="4"/>
+          <w:right w:val="single" w:color="auto" w:sz="4"/>
+          <w:insideH w:val="single" w:color="auto" w:sz="4"/>
+          <w:insideV w:val="single" w:color="auto" w:sz="4"/>
+        </w:tblBorders>
+      </w:tblPr>
+      <w:tblGrid>
+        <w:gridCol w:w="4200"/>
+        <w:gridCol w:w="1400"/>
+        <w:gridCol w:w="3760"/>
+      </w:tblGrid>
+      <w:tr>
+        <w:trPr>
+          <w:tblHeader/>
+        </w:trPr>
+        <w:tc>
+          <w:tcPr>
+            <w:tcW w:type="dxa" w:w="4200"/>
+            <w:tcBorders>
+              <w:top w:val="single" w:color="888888" w:sz="4"/>
+              <w:left w:val="single" w:color="888888" w:sz="4"/>
+              <w:bottom w:val="single" w:color="888888" w:sz="4"/>
+              <w:right w:val="single" w:color="888888" w:sz="4"/>
+            </w:tcBorders>
+            <w:shd w:fill="D9E2F3" w:color="auto" w:val="clear"/>
+            <w:tcMar>
+              <w:top w:type="dxa" w:w="60"/>
+              <w:left w:type="dxa" w:w="100"/>
+              <w:bottom w:type="dxa" w:w="60"/>
+              <w:right w:type="dxa" w:w="100"/>
+            </w:tcMar>
+          </w:tcPr>
+          <w:p>
+            <w:pPr>
+              <w:jc w:val="center"/>
+            </w:pPr>
+            <w:r>
+              <w:rPr>
+                <w:rFonts w:ascii="Times New Roman" w:cs="Times New Roman" w:eastAsia="Times New Roman" w:hAnsi="Times New Roman"/>
+                <w:b/>
+                <w:bCs/>
+                <w:sz w:val="21"/>
+                <w:szCs w:val="21"/>
+              </w:rPr>
+              <w:t xml:space="preserve">Keterangan</w:t>
+            </w:r>
+          </w:p>
+        </w:tc>
+        <w:tc>
+          <w:tcPr>
+            <w:tcW w:type="dxa" w:w="1400"/>
+            <w:tcBorders>
+              <w:top w:val="single" w:color="888888" w:sz="4"/>
+              <w:left w:val="single" w:color="888888" w:sz="4"/>
+              <w:bottom w:val="single" w:color="888888" w:sz="4"/>
+              <w:right w:val="single" w:color="888888" w:sz="4"/>
+            </w:tcBorders>
+            <w:shd w:fill="D9E2F3" w:color="auto" w:val="clear"/>
+            <w:tcMar>
+              <w:top w:type="dxa" w:w="60"/>
+              <w:left w:type="dxa" w:w="100"/>
+              <w:bottom w:type="dxa" w:w="60"/>
+              <w:right w:type="dxa" w:w="100"/>
+            </w:tcMar>
+          </w:tcPr>
+          <w:p>
+            <w:pPr>
+              <w:jc w:val="center"/>
+            </w:pPr>
+            <w:r>
+              <w:rPr>
+                <w:rFonts w:ascii="Times New Roman" w:cs="Times New Roman" w:eastAsia="Times New Roman" w:hAnsi="Times New Roman"/>
+                <w:b/>
+                <w:bCs/>
+                <w:sz w:val="21"/>
+                <w:szCs w:val="21"/>
+              </w:rPr>
+              <w:t xml:space="preserve">Jumlah</w:t>
+            </w:r>
+          </w:p>
+        </w:tc>
+        <w:tc>
+          <w:tcPr>
+            <w:tcW w:type="dxa" w:w="3760"/>
+            <w:tcBorders>
+              <w:top w:val="single" w:color="888888" w:sz="4"/>
+              <w:left w:val="single" w:color="888888" w:sz="4"/>
+              <w:bottom w:val="single" w:color="888888" w:sz="4"/>
+              <w:right w:val="single" w:color="888888" w:sz="4"/>
+            </w:tcBorders>
+            <w:shd w:fill="D9E2F3" w:color="auto" w:val="clear"/>
+            <w:tcMar>
+              <w:top w:type="dxa" w:w="60"/>
+              <w:left w:type="dxa" w:w="100"/>
+              <w:bottom w:type="dxa" w:w="60"/>
+              <w:right w:type="dxa" w:w="100"/>
+            </w:tcMar>
+          </w:tcPr>
+          <w:p>
+            <w:pPr>
+              <w:jc w:val="center"/>
+            </w:pPr>
+            <w:r>
+              <w:rPr>
+                <w:rFonts w:ascii="Times New Roman" w:cs="Times New Roman" w:eastAsia="Times New Roman" w:hAnsi="Times New Roman"/>
+                <w:b/>
+                <w:bCs/>
+                <w:sz w:val="21"/>
+                <w:szCs w:val="21"/>
+              </w:rPr>
+              <w:t xml:space="preserve">Cara perhitungan</w:t>
+            </w:r>
+          </w:p>
+        </w:tc>
+      </w:tr>
+      <w:tr>
+        <w:trPr>
+          <w:tblHeader w:val="false"/>
+        </w:trPr>
+        <w:tc>
+          <w:tcPr>
+            <w:tcW w:type="dxa" w:w="4200"/>
+            <w:tcBorders>
+              <w:top w:val="single" w:color="888888" w:sz="4"/>
+              <w:left w:val="single" w:color="888888" w:sz="4"/>
+              <w:bottom w:val="single" w:color="888888" w:sz="4"/>
+              <w:right w:val="single" w:color="888888" w:sz="4"/>
+            </w:tcBorders>
+            <w:tcMar>
+              <w:top w:type="dxa" w:w="60"/>
+              <w:left w:type="dxa" w:w="100"/>
+              <w:bottom w:type="dxa" w:w="60"/>
+              <w:right w:type="dxa" w:w="100"/>
+            </w:tcMar>
+          </w:tcPr>
+          <w:p>
+            <w:pPr>
+              <w:jc w:val="left"/>
+            </w:pPr>
+            <w:r>
+              <w:rPr>
+                <w:rFonts w:ascii="Times New Roman" w:cs="Times New Roman" w:eastAsia="Times New Roman" w:hAnsi="Times New Roman"/>
+                <w:b w:val="false"/>
+                <w:bCs w:val="false"/>
+                <w:sz w:val="21"/>
+                <w:szCs w:val="21"/>
+              </w:rPr>
+              <w:t xml:space="preserve">Pelanggan terdaftar</w:t>
+            </w:r>
+          </w:p>
+        </w:tc>
+        <w:tc>
+          <w:tcPr>
+            <w:tcW w:type="dxa" w:w="1400"/>
+            <w:tcBorders>
+              <w:top w:val="single" w:color="888888" w:sz="4"/>
+              <w:left w:val="single" w:color="888888" w:sz="4"/>
+              <w:bottom w:val="single" w:color="888888" w:sz="4"/>
+              <w:right w:val="single" w:color="888888" w:sz="4"/>
+            </w:tcBorders>
+            <w:tcMar>
+              <w:top w:type="dxa" w:w="60"/>
+              <w:left w:type="dxa" w:w="100"/>
+              <w:bottom w:type="dxa" w:w="60"/>
+              <w:right w:type="dxa" w:w="100"/>
+            </w:tcMar>
+          </w:tcPr>
+          <w:p>
+            <w:pPr>
+              <w:jc w:val="left"/>
+            </w:pPr>
+            <w:r>
+              <w:rPr>
+                <w:rFonts w:ascii="Times New Roman" w:cs="Times New Roman" w:eastAsia="Times New Roman" w:hAnsi="Times New Roman"/>
+                <w:b w:val="false"/>
+                <w:bCs w:val="false"/>
+                <w:sz w:val="21"/>
+                <w:szCs w:val="21"/>
+              </w:rPr>
+              <w:t xml:space="preserve">200</w:t>
+            </w:r>
+          </w:p>
+        </w:tc>
+        <w:tc>
+          <w:tcPr>
+            <w:tcW w:type="dxa" w:w="3760"/>
+            <w:tcBorders>
+              <w:top w:val="single" w:color="888888" w:sz="4"/>
+              <w:left w:val="single" w:color="888888" w:sz="4"/>
+              <w:bottom w:val="single" w:color="888888" w:sz="4"/>
+              <w:right w:val="single" w:color="888888" w:sz="4"/>
+            </w:tcBorders>
+            <w:tcMar>
+              <w:top w:type="dxa" w:w="60"/>
+              <w:left w:type="dxa" w:w="100"/>
+              <w:bottom w:type="dxa" w:w="60"/>
+              <w:right w:type="dxa" w:w="100"/>
+            </w:tcMar>
+          </w:tcPr>
+          <w:p>
+            <w:pPr>
+              <w:jc w:val="left"/>
+            </w:pPr>
+            <w:r>
+              <w:rPr>
+                <w:rFonts w:ascii="Times New Roman" w:cs="Times New Roman" w:eastAsia="Times New Roman" w:hAnsi="Times New Roman"/>
+                <w:b w:val="false"/>
+                <w:bCs w:val="false"/>
+                <w:sz w:val="21"/>
+                <w:szCs w:val="21"/>
+              </w:rPr>
+              <w:t xml:space="preserve">Jumlah baris tabel Customers</w:t>
+            </w:r>
+          </w:p>
+        </w:tc>
+      </w:tr>
+      <w:tr>
+        <w:trPr>
+          <w:tblHeader w:val="false"/>
+        </w:trPr>
+        <w:tc>
+          <w:tcPr>
+            <w:tcW w:type="dxa" w:w="4200"/>
+            <w:tcBorders>
+              <w:top w:val="single" w:color="888888" w:sz="4"/>
+              <w:left w:val="single" w:color="888888" w:sz="4"/>
+              <w:bottom w:val="single" w:color="888888" w:sz="4"/>
+              <w:right w:val="single" w:color="888888" w:sz="4"/>
+            </w:tcBorders>
+            <w:tcMar>
+              <w:top w:type="dxa" w:w="60"/>
+              <w:left w:type="dxa" w:w="100"/>
+              <w:bottom w:type="dxa" w:w="60"/>
+              <w:right w:type="dxa" w:w="100"/>
+            </w:tcMar>
+          </w:tcPr>
+          <w:p>
+            <w:pPr>
+              <w:jc w:val="left"/>
+            </w:pPr>
+            <w:r>
+              <w:rPr>
+                <w:rFonts w:ascii="Times New Roman" w:cs="Times New Roman" w:eastAsia="Times New Roman" w:hAnsi="Times New Roman"/>
+                <w:b w:val="false"/>
+                <w:bCs w:val="false"/>
+                <w:sz w:val="21"/>
+                <w:szCs w:val="21"/>
+              </w:rPr>
+              <w:t xml:space="preserve">Pelanggan yang bertransaksi</w:t>
+            </w:r>
+          </w:p>
+        </w:tc>
+        <w:tc>
+          <w:tcPr>
+            <w:tcW w:type="dxa" w:w="1400"/>
+            <w:tcBorders>
+              <w:top w:val="single" w:color="888888" w:sz="4"/>
+              <w:left w:val="single" w:color="888888" w:sz="4"/>
+              <w:bottom w:val="single" w:color="888888" w:sz="4"/>
+              <w:right w:val="single" w:color="888888" w:sz="4"/>
+            </w:tcBorders>
+            <w:tcMar>
+              <w:top w:type="dxa" w:w="60"/>
+              <w:left w:type="dxa" w:w="100"/>
+              <w:bottom w:type="dxa" w:w="60"/>
+              <w:right w:type="dxa" w:w="100"/>
+            </w:tcMar>
+          </w:tcPr>
+          <w:p>
+            <w:pPr>
+              <w:jc w:val="left"/>
+            </w:pPr>
+            <w:r>
+              <w:rPr>
+                <w:rFonts w:ascii="Times New Roman" w:cs="Times New Roman" w:eastAsia="Times New Roman" w:hAnsi="Times New Roman"/>
+                <w:b w:val="false"/>
+                <w:bCs w:val="false"/>
+                <w:sz w:val="21"/>
+                <w:szCs w:val="21"/>
+              </w:rPr>
+              <w:t xml:space="preserve">199</w:t>
+            </w:r>
+          </w:p>
+        </w:tc>
+        <w:tc>
+          <w:tcPr>
+            <w:tcW w:type="dxa" w:w="3760"/>
+            <w:tcBorders>
+              <w:top w:val="single" w:color="888888" w:sz="4"/>
+              <w:left w:val="single" w:color="888888" w:sz="4"/>
+              <w:bottom w:val="single" w:color="888888" w:sz="4"/>
+              <w:right w:val="single" w:color="888888" w:sz="4"/>
+            </w:tcBorders>
+            <w:tcMar>
+              <w:top w:type="dxa" w:w="60"/>
+              <w:left w:type="dxa" w:w="100"/>
+              <w:bottom w:type="dxa" w:w="60"/>
+              <w:right w:type="dxa" w:w="100"/>
+            </w:tcMar>
+          </w:tcPr>
+          <w:p>
+            <w:pPr>
+              <w:jc w:val="left"/>
+            </w:pPr>
+            <w:r>
+              <w:rPr>
+                <w:rFonts w:ascii="Times New Roman" w:cs="Times New Roman" w:eastAsia="Times New Roman" w:hAnsi="Times New Roman"/>
+                <w:b w:val="false"/>
+                <w:bCs w:val="false"/>
+                <w:sz w:val="21"/>
+                <w:szCs w:val="21"/>
+              </w:rPr>
+              <w:t xml:space="preserve">DISTINCTCOUNT(Transactions[CustomerID])</w:t>
+            </w:r>
+          </w:p>
+        </w:tc>
+      </w:tr>
+      <w:tr>
+        <w:trPr>
+          <w:tblHeader w:val="false"/>
+        </w:trPr>
+        <w:tc>
+          <w:tcPr>
+            <w:tcW w:type="dxa" w:w="4200"/>
+            <w:tcBorders>
+              <w:top w:val="single" w:color="888888" w:sz="4"/>
+              <w:left w:val="single" w:color="888888" w:sz="4"/>
+              <w:bottom w:val="single" w:color="888888" w:sz="4"/>
+              <w:right w:val="single" w:color="888888" w:sz="4"/>
+            </w:tcBorders>
+            <w:tcMar>
+              <w:top w:type="dxa" w:w="60"/>
+              <w:left w:type="dxa" w:w="100"/>
+              <w:bottom w:type="dxa" w:w="60"/>
+              <w:right w:type="dxa" w:w="100"/>
+            </w:tcMar>
+          </w:tcPr>
+          <w:p>
+            <w:pPr>
+              <w:jc w:val="left"/>
+            </w:pPr>
+            <w:r>
+              <w:rPr>
+                <w:rFonts w:ascii="Times New Roman" w:cs="Times New Roman" w:eastAsia="Times New Roman" w:hAnsi="Times New Roman"/>
+                <w:b w:val="false"/>
+                <w:bCs w:val="false"/>
+                <w:sz w:val="21"/>
+                <w:szCs w:val="21"/>
+              </w:rPr>
+              <w:t xml:space="preserve">Terdaftar tetapi belum bertransaksi</w:t>
+            </w:r>
+          </w:p>
+        </w:tc>
+        <w:tc>
+          <w:tcPr>
+            <w:tcW w:type="dxa" w:w="1400"/>
+            <w:tcBorders>
+              <w:top w:val="single" w:color="888888" w:sz="4"/>
+              <w:left w:val="single" w:color="888888" w:sz="4"/>
+              <w:bottom w:val="single" w:color="888888" w:sz="4"/>
+              <w:right w:val="single" w:color="888888" w:sz="4"/>
+            </w:tcBorders>
+            <w:tcMar>
+              <w:top w:type="dxa" w:w="60"/>
+              <w:left w:type="dxa" w:w="100"/>
+              <w:bottom w:type="dxa" w:w="60"/>
+              <w:right w:type="dxa" w:w="100"/>
+            </w:tcMar>
+          </w:tcPr>
+          <w:p>
+            <w:pPr>
+              <w:jc w:val="left"/>
+            </w:pPr>
+            <w:r>
+              <w:rPr>
+                <w:rFonts w:ascii="Times New Roman" w:cs="Times New Roman" w:eastAsia="Times New Roman" w:hAnsi="Times New Roman"/>
+                <w:b w:val="false"/>
+                <w:bCs w:val="false"/>
+                <w:sz w:val="21"/>
+                <w:szCs w:val="21"/>
+              </w:rPr>
+              <w:t xml:space="preserve">1</w:t>
+            </w:r>
+          </w:p>
+        </w:tc>
+        <w:tc>
+          <w:tcPr>
+            <w:tcW w:type="dxa" w:w="3760"/>
+            <w:tcBorders>
+              <w:top w:val="single" w:color="888888" w:sz="4"/>
+              <w:left w:val="single" w:color="888888" w:sz="4"/>
+              <w:bottom w:val="single" w:color="888888" w:sz="4"/>
+              <w:right w:val="single" w:color="888888" w:sz="4"/>
+            </w:tcBorders>
+            <w:tcMar>
+              <w:top w:type="dxa" w:w="60"/>
+              <w:left w:type="dxa" w:w="100"/>
+              <w:bottom w:type="dxa" w:w="60"/>
+              <w:right w:type="dxa" w:w="100"/>
+            </w:tcMar>
+          </w:tcPr>
+          <w:p>
+            <w:pPr>
+              <w:jc w:val="left"/>
+            </w:pPr>
+            <w:r>
+              <w:rPr>
+                <w:rFonts w:ascii="Times New Roman" w:cs="Times New Roman" w:eastAsia="Times New Roman" w:hAnsi="Times New Roman"/>
+                <w:b w:val="false"/>
+                <w:bCs w:val="false"/>
+                <w:sz w:val="21"/>
+                <w:szCs w:val="21"/>
+              </w:rPr>
+              <w:t xml:space="preserve">200 dikurangi 199 (C0180 Amy Carpenter, Asia)</w:t>
+            </w:r>
+          </w:p>
+        </w:tc>
+      </w:tr>
+    </w:tbl>
+    <w:p>
+      <w:pPr>
+        <w:spacing w:after="100"/>
+      </w:pPr>
+    </w:p>
+    <w:p>
+      <w:pPr>
+        <w:spacing w:after="120" w:line="300"/>
+        <w:jc w:val="both"/>
+      </w:pPr>
+      <w:r>
+        <w:rPr>
+          <w:rFonts w:ascii="Times New Roman" w:cs="Times New Roman" w:eastAsia="Times New Roman" w:hAnsi="Times New Roman"/>
+        </w:rPr>
+        <w:t xml:space="preserve">Tabel Customers memuat 200 pelanggan terdaftar, sedangkan tabel Transactions hanya memuat 199 CustomerID yang berbeda. Satu pelanggan yang terdaftar namun belum pernah bertransaksi adalah C0180 atas nama Amy Carpenter dari wilayah Asia, yang mendaftar pada 25 Oktober 2023. Dengan demikian tingkat aktivasi pelanggan mencapai 99,5 persen.</w:t>
+      </w:r>
+    </w:p>
+    <w:p>
+      <w:pPr>
+        <w:spacing w:after="120" w:line="300"/>
+        <w:jc w:val="both"/>
+      </w:pPr>
+      <w:r>
+        <w:rPr>
+          <w:rFonts w:ascii="Times New Roman" w:cs="Times New Roman" w:eastAsia="Times New Roman" w:hAnsi="Times New Roman"/>
+        </w:rPr>
+        <w:t xml:space="preserve">Pelanggan aktif per wilayah adalah South America 59, Europe 50, North America 46, dan Asia 44. Pada dashboard, kartu Total Unique Customers menampilkan 199 karena dihitung dari tabel Transactions; angka 200 hanya dapat diperoleh dari tabel Customers. Perbedaan ini bukan kesalahan data, melainkan menunjukkan adanya satu pelanggan yang dapat menjadi sasaran kampanye aktivasi.</w:t>
       </w:r>
     </w:p>
     <w:p>

</xml_diff>

<commit_message>
Add raw Excel data section to report
Co-Authored-By: Claude Sonnet 5.5 <noreply@anthropic.com>
Claude-Session: https://claude.ai/code/session_017RLvirTSx84UWnroqbbqTM
</commit_message>
<xml_diff>
--- a/output/Laporan_UTS_BDASC_EverMart.docx
+++ b/output/Laporan_UTS_BDASC_EverMart.docx
@@ -2972,19 +2972,6 @@
     </w:p>
     <w:p>
       <w:pPr>
-        <w:pStyle w:val="Heading1"/>
-        <w:spacing w:after="200" w:before="240"/>
-        <w:jc w:val="center"/>
-      </w:pPr>
-      <w:r>
-        <w:rPr>
-          <w:rFonts w:ascii="Times New Roman" w:cs="Times New Roman" w:eastAsia="Times New Roman" w:hAnsi="Times New Roman"/>
-        </w:rPr>
-        <w:t xml:space="preserve">BAB III  METODOLOGI DAN PROSES VISUALISASI</w:t>
-      </w:r>
-    </w:p>
-    <w:p>
-      <w:pPr>
         <w:pStyle w:val="Heading2"/>
         <w:spacing w:after="100" w:before="200"/>
       </w:pPr>
@@ -2992,104 +2979,7 @@
         <w:rPr>
           <w:rFonts w:ascii="Times New Roman" w:cs="Times New Roman" w:eastAsia="Times New Roman" w:hAnsi="Times New Roman"/>
         </w:rPr>
-        <w:t xml:space="preserve">3.1 Tahapan Analisis</w:t>
-      </w:r>
-    </w:p>
-    <w:p>
-      <w:pPr>
-        <w:pStyle w:val="ListParagraph"/>
-        <w:numPr>
-          <w:ilvl w:val="0"/>
-          <w:numId w:val="4"/>
-        </w:numPr>
-        <w:spacing w:after="60" w:line="288"/>
-        <w:jc w:val="both"/>
-      </w:pPr>
-      <w:r>
-        <w:rPr>
-          <w:rFonts w:ascii="Times New Roman" w:cs="Times New Roman" w:eastAsia="Times New Roman" w:hAnsi="Times New Roman"/>
-        </w:rPr>
-        <w:t xml:space="preserve">Pemuatan data dari berkas Excel ke Power BI.</w:t>
-      </w:r>
-    </w:p>
-    <w:p>
-      <w:pPr>
-        <w:pStyle w:val="ListParagraph"/>
-        <w:numPr>
-          <w:ilvl w:val="0"/>
-          <w:numId w:val="4"/>
-        </w:numPr>
-        <w:spacing w:after="60" w:line="288"/>
-        <w:jc w:val="both"/>
-      </w:pPr>
-      <w:r>
-        <w:rPr>
-          <w:rFonts w:ascii="Times New Roman" w:cs="Times New Roman" w:eastAsia="Times New Roman" w:hAnsi="Times New Roman"/>
-        </w:rPr>
-        <w:t xml:space="preserve">Transformasi dan pengaturan tipe data pada Power Query.</w:t>
-      </w:r>
-    </w:p>
-    <w:p>
-      <w:pPr>
-        <w:pStyle w:val="ListParagraph"/>
-        <w:numPr>
-          <w:ilvl w:val="0"/>
-          <w:numId w:val="4"/>
-        </w:numPr>
-        <w:spacing w:after="60" w:line="288"/>
-        <w:jc w:val="both"/>
-      </w:pPr>
-      <w:r>
-        <w:rPr>
-          <w:rFonts w:ascii="Times New Roman" w:cs="Times New Roman" w:eastAsia="Times New Roman" w:hAnsi="Times New Roman"/>
-        </w:rPr>
-        <w:t xml:space="preserve">Pembentukan model data dan relasi antar tabel.</w:t>
-      </w:r>
-    </w:p>
-    <w:p>
-      <w:pPr>
-        <w:pStyle w:val="ListParagraph"/>
-        <w:numPr>
-          <w:ilvl w:val="0"/>
-          <w:numId w:val="4"/>
-        </w:numPr>
-        <w:spacing w:after="60" w:line="288"/>
-        <w:jc w:val="both"/>
-      </w:pPr>
-      <w:r>
-        <w:rPr>
-          <w:rFonts w:ascii="Times New Roman" w:cs="Times New Roman" w:eastAsia="Times New Roman" w:hAnsi="Times New Roman"/>
-        </w:rPr>
-        <w:t xml:space="preserve">Pembuatan measure dengan DAX.</w:t>
-      </w:r>
-    </w:p>
-    <w:p>
-      <w:pPr>
-        <w:pStyle w:val="ListParagraph"/>
-        <w:numPr>
-          <w:ilvl w:val="0"/>
-          <w:numId w:val="4"/>
-        </w:numPr>
-        <w:spacing w:after="60" w:line="288"/>
-        <w:jc w:val="both"/>
-      </w:pPr>
-      <w:r>
-        <w:rPr>
-          <w:rFonts w:ascii="Times New Roman" w:cs="Times New Roman" w:eastAsia="Times New Roman" w:hAnsi="Times New Roman"/>
-        </w:rPr>
-        <w:t xml:space="preserve">Perancangan dashboard interaktif dan penarikan interpretasi.</w:t>
-      </w:r>
-    </w:p>
-    <w:p>
-      <w:pPr>
-        <w:pStyle w:val="Heading2"/>
-        <w:spacing w:after="100" w:before="200"/>
-      </w:pPr>
-      <w:r>
-        <w:rPr>
-          <w:rFonts w:ascii="Times New Roman" w:cs="Times New Roman" w:eastAsia="Times New Roman" w:hAnsi="Times New Roman"/>
-        </w:rPr>
-        <w:t xml:space="preserve">3.2 Data Awal dan Transformasi</w:t>
+        <w:t xml:space="preserve">2.5 Data Awal pada Berkas Excel</w:t>
       </w:r>
     </w:p>
     <w:p>
@@ -3101,7 +2991,7 @@
         <w:rPr>
           <w:rFonts w:ascii="Times New Roman" w:cs="Times New Roman" w:eastAsia="Times New Roman" w:hAnsi="Times New Roman"/>
         </w:rPr>
-        <w:t xml:space="preserve">Ketiga sheet dimuat melalui Power Query. Langkah transformasi pada tiap tabel meliputi Promoted Headers untuk menjadikan baris pertama sebagai nama kolom, dan Changed Type untuk menetapkan tipe data (pengenal sebagai teks, tanggal sebagai date atau datetime, Quantity sebagai bilangan bulat, serta Price dan TotalValue sebagai desimal).</w:t>
+        <w:t xml:space="preserve">Data awal merupakan data mentah sebagaimana tersimpan pada berkas EverMart_Online_Transactions.xlsx sebelum dimuat ke Power BI. Berkas tersebut berisi tiga lembar kerja (sheet), yaitu Customers, Products, dan Transactions, yang masing-masing ditampilkan pada Gambar 2.1 sampai 2.3.</w:t>
       </w:r>
     </w:p>
     <w:p>
@@ -3112,7 +3002,7 @@
       <w:r>
         <w:drawing>
           <wp:inline distT="0" distB="0" distL="0" distR="0">
-            <wp:extent cx="5334000" cy="2809875"/>
+            <wp:extent cx="3048000" cy="2847975"/>
             <wp:effectExtent t="0" r="0" b="0" l="0"/>
             <wp:docPr id="1" name="" descr="" title=""/>
             <wp:cNvGraphicFramePr>
@@ -3137,7 +3027,7 @@
                   <pic:spPr bwMode="auto">
                     <a:xfrm>
                       <a:off x="0" y="0"/>
-                      <a:ext cx="5334000" cy="2809875"/>
+                      <a:ext cx="3048000" cy="2847975"/>
                     </a:xfrm>
                     <a:prstGeom prst="rect">
                       <a:avLst/>
@@ -3163,7 +3053,7 @@
           <w:sz w:val="21"/>
           <w:szCs w:val="21"/>
         </w:rPr>
-        <w:t xml:space="preserve">Gambar 3.1 Data awal tabel Transactions pada Power Query</w:t>
+        <w:t xml:space="preserve">Gambar 2.1 Data awal sheet Customers</w:t>
       </w:r>
     </w:p>
     <w:p>
@@ -3175,7 +3065,7 @@
         <w:rPr>
           <w:rFonts w:ascii="Times New Roman" w:cs="Times New Roman" w:eastAsia="Times New Roman" w:hAnsi="Times New Roman"/>
         </w:rPr>
-        <w:t xml:space="preserve">Gambar 3.1 memperlihatkan tabel Transactions pada Power Query Editor beserta profil kualitas tiap kolom. Seluruh kolom bernilai Valid 100%, dengan Error dan Empty 0%. TransactionID memiliki 1.000 nilai unik, CustomerID 199 nilai berbeda, dan ProductID 100 nilai berbeda. Formula pada baris rumus (Table.TransformColumnTypes) merupakan langkah Changed Type yang menetapkan tipe data tiap kolom.</w:t>
+        <w:t xml:space="preserve">Gambar 2.1 menampilkan sheet Customers yang berisi 200 baris dengan empat kolom: CustomerID (C0001 dan seterusnya), CustomerName, Region (Asia, Europe, North America, South America), dan SignupDate yang mencatat tanggal pendaftaran pelanggan.</w:t>
       </w:r>
     </w:p>
     <w:p>
@@ -3186,7 +3076,7 @@
       <w:r>
         <w:drawing>
           <wp:inline distT="0" distB="0" distL="0" distR="0">
-            <wp:extent cx="3810000" cy="3248025"/>
+            <wp:extent cx="3048000" cy="2838450"/>
             <wp:effectExtent t="0" r="0" b="0" l="0"/>
             <wp:docPr id="1" name="" descr="" title=""/>
             <wp:cNvGraphicFramePr>
@@ -3211,7 +3101,7 @@
                   <pic:spPr bwMode="auto">
                     <a:xfrm>
                       <a:off x="0" y="0"/>
-                      <a:ext cx="3810000" cy="3248025"/>
+                      <a:ext cx="3048000" cy="2838450"/>
                     </a:xfrm>
                     <a:prstGeom prst="rect">
                       <a:avLst/>
@@ -3237,7 +3127,7 @@
           <w:sz w:val="21"/>
           <w:szCs w:val="21"/>
         </w:rPr>
-        <w:t xml:space="preserve">Gambar 3.2 Profil kualitas kolom tabel Customers</w:t>
+        <w:t xml:space="preserve">Gambar 2.2 Data awal sheet Products</w:t>
       </w:r>
     </w:p>
     <w:p>
@@ -3249,578 +3139,7 @@
         <w:rPr>
           <w:rFonts w:ascii="Times New Roman" w:cs="Times New Roman" w:eastAsia="Times New Roman" w:hAnsi="Times New Roman"/>
         </w:rPr>
-        <w:t xml:space="preserve">Gambar 3.2 menunjukkan tabel Customers yang berisi 200 pelanggan dengan CustomerID dan CustomerName unik, empat nilai Region, serta SignupDate bertipe tanggal. Tidak ditemukan nilai kosong maupun galat sehingga data siap dianalisis tanpa pembersihan tambahan.</w:t>
-      </w:r>
-    </w:p>
-    <w:p>
-      <w:pPr>
-        <w:pStyle w:val="Heading2"/>
-        <w:spacing w:after="100" w:before="200"/>
-      </w:pPr>
-      <w:r>
-        <w:rPr>
-          <w:rFonts w:ascii="Times New Roman" w:cs="Times New Roman" w:eastAsia="Times New Roman" w:hAnsi="Times New Roman"/>
-        </w:rPr>
-        <w:t xml:space="preserve">3.3 Model Data</w:t>
-      </w:r>
-    </w:p>
-    <w:p>
-      <w:pPr>
-        <w:spacing w:after="120" w:line="300"/>
-        <w:jc w:val="both"/>
-      </w:pPr>
-      <w:r>
-        <w:rPr>
-          <w:rFonts w:ascii="Times New Roman" w:cs="Times New Roman" w:eastAsia="Times New Roman" w:hAnsi="Times New Roman"/>
-        </w:rPr>
-        <w:t xml:space="preserve">Tabel Transactions berelasi banyak-ke-satu dengan Customers melalui CustomerID dan dengan Products melalui ProductID. Relasi ini memungkinkan filter pada dimensi (misalnya Region atau Category) memengaruhi seluruh perhitungan pada tabel fakta.</w:t>
-      </w:r>
-    </w:p>
-    <w:p>
-      <w:pPr>
-        <w:pStyle w:val="Heading2"/>
-        <w:spacing w:after="100" w:before="200"/>
-      </w:pPr>
-      <w:r>
-        <w:rPr>
-          <w:rFonts w:ascii="Times New Roman" w:cs="Times New Roman" w:eastAsia="Times New Roman" w:hAnsi="Times New Roman"/>
-        </w:rPr>
-        <w:t xml:space="preserve">3.4 Penggunaan DAX</w:t>
-      </w:r>
-    </w:p>
-    <w:p>
-      <w:pPr>
-        <w:spacing w:after="80" w:before="100"/>
-        <w:jc w:val="center"/>
-      </w:pPr>
-      <w:r>
-        <w:rPr>
-          <w:rFonts w:ascii="Times New Roman" w:cs="Times New Roman" w:eastAsia="Times New Roman" w:hAnsi="Times New Roman"/>
-          <w:b/>
-          <w:bCs/>
-          <w:sz w:val="22"/>
-          <w:szCs w:val="22"/>
-        </w:rPr>
-        <w:t xml:space="preserve">Tabel 3.1 Measure DAX yang digunakan</w:t>
-      </w:r>
-    </w:p>
-    <w:tbl>
-      <w:tblPr>
-        <w:tblW w:type="dxa" w:w="9360"/>
-        <w:tblBorders>
-          <w:top w:val="single" w:color="auto" w:sz="4"/>
-          <w:left w:val="single" w:color="auto" w:sz="4"/>
-          <w:bottom w:val="single" w:color="auto" w:sz="4"/>
-          <w:right w:val="single" w:color="auto" w:sz="4"/>
-          <w:insideH w:val="single" w:color="auto" w:sz="4"/>
-          <w:insideV w:val="single" w:color="auto" w:sz="4"/>
-        </w:tblBorders>
-      </w:tblPr>
-      <w:tblGrid>
-        <w:gridCol w:w="2700"/>
-        <w:gridCol w:w="6660"/>
-      </w:tblGrid>
-      <w:tr>
-        <w:trPr>
-          <w:tblHeader/>
-        </w:trPr>
-        <w:tc>
-          <w:tcPr>
-            <w:tcW w:type="dxa" w:w="2700"/>
-            <w:tcBorders>
-              <w:top w:val="single" w:color="888888" w:sz="4"/>
-              <w:left w:val="single" w:color="888888" w:sz="4"/>
-              <w:bottom w:val="single" w:color="888888" w:sz="4"/>
-              <w:right w:val="single" w:color="888888" w:sz="4"/>
-            </w:tcBorders>
-            <w:shd w:fill="D9E2F3" w:color="auto" w:val="clear"/>
-            <w:tcMar>
-              <w:top w:type="dxa" w:w="60"/>
-              <w:left w:type="dxa" w:w="100"/>
-              <w:bottom w:type="dxa" w:w="60"/>
-              <w:right w:type="dxa" w:w="100"/>
-            </w:tcMar>
-          </w:tcPr>
-          <w:p>
-            <w:pPr>
-              <w:jc w:val="center"/>
-            </w:pPr>
-            <w:r>
-              <w:rPr>
-                <w:rFonts w:ascii="Times New Roman" w:cs="Times New Roman" w:eastAsia="Times New Roman" w:hAnsi="Times New Roman"/>
-                <w:b/>
-                <w:bCs/>
-                <w:sz w:val="21"/>
-                <w:szCs w:val="21"/>
-              </w:rPr>
-              <w:t xml:space="preserve">Measure</w:t>
-            </w:r>
-          </w:p>
-        </w:tc>
-        <w:tc>
-          <w:tcPr>
-            <w:tcW w:type="dxa" w:w="6660"/>
-            <w:tcBorders>
-              <w:top w:val="single" w:color="888888" w:sz="4"/>
-              <w:left w:val="single" w:color="888888" w:sz="4"/>
-              <w:bottom w:val="single" w:color="888888" w:sz="4"/>
-              <w:right w:val="single" w:color="888888" w:sz="4"/>
-            </w:tcBorders>
-            <w:shd w:fill="D9E2F3" w:color="auto" w:val="clear"/>
-            <w:tcMar>
-              <w:top w:type="dxa" w:w="60"/>
-              <w:left w:type="dxa" w:w="100"/>
-              <w:bottom w:type="dxa" w:w="60"/>
-              <w:right w:type="dxa" w:w="100"/>
-            </w:tcMar>
-          </w:tcPr>
-          <w:p>
-            <w:pPr>
-              <w:jc w:val="center"/>
-            </w:pPr>
-            <w:r>
-              <w:rPr>
-                <w:rFonts w:ascii="Times New Roman" w:cs="Times New Roman" w:eastAsia="Times New Roman" w:hAnsi="Times New Roman"/>
-                <w:b/>
-                <w:bCs/>
-                <w:sz w:val="21"/>
-                <w:szCs w:val="21"/>
-              </w:rPr>
-              <w:t xml:space="preserve">Rumus DAX</w:t>
-            </w:r>
-          </w:p>
-        </w:tc>
-      </w:tr>
-      <w:tr>
-        <w:trPr>
-          <w:tblHeader w:val="false"/>
-        </w:trPr>
-        <w:tc>
-          <w:tcPr>
-            <w:tcW w:type="dxa" w:w="2700"/>
-            <w:tcBorders>
-              <w:top w:val="single" w:color="888888" w:sz="4"/>
-              <w:left w:val="single" w:color="888888" w:sz="4"/>
-              <w:bottom w:val="single" w:color="888888" w:sz="4"/>
-              <w:right w:val="single" w:color="888888" w:sz="4"/>
-            </w:tcBorders>
-            <w:tcMar>
-              <w:top w:type="dxa" w:w="60"/>
-              <w:left w:type="dxa" w:w="100"/>
-              <w:bottom w:type="dxa" w:w="60"/>
-              <w:right w:type="dxa" w:w="100"/>
-            </w:tcMar>
-          </w:tcPr>
-          <w:p>
-            <w:pPr>
-              <w:jc w:val="left"/>
-            </w:pPr>
-            <w:r>
-              <w:rPr>
-                <w:rFonts w:ascii="Times New Roman" w:cs="Times New Roman" w:eastAsia="Times New Roman" w:hAnsi="Times New Roman"/>
-                <w:b w:val="false"/>
-                <w:bCs w:val="false"/>
-                <w:sz w:val="21"/>
-                <w:szCs w:val="21"/>
-              </w:rPr>
-              <w:t xml:space="preserve">Total Revenue</w:t>
-            </w:r>
-          </w:p>
-        </w:tc>
-        <w:tc>
-          <w:tcPr>
-            <w:tcW w:type="dxa" w:w="6660"/>
-            <w:tcBorders>
-              <w:top w:val="single" w:color="888888" w:sz="4"/>
-              <w:left w:val="single" w:color="888888" w:sz="4"/>
-              <w:bottom w:val="single" w:color="888888" w:sz="4"/>
-              <w:right w:val="single" w:color="888888" w:sz="4"/>
-            </w:tcBorders>
-            <w:tcMar>
-              <w:top w:type="dxa" w:w="60"/>
-              <w:left w:type="dxa" w:w="100"/>
-              <w:bottom w:type="dxa" w:w="60"/>
-              <w:right w:type="dxa" w:w="100"/>
-            </w:tcMar>
-          </w:tcPr>
-          <w:p>
-            <w:pPr>
-              <w:jc w:val="left"/>
-            </w:pPr>
-            <w:r>
-              <w:rPr>
-                <w:rFonts w:ascii="Times New Roman" w:cs="Times New Roman" w:eastAsia="Times New Roman" w:hAnsi="Times New Roman"/>
-                <w:b w:val="false"/>
-                <w:bCs w:val="false"/>
-                <w:sz w:val="21"/>
-                <w:szCs w:val="21"/>
-              </w:rPr>
-              <w:t xml:space="preserve">SUM(Transactions[TotalValue])</w:t>
-            </w:r>
-          </w:p>
-        </w:tc>
-      </w:tr>
-      <w:tr>
-        <w:trPr>
-          <w:tblHeader w:val="false"/>
-        </w:trPr>
-        <w:tc>
-          <w:tcPr>
-            <w:tcW w:type="dxa" w:w="2700"/>
-            <w:tcBorders>
-              <w:top w:val="single" w:color="888888" w:sz="4"/>
-              <w:left w:val="single" w:color="888888" w:sz="4"/>
-              <w:bottom w:val="single" w:color="888888" w:sz="4"/>
-              <w:right w:val="single" w:color="888888" w:sz="4"/>
-            </w:tcBorders>
-            <w:tcMar>
-              <w:top w:type="dxa" w:w="60"/>
-              <w:left w:type="dxa" w:w="100"/>
-              <w:bottom w:type="dxa" w:w="60"/>
-              <w:right w:type="dxa" w:w="100"/>
-            </w:tcMar>
-          </w:tcPr>
-          <w:p>
-            <w:pPr>
-              <w:jc w:val="left"/>
-            </w:pPr>
-            <w:r>
-              <w:rPr>
-                <w:rFonts w:ascii="Times New Roman" w:cs="Times New Roman" w:eastAsia="Times New Roman" w:hAnsi="Times New Roman"/>
-                <w:b w:val="false"/>
-                <w:bCs w:val="false"/>
-                <w:sz w:val="21"/>
-                <w:szCs w:val="21"/>
-              </w:rPr>
-              <w:t xml:space="preserve">Total Transactions</w:t>
-            </w:r>
-          </w:p>
-        </w:tc>
-        <w:tc>
-          <w:tcPr>
-            <w:tcW w:type="dxa" w:w="6660"/>
-            <w:tcBorders>
-              <w:top w:val="single" w:color="888888" w:sz="4"/>
-              <w:left w:val="single" w:color="888888" w:sz="4"/>
-              <w:bottom w:val="single" w:color="888888" w:sz="4"/>
-              <w:right w:val="single" w:color="888888" w:sz="4"/>
-            </w:tcBorders>
-            <w:tcMar>
-              <w:top w:type="dxa" w:w="60"/>
-              <w:left w:type="dxa" w:w="100"/>
-              <w:bottom w:type="dxa" w:w="60"/>
-              <w:right w:type="dxa" w:w="100"/>
-            </w:tcMar>
-          </w:tcPr>
-          <w:p>
-            <w:pPr>
-              <w:jc w:val="left"/>
-            </w:pPr>
-            <w:r>
-              <w:rPr>
-                <w:rFonts w:ascii="Times New Roman" w:cs="Times New Roman" w:eastAsia="Times New Roman" w:hAnsi="Times New Roman"/>
-                <w:b w:val="false"/>
-                <w:bCs w:val="false"/>
-                <w:sz w:val="21"/>
-                <w:szCs w:val="21"/>
-              </w:rPr>
-              <w:t xml:space="preserve">DISTINCTCOUNT(Transactions[TransactionID])</w:t>
-            </w:r>
-          </w:p>
-        </w:tc>
-      </w:tr>
-      <w:tr>
-        <w:trPr>
-          <w:tblHeader w:val="false"/>
-        </w:trPr>
-        <w:tc>
-          <w:tcPr>
-            <w:tcW w:type="dxa" w:w="2700"/>
-            <w:tcBorders>
-              <w:top w:val="single" w:color="888888" w:sz="4"/>
-              <w:left w:val="single" w:color="888888" w:sz="4"/>
-              <w:bottom w:val="single" w:color="888888" w:sz="4"/>
-              <w:right w:val="single" w:color="888888" w:sz="4"/>
-            </w:tcBorders>
-            <w:tcMar>
-              <w:top w:type="dxa" w:w="60"/>
-              <w:left w:type="dxa" w:w="100"/>
-              <w:bottom w:type="dxa" w:w="60"/>
-              <w:right w:type="dxa" w:w="100"/>
-            </w:tcMar>
-          </w:tcPr>
-          <w:p>
-            <w:pPr>
-              <w:jc w:val="left"/>
-            </w:pPr>
-            <w:r>
-              <w:rPr>
-                <w:rFonts w:ascii="Times New Roman" w:cs="Times New Roman" w:eastAsia="Times New Roman" w:hAnsi="Times New Roman"/>
-                <w:b w:val="false"/>
-                <w:bCs w:val="false"/>
-                <w:sz w:val="21"/>
-                <w:szCs w:val="21"/>
-              </w:rPr>
-              <w:t xml:space="preserve">Total Unique Customers</w:t>
-            </w:r>
-          </w:p>
-        </w:tc>
-        <w:tc>
-          <w:tcPr>
-            <w:tcW w:type="dxa" w:w="6660"/>
-            <w:tcBorders>
-              <w:top w:val="single" w:color="888888" w:sz="4"/>
-              <w:left w:val="single" w:color="888888" w:sz="4"/>
-              <w:bottom w:val="single" w:color="888888" w:sz="4"/>
-              <w:right w:val="single" w:color="888888" w:sz="4"/>
-            </w:tcBorders>
-            <w:tcMar>
-              <w:top w:type="dxa" w:w="60"/>
-              <w:left w:type="dxa" w:w="100"/>
-              <w:bottom w:type="dxa" w:w="60"/>
-              <w:right w:type="dxa" w:w="100"/>
-            </w:tcMar>
-          </w:tcPr>
-          <w:p>
-            <w:pPr>
-              <w:jc w:val="left"/>
-            </w:pPr>
-            <w:r>
-              <w:rPr>
-                <w:rFonts w:ascii="Times New Roman" w:cs="Times New Roman" w:eastAsia="Times New Roman" w:hAnsi="Times New Roman"/>
-                <w:b w:val="false"/>
-                <w:bCs w:val="false"/>
-                <w:sz w:val="21"/>
-                <w:szCs w:val="21"/>
-              </w:rPr>
-              <w:t xml:space="preserve">DISTINCTCOUNT(Transactions[CustomerID])</w:t>
-            </w:r>
-          </w:p>
-        </w:tc>
-      </w:tr>
-      <w:tr>
-        <w:trPr>
-          <w:tblHeader w:val="false"/>
-        </w:trPr>
-        <w:tc>
-          <w:tcPr>
-            <w:tcW w:type="dxa" w:w="2700"/>
-            <w:tcBorders>
-              <w:top w:val="single" w:color="888888" w:sz="4"/>
-              <w:left w:val="single" w:color="888888" w:sz="4"/>
-              <w:bottom w:val="single" w:color="888888" w:sz="4"/>
-              <w:right w:val="single" w:color="888888" w:sz="4"/>
-            </w:tcBorders>
-            <w:tcMar>
-              <w:top w:type="dxa" w:w="60"/>
-              <w:left w:type="dxa" w:w="100"/>
-              <w:bottom w:type="dxa" w:w="60"/>
-              <w:right w:type="dxa" w:w="100"/>
-            </w:tcMar>
-          </w:tcPr>
-          <w:p>
-            <w:pPr>
-              <w:jc w:val="left"/>
-            </w:pPr>
-            <w:r>
-              <w:rPr>
-                <w:rFonts w:ascii="Times New Roman" w:cs="Times New Roman" w:eastAsia="Times New Roman" w:hAnsi="Times New Roman"/>
-                <w:b w:val="false"/>
-                <w:bCs w:val="false"/>
-                <w:sz w:val="21"/>
-                <w:szCs w:val="21"/>
-              </w:rPr>
-              <w:t xml:space="preserve">Avg Order Value</w:t>
-            </w:r>
-          </w:p>
-        </w:tc>
-        <w:tc>
-          <w:tcPr>
-            <w:tcW w:type="dxa" w:w="6660"/>
-            <w:tcBorders>
-              <w:top w:val="single" w:color="888888" w:sz="4"/>
-              <w:left w:val="single" w:color="888888" w:sz="4"/>
-              <w:bottom w:val="single" w:color="888888" w:sz="4"/>
-              <w:right w:val="single" w:color="888888" w:sz="4"/>
-            </w:tcBorders>
-            <w:tcMar>
-              <w:top w:type="dxa" w:w="60"/>
-              <w:left w:type="dxa" w:w="100"/>
-              <w:bottom w:type="dxa" w:w="60"/>
-              <w:right w:type="dxa" w:w="100"/>
-            </w:tcMar>
-          </w:tcPr>
-          <w:p>
-            <w:pPr>
-              <w:jc w:val="left"/>
-            </w:pPr>
-            <w:r>
-              <w:rPr>
-                <w:rFonts w:ascii="Times New Roman" w:cs="Times New Roman" w:eastAsia="Times New Roman" w:hAnsi="Times New Roman"/>
-                <w:b w:val="false"/>
-                <w:bCs w:val="false"/>
-                <w:sz w:val="21"/>
-                <w:szCs w:val="21"/>
-              </w:rPr>
-              <w:t xml:space="preserve">DIVIDE([Total Revenue], [Total Transactions])</w:t>
-            </w:r>
-          </w:p>
-        </w:tc>
-      </w:tr>
-      <w:tr>
-        <w:trPr>
-          <w:tblHeader w:val="false"/>
-        </w:trPr>
-        <w:tc>
-          <w:tcPr>
-            <w:tcW w:type="dxa" w:w="2700"/>
-            <w:tcBorders>
-              <w:top w:val="single" w:color="888888" w:sz="4"/>
-              <w:left w:val="single" w:color="888888" w:sz="4"/>
-              <w:bottom w:val="single" w:color="888888" w:sz="4"/>
-              <w:right w:val="single" w:color="888888" w:sz="4"/>
-            </w:tcBorders>
-            <w:tcMar>
-              <w:top w:type="dxa" w:w="60"/>
-              <w:left w:type="dxa" w:w="100"/>
-              <w:bottom w:type="dxa" w:w="60"/>
-              <w:right w:type="dxa" w:w="100"/>
-            </w:tcMar>
-          </w:tcPr>
-          <w:p>
-            <w:pPr>
-              <w:jc w:val="left"/>
-            </w:pPr>
-            <w:r>
-              <w:rPr>
-                <w:rFonts w:ascii="Times New Roman" w:cs="Times New Roman" w:eastAsia="Times New Roman" w:hAnsi="Times New Roman"/>
-                <w:b w:val="false"/>
-                <w:bCs w:val="false"/>
-                <w:sz w:val="21"/>
-                <w:szCs w:val="21"/>
-              </w:rPr>
-              <w:t xml:space="preserve">Revenue per Customer</w:t>
-            </w:r>
-          </w:p>
-        </w:tc>
-        <w:tc>
-          <w:tcPr>
-            <w:tcW w:type="dxa" w:w="6660"/>
-            <w:tcBorders>
-              <w:top w:val="single" w:color="888888" w:sz="4"/>
-              <w:left w:val="single" w:color="888888" w:sz="4"/>
-              <w:bottom w:val="single" w:color="888888" w:sz="4"/>
-              <w:right w:val="single" w:color="888888" w:sz="4"/>
-            </w:tcBorders>
-            <w:tcMar>
-              <w:top w:type="dxa" w:w="60"/>
-              <w:left w:type="dxa" w:w="100"/>
-              <w:bottom w:type="dxa" w:w="60"/>
-              <w:right w:type="dxa" w:w="100"/>
-            </w:tcMar>
-          </w:tcPr>
-          <w:p>
-            <w:pPr>
-              <w:jc w:val="left"/>
-            </w:pPr>
-            <w:r>
-              <w:rPr>
-                <w:rFonts w:ascii="Times New Roman" w:cs="Times New Roman" w:eastAsia="Times New Roman" w:hAnsi="Times New Roman"/>
-                <w:b w:val="false"/>
-                <w:bCs w:val="false"/>
-                <w:sz w:val="21"/>
-                <w:szCs w:val="21"/>
-              </w:rPr>
-              <w:t xml:space="preserve">DIVIDE([Total Revenue], [Total Unique Customers])</w:t>
-            </w:r>
-          </w:p>
-        </w:tc>
-      </w:tr>
-      <w:tr>
-        <w:trPr>
-          <w:tblHeader w:val="false"/>
-        </w:trPr>
-        <w:tc>
-          <w:tcPr>
-            <w:tcW w:type="dxa" w:w="2700"/>
-            <w:tcBorders>
-              <w:top w:val="single" w:color="888888" w:sz="4"/>
-              <w:left w:val="single" w:color="888888" w:sz="4"/>
-              <w:bottom w:val="single" w:color="888888" w:sz="4"/>
-              <w:right w:val="single" w:color="888888" w:sz="4"/>
-            </w:tcBorders>
-            <w:tcMar>
-              <w:top w:type="dxa" w:w="60"/>
-              <w:left w:type="dxa" w:w="100"/>
-              <w:bottom w:type="dxa" w:w="60"/>
-              <w:right w:type="dxa" w:w="100"/>
-            </w:tcMar>
-          </w:tcPr>
-          <w:p>
-            <w:pPr>
-              <w:jc w:val="left"/>
-            </w:pPr>
-            <w:r>
-              <w:rPr>
-                <w:rFonts w:ascii="Times New Roman" w:cs="Times New Roman" w:eastAsia="Times New Roman" w:hAnsi="Times New Roman"/>
-                <w:b w:val="false"/>
-                <w:bCs w:val="false"/>
-                <w:sz w:val="21"/>
-                <w:szCs w:val="21"/>
-              </w:rPr>
-              <w:t xml:space="preserve">Revenue Share %</w:t>
-            </w:r>
-          </w:p>
-        </w:tc>
-        <w:tc>
-          <w:tcPr>
-            <w:tcW w:type="dxa" w:w="6660"/>
-            <w:tcBorders>
-              <w:top w:val="single" w:color="888888" w:sz="4"/>
-              <w:left w:val="single" w:color="888888" w:sz="4"/>
-              <w:bottom w:val="single" w:color="888888" w:sz="4"/>
-              <w:right w:val="single" w:color="888888" w:sz="4"/>
-            </w:tcBorders>
-            <w:tcMar>
-              <w:top w:type="dxa" w:w="60"/>
-              <w:left w:type="dxa" w:w="100"/>
-              <w:bottom w:type="dxa" w:w="60"/>
-              <w:right w:type="dxa" w:w="100"/>
-            </w:tcMar>
-          </w:tcPr>
-          <w:p>
-            <w:pPr>
-              <w:jc w:val="left"/>
-            </w:pPr>
-            <w:r>
-              <w:rPr>
-                <w:rFonts w:ascii="Times New Roman" w:cs="Times New Roman" w:eastAsia="Times New Roman" w:hAnsi="Times New Roman"/>
-                <w:b w:val="false"/>
-                <w:bCs w:val="false"/>
-                <w:sz w:val="21"/>
-                <w:szCs w:val="21"/>
-              </w:rPr>
-              <w:t xml:space="preserve">DIVIDE([Total Revenue], CALCULATE([Total Revenue], ALL(Customers[Region])))</w:t>
-            </w:r>
-          </w:p>
-        </w:tc>
-      </w:tr>
-    </w:tbl>
-    <w:p>
-      <w:pPr>
-        <w:spacing w:after="100"/>
-      </w:pPr>
-    </w:p>
-    <w:p>
-      <w:pPr>
-        <w:spacing w:after="120" w:line="300"/>
-        <w:jc w:val="both"/>
-      </w:pPr>
-      <w:r>
-        <w:rPr>
-          <w:rFonts w:ascii="Times New Roman" w:cs="Times New Roman" w:eastAsia="Times New Roman" w:hAnsi="Times New Roman"/>
-        </w:rPr>
-        <w:t xml:space="preserve">Measure dihitung secara dinamis mengikuti konteks filter, berbeda dengan kolom hitungan yang dievaluasi per baris saat data dimuat.</w:t>
+        <w:t xml:space="preserve">Gambar 2.2 menampilkan sheet Products yang berisi 100 baris dengan empat kolom: ProductID (P001 sampai P100), ProductName, Category (Books, Electronics, Clothing, Home Decor), dan Price sebagai harga satuan produk.</w:t>
       </w:r>
     </w:p>
     <w:p>
@@ -3831,7 +3150,7 @@
       <w:r>
         <w:drawing>
           <wp:inline distT="0" distB="0" distL="0" distR="0">
-            <wp:extent cx="5334000" cy="885825"/>
+            <wp:extent cx="3619500" cy="2657475"/>
             <wp:effectExtent t="0" r="0" b="0" l="0"/>
             <wp:docPr id="1" name="" descr="" title=""/>
             <wp:cNvGraphicFramePr>
@@ -3856,7 +3175,7 @@
                   <pic:spPr bwMode="auto">
                     <a:xfrm>
                       <a:off x="0" y="0"/>
-                      <a:ext cx="5334000" cy="885825"/>
+                      <a:ext cx="3619500" cy="2657475"/>
                     </a:xfrm>
                     <a:prstGeom prst="rect">
                       <a:avLst/>
@@ -3882,7 +3201,7 @@
           <w:sz w:val="21"/>
           <w:szCs w:val="21"/>
         </w:rPr>
-        <w:t xml:space="preserve">Gambar 3.3 Measure Total Revenue pada Power BI</w:t>
+        <w:t xml:space="preserve">Gambar 2.3 Data awal sheet Transactions</w:t>
       </w:r>
     </w:p>
     <w:p>
@@ -3894,7 +3213,141 @@
         <w:rPr>
           <w:rFonts w:ascii="Times New Roman" w:cs="Times New Roman" w:eastAsia="Times New Roman" w:hAnsi="Times New Roman"/>
         </w:rPr>
-        <w:t xml:space="preserve">Gambar 3.3 menampilkan measure Total Revenue yang menjumlahkan kolom TotalValue. Measure ini menjadi dasar bagi measure lain, seperti Avg Order Value dan Revenue per Customer.</w:t>
+        <w:t xml:space="preserve">Gambar 2.3 menampilkan sheet Transactions yang berisi 1.000 baris dengan tujuh kolom: TransactionID, CustomerID, ProductID, TransactionDate (tanggal dan jam), Quantity, TotalValue, dan Price. Sebagai contoh, transaksi T00001 dilakukan pelanggan C0199 atas produk P067 sebanyak 1 unit dengan nilai 300,68. Nilai TotalValue merupakan hasil perkalian Quantity dan Price, misalnya T00272 sebanyak 2 unit dengan harga 300,68 bernilai 601,36. Kolom CustomerID dan ProductID pada sheet ini menjadi kunci penghubung ke sheet Customers dan Products.</w:t>
+      </w:r>
+    </w:p>
+    <w:p>
+      <w:pPr>
+        <w:pStyle w:val="Heading1"/>
+        <w:spacing w:after="200" w:before="240"/>
+        <w:jc w:val="center"/>
+      </w:pPr>
+      <w:r>
+        <w:rPr>
+          <w:rFonts w:ascii="Times New Roman" w:cs="Times New Roman" w:eastAsia="Times New Roman" w:hAnsi="Times New Roman"/>
+        </w:rPr>
+        <w:t xml:space="preserve">BAB III  METODOLOGI DAN PROSES VISUALISASI</w:t>
+      </w:r>
+    </w:p>
+    <w:p>
+      <w:pPr>
+        <w:pStyle w:val="Heading2"/>
+        <w:spacing w:after="100" w:before="200"/>
+      </w:pPr>
+      <w:r>
+        <w:rPr>
+          <w:rFonts w:ascii="Times New Roman" w:cs="Times New Roman" w:eastAsia="Times New Roman" w:hAnsi="Times New Roman"/>
+        </w:rPr>
+        <w:t xml:space="preserve">3.1 Tahapan Analisis</w:t>
+      </w:r>
+    </w:p>
+    <w:p>
+      <w:pPr>
+        <w:pStyle w:val="ListParagraph"/>
+        <w:numPr>
+          <w:ilvl w:val="0"/>
+          <w:numId w:val="4"/>
+        </w:numPr>
+        <w:spacing w:after="60" w:line="288"/>
+        <w:jc w:val="both"/>
+      </w:pPr>
+      <w:r>
+        <w:rPr>
+          <w:rFonts w:ascii="Times New Roman" w:cs="Times New Roman" w:eastAsia="Times New Roman" w:hAnsi="Times New Roman"/>
+        </w:rPr>
+        <w:t xml:space="preserve">Pemuatan data dari berkas Excel ke Power BI.</w:t>
+      </w:r>
+    </w:p>
+    <w:p>
+      <w:pPr>
+        <w:pStyle w:val="ListParagraph"/>
+        <w:numPr>
+          <w:ilvl w:val="0"/>
+          <w:numId w:val="4"/>
+        </w:numPr>
+        <w:spacing w:after="60" w:line="288"/>
+        <w:jc w:val="both"/>
+      </w:pPr>
+      <w:r>
+        <w:rPr>
+          <w:rFonts w:ascii="Times New Roman" w:cs="Times New Roman" w:eastAsia="Times New Roman" w:hAnsi="Times New Roman"/>
+        </w:rPr>
+        <w:t xml:space="preserve">Transformasi dan pengaturan tipe data pada Power Query.</w:t>
+      </w:r>
+    </w:p>
+    <w:p>
+      <w:pPr>
+        <w:pStyle w:val="ListParagraph"/>
+        <w:numPr>
+          <w:ilvl w:val="0"/>
+          <w:numId w:val="4"/>
+        </w:numPr>
+        <w:spacing w:after="60" w:line="288"/>
+        <w:jc w:val="both"/>
+      </w:pPr>
+      <w:r>
+        <w:rPr>
+          <w:rFonts w:ascii="Times New Roman" w:cs="Times New Roman" w:eastAsia="Times New Roman" w:hAnsi="Times New Roman"/>
+        </w:rPr>
+        <w:t xml:space="preserve">Pembentukan model data dan relasi antar tabel.</w:t>
+      </w:r>
+    </w:p>
+    <w:p>
+      <w:pPr>
+        <w:pStyle w:val="ListParagraph"/>
+        <w:numPr>
+          <w:ilvl w:val="0"/>
+          <w:numId w:val="4"/>
+        </w:numPr>
+        <w:spacing w:after="60" w:line="288"/>
+        <w:jc w:val="both"/>
+      </w:pPr>
+      <w:r>
+        <w:rPr>
+          <w:rFonts w:ascii="Times New Roman" w:cs="Times New Roman" w:eastAsia="Times New Roman" w:hAnsi="Times New Roman"/>
+        </w:rPr>
+        <w:t xml:space="preserve">Pembuatan measure dengan DAX.</w:t>
+      </w:r>
+    </w:p>
+    <w:p>
+      <w:pPr>
+        <w:pStyle w:val="ListParagraph"/>
+        <w:numPr>
+          <w:ilvl w:val="0"/>
+          <w:numId w:val="4"/>
+        </w:numPr>
+        <w:spacing w:after="60" w:line="288"/>
+        <w:jc w:val="both"/>
+      </w:pPr>
+      <w:r>
+        <w:rPr>
+          <w:rFonts w:ascii="Times New Roman" w:cs="Times New Roman" w:eastAsia="Times New Roman" w:hAnsi="Times New Roman"/>
+        </w:rPr>
+        <w:t xml:space="preserve">Perancangan dashboard interaktif dan penarikan interpretasi.</w:t>
+      </w:r>
+    </w:p>
+    <w:p>
+      <w:pPr>
+        <w:pStyle w:val="Heading2"/>
+        <w:spacing w:after="100" w:before="200"/>
+      </w:pPr>
+      <w:r>
+        <w:rPr>
+          <w:rFonts w:ascii="Times New Roman" w:cs="Times New Roman" w:eastAsia="Times New Roman" w:hAnsi="Times New Roman"/>
+        </w:rPr>
+        <w:t xml:space="preserve">3.2 Data Awal dan Transformasi</w:t>
+      </w:r>
+    </w:p>
+    <w:p>
+      <w:pPr>
+        <w:spacing w:after="120" w:line="300"/>
+        <w:jc w:val="both"/>
+      </w:pPr>
+      <w:r>
+        <w:rPr>
+          <w:rFonts w:ascii="Times New Roman" w:cs="Times New Roman" w:eastAsia="Times New Roman" w:hAnsi="Times New Roman"/>
+        </w:rPr>
+        <w:t xml:space="preserve">Ketiga sheet dimuat melalui Power Query. Langkah transformasi pada tiap tabel meliputi Promoted Headers untuk menjadikan baris pertama sebagai nama kolom, dan Changed Type untuk menetapkan tipe data (pengenal sebagai teks, tanggal sebagai date atau datetime, Quantity sebagai bilangan bulat, serta Price dan TotalValue sebagai desimal).</w:t>
       </w:r>
     </w:p>
     <w:p>
@@ -3905,7 +3358,7 @@
       <w:r>
         <w:drawing>
           <wp:inline distT="0" distB="0" distL="0" distR="0">
-            <wp:extent cx="5334000" cy="885825"/>
+            <wp:extent cx="5334000" cy="2809875"/>
             <wp:effectExtent t="0" r="0" b="0" l="0"/>
             <wp:docPr id="1" name="" descr="" title=""/>
             <wp:cNvGraphicFramePr>
@@ -3930,7 +3383,7 @@
                   <pic:spPr bwMode="auto">
                     <a:xfrm>
                       <a:off x="0" y="0"/>
-                      <a:ext cx="5334000" cy="885825"/>
+                      <a:ext cx="5334000" cy="2809875"/>
                     </a:xfrm>
                     <a:prstGeom prst="rect">
                       <a:avLst/>
@@ -3956,7 +3409,7 @@
           <w:sz w:val="21"/>
           <w:szCs w:val="21"/>
         </w:rPr>
-        <w:t xml:space="preserve">Gambar 3.4 Measure Revenue Share % pada Power BI</w:t>
+        <w:t xml:space="preserve">Gambar 3.1 Data awal tabel Transactions pada Power Query</w:t>
       </w:r>
     </w:p>
     <w:p>
@@ -3968,68 +3421,7 @@
         <w:rPr>
           <w:rFonts w:ascii="Times New Roman" w:cs="Times New Roman" w:eastAsia="Times New Roman" w:hAnsi="Times New Roman"/>
         </w:rPr>
-        <w:t xml:space="preserve">Gambar 3.4 menampilkan measure Revenue Share % dengan format persentase. Fungsi ALL menghapus filter pada Region sehingga penyebut berupa total seluruh wilayah, sedangkan pembilangnya mengikuti wilayah pada baris tabel.</w:t>
-      </w:r>
-    </w:p>
-    <w:p>
-      <w:pPr>
-        <w:pStyle w:val="Heading2"/>
-        <w:spacing w:after="100" w:before="200"/>
-      </w:pPr>
-      <w:r>
-        <w:rPr>
-          <w:rFonts w:ascii="Times New Roman" w:cs="Times New Roman" w:eastAsia="Times New Roman" w:hAnsi="Times New Roman"/>
-        </w:rPr>
-        <w:t xml:space="preserve">3.5 Rancangan Dashboard</w:t>
-      </w:r>
-    </w:p>
-    <w:p>
-      <w:pPr>
-        <w:spacing w:after="120" w:line="300"/>
-        <w:jc w:val="both"/>
-      </w:pPr>
-      <w:r>
-        <w:rPr>
-          <w:rFonts w:ascii="Times New Roman" w:cs="Times New Roman" w:eastAsia="Times New Roman" w:hAnsi="Times New Roman"/>
-        </w:rPr>
-        <w:t xml:space="preserve">Dashboard terdiri atas tiga halaman: Revenue Report (penjualan), Customer Behavior Report (perilaku pelanggan), dan KPI Summary (ringkasan indikator kinerja utama). Interaktivitas disediakan oleh slicer Region dan slicer waktu (tahun, kuartal, bulan, dan quantity).</w:t>
-      </w:r>
-    </w:p>
-    <w:p>
-      <w:pPr>
-        <w:pStyle w:val="Heading1"/>
-        <w:spacing w:after="200" w:before="240"/>
-        <w:jc w:val="center"/>
-      </w:pPr>
-      <w:r>
-        <w:rPr>
-          <w:rFonts w:ascii="Times New Roman" w:cs="Times New Roman" w:eastAsia="Times New Roman" w:hAnsi="Times New Roman"/>
-        </w:rPr>
-        <w:t xml:space="preserve">BAB IV  HASIL DAN PEMBAHASAN</w:t>
-      </w:r>
-    </w:p>
-    <w:p>
-      <w:pPr>
-        <w:pStyle w:val="Heading2"/>
-        <w:spacing w:after="100" w:before="200"/>
-      </w:pPr>
-      <w:r>
-        <w:rPr>
-          <w:rFonts w:ascii="Times New Roman" w:cs="Times New Roman" w:eastAsia="Times New Roman" w:hAnsi="Times New Roman"/>
-        </w:rPr>
-        <w:t xml:space="preserve">4.1 Dashboard Power BI</w:t>
-      </w:r>
-    </w:p>
-    <w:p>
-      <w:pPr>
-        <w:pStyle w:val="Heading2"/>
-        <w:spacing w:after="100" w:before="200"/>
-      </w:pPr>
-      <w:r>
-        <w:rPr>
-          <w:rFonts w:ascii="Times New Roman" w:cs="Times New Roman" w:eastAsia="Times New Roman" w:hAnsi="Times New Roman"/>
-        </w:rPr>
-        <w:t xml:space="preserve">4.1.1 Revenue Report</w:t>
+        <w:t xml:space="preserve">Gambar 3.1 memperlihatkan tabel Transactions pada Power Query Editor beserta profil kualitas tiap kolom. Seluruh kolom bernilai Valid 100%, dengan Error dan Empty 0%. TransactionID memiliki 1.000 nilai unik, CustomerID 199 nilai berbeda, dan ProductID 100 nilai berbeda. Formula pada baris rumus (Table.TransformColumnTypes) merupakan langkah Changed Type yang menetapkan tipe data tiap kolom.</w:t>
       </w:r>
     </w:p>
     <w:p>
@@ -4040,7 +3432,7 @@
       <w:r>
         <w:drawing>
           <wp:inline distT="0" distB="0" distL="0" distR="0">
-            <wp:extent cx="5143500" cy="2200275"/>
+            <wp:extent cx="3810000" cy="3248025"/>
             <wp:effectExtent t="0" r="0" b="0" l="0"/>
             <wp:docPr id="1" name="" descr="" title=""/>
             <wp:cNvGraphicFramePr>
@@ -4065,7 +3457,7 @@
                   <pic:spPr bwMode="auto">
                     <a:xfrm>
                       <a:off x="0" y="0"/>
-                      <a:ext cx="5143500" cy="2200275"/>
+                      <a:ext cx="3810000" cy="3248025"/>
                     </a:xfrm>
                     <a:prstGeom prst="rect">
                       <a:avLst/>
@@ -4091,7 +3483,7 @@
           <w:sz w:val="21"/>
           <w:szCs w:val="21"/>
         </w:rPr>
-        <w:t xml:space="preserve">Gambar 4.1 Tren pendapatan bulanan (Total Revenue by Month)</w:t>
+        <w:t xml:space="preserve">Gambar 3.2 Profil kualitas kolom tabel Customers</w:t>
       </w:r>
     </w:p>
     <w:p>
@@ -4103,7 +3495,578 @@
         <w:rPr>
           <w:rFonts w:ascii="Times New Roman" w:cs="Times New Roman" w:eastAsia="Times New Roman" w:hAnsi="Times New Roman"/>
         </w:rPr>
-        <w:t xml:space="preserve">Gambar 4.1 memperlihatkan pendapatan bulanan sepanjang 2024. Pendapatan mencapai puncak pada Juli (sekitar 71 ribu) dan September (sekitar 70 ribu), serta terendah pada November (sekitar 38 ribu). Pola ini menunjukkan adanya musiman dalam penjualan.</w:t>
+        <w:t xml:space="preserve">Gambar 3.2 menunjukkan tabel Customers yang berisi 200 pelanggan dengan CustomerID dan CustomerName unik, empat nilai Region, serta SignupDate bertipe tanggal. Tidak ditemukan nilai kosong maupun galat sehingga data siap dianalisis tanpa pembersihan tambahan.</w:t>
+      </w:r>
+    </w:p>
+    <w:p>
+      <w:pPr>
+        <w:pStyle w:val="Heading2"/>
+        <w:spacing w:after="100" w:before="200"/>
+      </w:pPr>
+      <w:r>
+        <w:rPr>
+          <w:rFonts w:ascii="Times New Roman" w:cs="Times New Roman" w:eastAsia="Times New Roman" w:hAnsi="Times New Roman"/>
+        </w:rPr>
+        <w:t xml:space="preserve">3.3 Model Data</w:t>
+      </w:r>
+    </w:p>
+    <w:p>
+      <w:pPr>
+        <w:spacing w:after="120" w:line="300"/>
+        <w:jc w:val="both"/>
+      </w:pPr>
+      <w:r>
+        <w:rPr>
+          <w:rFonts w:ascii="Times New Roman" w:cs="Times New Roman" w:eastAsia="Times New Roman" w:hAnsi="Times New Roman"/>
+        </w:rPr>
+        <w:t xml:space="preserve">Tabel Transactions berelasi banyak-ke-satu dengan Customers melalui CustomerID dan dengan Products melalui ProductID. Relasi ini memungkinkan filter pada dimensi (misalnya Region atau Category) memengaruhi seluruh perhitungan pada tabel fakta.</w:t>
+      </w:r>
+    </w:p>
+    <w:p>
+      <w:pPr>
+        <w:pStyle w:val="Heading2"/>
+        <w:spacing w:after="100" w:before="200"/>
+      </w:pPr>
+      <w:r>
+        <w:rPr>
+          <w:rFonts w:ascii="Times New Roman" w:cs="Times New Roman" w:eastAsia="Times New Roman" w:hAnsi="Times New Roman"/>
+        </w:rPr>
+        <w:t xml:space="preserve">3.4 Penggunaan DAX</w:t>
+      </w:r>
+    </w:p>
+    <w:p>
+      <w:pPr>
+        <w:spacing w:after="80" w:before="100"/>
+        <w:jc w:val="center"/>
+      </w:pPr>
+      <w:r>
+        <w:rPr>
+          <w:rFonts w:ascii="Times New Roman" w:cs="Times New Roman" w:eastAsia="Times New Roman" w:hAnsi="Times New Roman"/>
+          <w:b/>
+          <w:bCs/>
+          <w:sz w:val="22"/>
+          <w:szCs w:val="22"/>
+        </w:rPr>
+        <w:t xml:space="preserve">Tabel 3.1 Measure DAX yang digunakan</w:t>
+      </w:r>
+    </w:p>
+    <w:tbl>
+      <w:tblPr>
+        <w:tblW w:type="dxa" w:w="9360"/>
+        <w:tblBorders>
+          <w:top w:val="single" w:color="auto" w:sz="4"/>
+          <w:left w:val="single" w:color="auto" w:sz="4"/>
+          <w:bottom w:val="single" w:color="auto" w:sz="4"/>
+          <w:right w:val="single" w:color="auto" w:sz="4"/>
+          <w:insideH w:val="single" w:color="auto" w:sz="4"/>
+          <w:insideV w:val="single" w:color="auto" w:sz="4"/>
+        </w:tblBorders>
+      </w:tblPr>
+      <w:tblGrid>
+        <w:gridCol w:w="2700"/>
+        <w:gridCol w:w="6660"/>
+      </w:tblGrid>
+      <w:tr>
+        <w:trPr>
+          <w:tblHeader/>
+        </w:trPr>
+        <w:tc>
+          <w:tcPr>
+            <w:tcW w:type="dxa" w:w="2700"/>
+            <w:tcBorders>
+              <w:top w:val="single" w:color="888888" w:sz="4"/>
+              <w:left w:val="single" w:color="888888" w:sz="4"/>
+              <w:bottom w:val="single" w:color="888888" w:sz="4"/>
+              <w:right w:val="single" w:color="888888" w:sz="4"/>
+            </w:tcBorders>
+            <w:shd w:fill="D9E2F3" w:color="auto" w:val="clear"/>
+            <w:tcMar>
+              <w:top w:type="dxa" w:w="60"/>
+              <w:left w:type="dxa" w:w="100"/>
+              <w:bottom w:type="dxa" w:w="60"/>
+              <w:right w:type="dxa" w:w="100"/>
+            </w:tcMar>
+          </w:tcPr>
+          <w:p>
+            <w:pPr>
+              <w:jc w:val="center"/>
+            </w:pPr>
+            <w:r>
+              <w:rPr>
+                <w:rFonts w:ascii="Times New Roman" w:cs="Times New Roman" w:eastAsia="Times New Roman" w:hAnsi="Times New Roman"/>
+                <w:b/>
+                <w:bCs/>
+                <w:sz w:val="21"/>
+                <w:szCs w:val="21"/>
+              </w:rPr>
+              <w:t xml:space="preserve">Measure</w:t>
+            </w:r>
+          </w:p>
+        </w:tc>
+        <w:tc>
+          <w:tcPr>
+            <w:tcW w:type="dxa" w:w="6660"/>
+            <w:tcBorders>
+              <w:top w:val="single" w:color="888888" w:sz="4"/>
+              <w:left w:val="single" w:color="888888" w:sz="4"/>
+              <w:bottom w:val="single" w:color="888888" w:sz="4"/>
+              <w:right w:val="single" w:color="888888" w:sz="4"/>
+            </w:tcBorders>
+            <w:shd w:fill="D9E2F3" w:color="auto" w:val="clear"/>
+            <w:tcMar>
+              <w:top w:type="dxa" w:w="60"/>
+              <w:left w:type="dxa" w:w="100"/>
+              <w:bottom w:type="dxa" w:w="60"/>
+              <w:right w:type="dxa" w:w="100"/>
+            </w:tcMar>
+          </w:tcPr>
+          <w:p>
+            <w:pPr>
+              <w:jc w:val="center"/>
+            </w:pPr>
+            <w:r>
+              <w:rPr>
+                <w:rFonts w:ascii="Times New Roman" w:cs="Times New Roman" w:eastAsia="Times New Roman" w:hAnsi="Times New Roman"/>
+                <w:b/>
+                <w:bCs/>
+                <w:sz w:val="21"/>
+                <w:szCs w:val="21"/>
+              </w:rPr>
+              <w:t xml:space="preserve">Rumus DAX</w:t>
+            </w:r>
+          </w:p>
+        </w:tc>
+      </w:tr>
+      <w:tr>
+        <w:trPr>
+          <w:tblHeader w:val="false"/>
+        </w:trPr>
+        <w:tc>
+          <w:tcPr>
+            <w:tcW w:type="dxa" w:w="2700"/>
+            <w:tcBorders>
+              <w:top w:val="single" w:color="888888" w:sz="4"/>
+              <w:left w:val="single" w:color="888888" w:sz="4"/>
+              <w:bottom w:val="single" w:color="888888" w:sz="4"/>
+              <w:right w:val="single" w:color="888888" w:sz="4"/>
+            </w:tcBorders>
+            <w:tcMar>
+              <w:top w:type="dxa" w:w="60"/>
+              <w:left w:type="dxa" w:w="100"/>
+              <w:bottom w:type="dxa" w:w="60"/>
+              <w:right w:type="dxa" w:w="100"/>
+            </w:tcMar>
+          </w:tcPr>
+          <w:p>
+            <w:pPr>
+              <w:jc w:val="left"/>
+            </w:pPr>
+            <w:r>
+              <w:rPr>
+                <w:rFonts w:ascii="Times New Roman" w:cs="Times New Roman" w:eastAsia="Times New Roman" w:hAnsi="Times New Roman"/>
+                <w:b w:val="false"/>
+                <w:bCs w:val="false"/>
+                <w:sz w:val="21"/>
+                <w:szCs w:val="21"/>
+              </w:rPr>
+              <w:t xml:space="preserve">Total Revenue</w:t>
+            </w:r>
+          </w:p>
+        </w:tc>
+        <w:tc>
+          <w:tcPr>
+            <w:tcW w:type="dxa" w:w="6660"/>
+            <w:tcBorders>
+              <w:top w:val="single" w:color="888888" w:sz="4"/>
+              <w:left w:val="single" w:color="888888" w:sz="4"/>
+              <w:bottom w:val="single" w:color="888888" w:sz="4"/>
+              <w:right w:val="single" w:color="888888" w:sz="4"/>
+            </w:tcBorders>
+            <w:tcMar>
+              <w:top w:type="dxa" w:w="60"/>
+              <w:left w:type="dxa" w:w="100"/>
+              <w:bottom w:type="dxa" w:w="60"/>
+              <w:right w:type="dxa" w:w="100"/>
+            </w:tcMar>
+          </w:tcPr>
+          <w:p>
+            <w:pPr>
+              <w:jc w:val="left"/>
+            </w:pPr>
+            <w:r>
+              <w:rPr>
+                <w:rFonts w:ascii="Times New Roman" w:cs="Times New Roman" w:eastAsia="Times New Roman" w:hAnsi="Times New Roman"/>
+                <w:b w:val="false"/>
+                <w:bCs w:val="false"/>
+                <w:sz w:val="21"/>
+                <w:szCs w:val="21"/>
+              </w:rPr>
+              <w:t xml:space="preserve">SUM(Transactions[TotalValue])</w:t>
+            </w:r>
+          </w:p>
+        </w:tc>
+      </w:tr>
+      <w:tr>
+        <w:trPr>
+          <w:tblHeader w:val="false"/>
+        </w:trPr>
+        <w:tc>
+          <w:tcPr>
+            <w:tcW w:type="dxa" w:w="2700"/>
+            <w:tcBorders>
+              <w:top w:val="single" w:color="888888" w:sz="4"/>
+              <w:left w:val="single" w:color="888888" w:sz="4"/>
+              <w:bottom w:val="single" w:color="888888" w:sz="4"/>
+              <w:right w:val="single" w:color="888888" w:sz="4"/>
+            </w:tcBorders>
+            <w:tcMar>
+              <w:top w:type="dxa" w:w="60"/>
+              <w:left w:type="dxa" w:w="100"/>
+              <w:bottom w:type="dxa" w:w="60"/>
+              <w:right w:type="dxa" w:w="100"/>
+            </w:tcMar>
+          </w:tcPr>
+          <w:p>
+            <w:pPr>
+              <w:jc w:val="left"/>
+            </w:pPr>
+            <w:r>
+              <w:rPr>
+                <w:rFonts w:ascii="Times New Roman" w:cs="Times New Roman" w:eastAsia="Times New Roman" w:hAnsi="Times New Roman"/>
+                <w:b w:val="false"/>
+                <w:bCs w:val="false"/>
+                <w:sz w:val="21"/>
+                <w:szCs w:val="21"/>
+              </w:rPr>
+              <w:t xml:space="preserve">Total Transactions</w:t>
+            </w:r>
+          </w:p>
+        </w:tc>
+        <w:tc>
+          <w:tcPr>
+            <w:tcW w:type="dxa" w:w="6660"/>
+            <w:tcBorders>
+              <w:top w:val="single" w:color="888888" w:sz="4"/>
+              <w:left w:val="single" w:color="888888" w:sz="4"/>
+              <w:bottom w:val="single" w:color="888888" w:sz="4"/>
+              <w:right w:val="single" w:color="888888" w:sz="4"/>
+            </w:tcBorders>
+            <w:tcMar>
+              <w:top w:type="dxa" w:w="60"/>
+              <w:left w:type="dxa" w:w="100"/>
+              <w:bottom w:type="dxa" w:w="60"/>
+              <w:right w:type="dxa" w:w="100"/>
+            </w:tcMar>
+          </w:tcPr>
+          <w:p>
+            <w:pPr>
+              <w:jc w:val="left"/>
+            </w:pPr>
+            <w:r>
+              <w:rPr>
+                <w:rFonts w:ascii="Times New Roman" w:cs="Times New Roman" w:eastAsia="Times New Roman" w:hAnsi="Times New Roman"/>
+                <w:b w:val="false"/>
+                <w:bCs w:val="false"/>
+                <w:sz w:val="21"/>
+                <w:szCs w:val="21"/>
+              </w:rPr>
+              <w:t xml:space="preserve">DISTINCTCOUNT(Transactions[TransactionID])</w:t>
+            </w:r>
+          </w:p>
+        </w:tc>
+      </w:tr>
+      <w:tr>
+        <w:trPr>
+          <w:tblHeader w:val="false"/>
+        </w:trPr>
+        <w:tc>
+          <w:tcPr>
+            <w:tcW w:type="dxa" w:w="2700"/>
+            <w:tcBorders>
+              <w:top w:val="single" w:color="888888" w:sz="4"/>
+              <w:left w:val="single" w:color="888888" w:sz="4"/>
+              <w:bottom w:val="single" w:color="888888" w:sz="4"/>
+              <w:right w:val="single" w:color="888888" w:sz="4"/>
+            </w:tcBorders>
+            <w:tcMar>
+              <w:top w:type="dxa" w:w="60"/>
+              <w:left w:type="dxa" w:w="100"/>
+              <w:bottom w:type="dxa" w:w="60"/>
+              <w:right w:type="dxa" w:w="100"/>
+            </w:tcMar>
+          </w:tcPr>
+          <w:p>
+            <w:pPr>
+              <w:jc w:val="left"/>
+            </w:pPr>
+            <w:r>
+              <w:rPr>
+                <w:rFonts w:ascii="Times New Roman" w:cs="Times New Roman" w:eastAsia="Times New Roman" w:hAnsi="Times New Roman"/>
+                <w:b w:val="false"/>
+                <w:bCs w:val="false"/>
+                <w:sz w:val="21"/>
+                <w:szCs w:val="21"/>
+              </w:rPr>
+              <w:t xml:space="preserve">Total Unique Customers</w:t>
+            </w:r>
+          </w:p>
+        </w:tc>
+        <w:tc>
+          <w:tcPr>
+            <w:tcW w:type="dxa" w:w="6660"/>
+            <w:tcBorders>
+              <w:top w:val="single" w:color="888888" w:sz="4"/>
+              <w:left w:val="single" w:color="888888" w:sz="4"/>
+              <w:bottom w:val="single" w:color="888888" w:sz="4"/>
+              <w:right w:val="single" w:color="888888" w:sz="4"/>
+            </w:tcBorders>
+            <w:tcMar>
+              <w:top w:type="dxa" w:w="60"/>
+              <w:left w:type="dxa" w:w="100"/>
+              <w:bottom w:type="dxa" w:w="60"/>
+              <w:right w:type="dxa" w:w="100"/>
+            </w:tcMar>
+          </w:tcPr>
+          <w:p>
+            <w:pPr>
+              <w:jc w:val="left"/>
+            </w:pPr>
+            <w:r>
+              <w:rPr>
+                <w:rFonts w:ascii="Times New Roman" w:cs="Times New Roman" w:eastAsia="Times New Roman" w:hAnsi="Times New Roman"/>
+                <w:b w:val="false"/>
+                <w:bCs w:val="false"/>
+                <w:sz w:val="21"/>
+                <w:szCs w:val="21"/>
+              </w:rPr>
+              <w:t xml:space="preserve">DISTINCTCOUNT(Transactions[CustomerID])</w:t>
+            </w:r>
+          </w:p>
+        </w:tc>
+      </w:tr>
+      <w:tr>
+        <w:trPr>
+          <w:tblHeader w:val="false"/>
+        </w:trPr>
+        <w:tc>
+          <w:tcPr>
+            <w:tcW w:type="dxa" w:w="2700"/>
+            <w:tcBorders>
+              <w:top w:val="single" w:color="888888" w:sz="4"/>
+              <w:left w:val="single" w:color="888888" w:sz="4"/>
+              <w:bottom w:val="single" w:color="888888" w:sz="4"/>
+              <w:right w:val="single" w:color="888888" w:sz="4"/>
+            </w:tcBorders>
+            <w:tcMar>
+              <w:top w:type="dxa" w:w="60"/>
+              <w:left w:type="dxa" w:w="100"/>
+              <w:bottom w:type="dxa" w:w="60"/>
+              <w:right w:type="dxa" w:w="100"/>
+            </w:tcMar>
+          </w:tcPr>
+          <w:p>
+            <w:pPr>
+              <w:jc w:val="left"/>
+            </w:pPr>
+            <w:r>
+              <w:rPr>
+                <w:rFonts w:ascii="Times New Roman" w:cs="Times New Roman" w:eastAsia="Times New Roman" w:hAnsi="Times New Roman"/>
+                <w:b w:val="false"/>
+                <w:bCs w:val="false"/>
+                <w:sz w:val="21"/>
+                <w:szCs w:val="21"/>
+              </w:rPr>
+              <w:t xml:space="preserve">Avg Order Value</w:t>
+            </w:r>
+          </w:p>
+        </w:tc>
+        <w:tc>
+          <w:tcPr>
+            <w:tcW w:type="dxa" w:w="6660"/>
+            <w:tcBorders>
+              <w:top w:val="single" w:color="888888" w:sz="4"/>
+              <w:left w:val="single" w:color="888888" w:sz="4"/>
+              <w:bottom w:val="single" w:color="888888" w:sz="4"/>
+              <w:right w:val="single" w:color="888888" w:sz="4"/>
+            </w:tcBorders>
+            <w:tcMar>
+              <w:top w:type="dxa" w:w="60"/>
+              <w:left w:type="dxa" w:w="100"/>
+              <w:bottom w:type="dxa" w:w="60"/>
+              <w:right w:type="dxa" w:w="100"/>
+            </w:tcMar>
+          </w:tcPr>
+          <w:p>
+            <w:pPr>
+              <w:jc w:val="left"/>
+            </w:pPr>
+            <w:r>
+              <w:rPr>
+                <w:rFonts w:ascii="Times New Roman" w:cs="Times New Roman" w:eastAsia="Times New Roman" w:hAnsi="Times New Roman"/>
+                <w:b w:val="false"/>
+                <w:bCs w:val="false"/>
+                <w:sz w:val="21"/>
+                <w:szCs w:val="21"/>
+              </w:rPr>
+              <w:t xml:space="preserve">DIVIDE([Total Revenue], [Total Transactions])</w:t>
+            </w:r>
+          </w:p>
+        </w:tc>
+      </w:tr>
+      <w:tr>
+        <w:trPr>
+          <w:tblHeader w:val="false"/>
+        </w:trPr>
+        <w:tc>
+          <w:tcPr>
+            <w:tcW w:type="dxa" w:w="2700"/>
+            <w:tcBorders>
+              <w:top w:val="single" w:color="888888" w:sz="4"/>
+              <w:left w:val="single" w:color="888888" w:sz="4"/>
+              <w:bottom w:val="single" w:color="888888" w:sz="4"/>
+              <w:right w:val="single" w:color="888888" w:sz="4"/>
+            </w:tcBorders>
+            <w:tcMar>
+              <w:top w:type="dxa" w:w="60"/>
+              <w:left w:type="dxa" w:w="100"/>
+              <w:bottom w:type="dxa" w:w="60"/>
+              <w:right w:type="dxa" w:w="100"/>
+            </w:tcMar>
+          </w:tcPr>
+          <w:p>
+            <w:pPr>
+              <w:jc w:val="left"/>
+            </w:pPr>
+            <w:r>
+              <w:rPr>
+                <w:rFonts w:ascii="Times New Roman" w:cs="Times New Roman" w:eastAsia="Times New Roman" w:hAnsi="Times New Roman"/>
+                <w:b w:val="false"/>
+                <w:bCs w:val="false"/>
+                <w:sz w:val="21"/>
+                <w:szCs w:val="21"/>
+              </w:rPr>
+              <w:t xml:space="preserve">Revenue per Customer</w:t>
+            </w:r>
+          </w:p>
+        </w:tc>
+        <w:tc>
+          <w:tcPr>
+            <w:tcW w:type="dxa" w:w="6660"/>
+            <w:tcBorders>
+              <w:top w:val="single" w:color="888888" w:sz="4"/>
+              <w:left w:val="single" w:color="888888" w:sz="4"/>
+              <w:bottom w:val="single" w:color="888888" w:sz="4"/>
+              <w:right w:val="single" w:color="888888" w:sz="4"/>
+            </w:tcBorders>
+            <w:tcMar>
+              <w:top w:type="dxa" w:w="60"/>
+              <w:left w:type="dxa" w:w="100"/>
+              <w:bottom w:type="dxa" w:w="60"/>
+              <w:right w:type="dxa" w:w="100"/>
+            </w:tcMar>
+          </w:tcPr>
+          <w:p>
+            <w:pPr>
+              <w:jc w:val="left"/>
+            </w:pPr>
+            <w:r>
+              <w:rPr>
+                <w:rFonts w:ascii="Times New Roman" w:cs="Times New Roman" w:eastAsia="Times New Roman" w:hAnsi="Times New Roman"/>
+                <w:b w:val="false"/>
+                <w:bCs w:val="false"/>
+                <w:sz w:val="21"/>
+                <w:szCs w:val="21"/>
+              </w:rPr>
+              <w:t xml:space="preserve">DIVIDE([Total Revenue], [Total Unique Customers])</w:t>
+            </w:r>
+          </w:p>
+        </w:tc>
+      </w:tr>
+      <w:tr>
+        <w:trPr>
+          <w:tblHeader w:val="false"/>
+        </w:trPr>
+        <w:tc>
+          <w:tcPr>
+            <w:tcW w:type="dxa" w:w="2700"/>
+            <w:tcBorders>
+              <w:top w:val="single" w:color="888888" w:sz="4"/>
+              <w:left w:val="single" w:color="888888" w:sz="4"/>
+              <w:bottom w:val="single" w:color="888888" w:sz="4"/>
+              <w:right w:val="single" w:color="888888" w:sz="4"/>
+            </w:tcBorders>
+            <w:tcMar>
+              <w:top w:type="dxa" w:w="60"/>
+              <w:left w:type="dxa" w:w="100"/>
+              <w:bottom w:type="dxa" w:w="60"/>
+              <w:right w:type="dxa" w:w="100"/>
+            </w:tcMar>
+          </w:tcPr>
+          <w:p>
+            <w:pPr>
+              <w:jc w:val="left"/>
+            </w:pPr>
+            <w:r>
+              <w:rPr>
+                <w:rFonts w:ascii="Times New Roman" w:cs="Times New Roman" w:eastAsia="Times New Roman" w:hAnsi="Times New Roman"/>
+                <w:b w:val="false"/>
+                <w:bCs w:val="false"/>
+                <w:sz w:val="21"/>
+                <w:szCs w:val="21"/>
+              </w:rPr>
+              <w:t xml:space="preserve">Revenue Share %</w:t>
+            </w:r>
+          </w:p>
+        </w:tc>
+        <w:tc>
+          <w:tcPr>
+            <w:tcW w:type="dxa" w:w="6660"/>
+            <w:tcBorders>
+              <w:top w:val="single" w:color="888888" w:sz="4"/>
+              <w:left w:val="single" w:color="888888" w:sz="4"/>
+              <w:bottom w:val="single" w:color="888888" w:sz="4"/>
+              <w:right w:val="single" w:color="888888" w:sz="4"/>
+            </w:tcBorders>
+            <w:tcMar>
+              <w:top w:type="dxa" w:w="60"/>
+              <w:left w:type="dxa" w:w="100"/>
+              <w:bottom w:type="dxa" w:w="60"/>
+              <w:right w:type="dxa" w:w="100"/>
+            </w:tcMar>
+          </w:tcPr>
+          <w:p>
+            <w:pPr>
+              <w:jc w:val="left"/>
+            </w:pPr>
+            <w:r>
+              <w:rPr>
+                <w:rFonts w:ascii="Times New Roman" w:cs="Times New Roman" w:eastAsia="Times New Roman" w:hAnsi="Times New Roman"/>
+                <w:b w:val="false"/>
+                <w:bCs w:val="false"/>
+                <w:sz w:val="21"/>
+                <w:szCs w:val="21"/>
+              </w:rPr>
+              <w:t xml:space="preserve">DIVIDE([Total Revenue], CALCULATE([Total Revenue], ALL(Customers[Region])))</w:t>
+            </w:r>
+          </w:p>
+        </w:tc>
+      </w:tr>
+    </w:tbl>
+    <w:p>
+      <w:pPr>
+        <w:spacing w:after="100"/>
+      </w:pPr>
+    </w:p>
+    <w:p>
+      <w:pPr>
+        <w:spacing w:after="120" w:line="300"/>
+        <w:jc w:val="both"/>
+      </w:pPr>
+      <w:r>
+        <w:rPr>
+          <w:rFonts w:ascii="Times New Roman" w:cs="Times New Roman" w:eastAsia="Times New Roman" w:hAnsi="Times New Roman"/>
+        </w:rPr>
+        <w:t xml:space="preserve">Measure dihitung secara dinamis mengikuti konteks filter, berbeda dengan kolom hitungan yang dievaluasi per baris saat data dimuat.</w:t>
       </w:r>
     </w:p>
     <w:p>
@@ -4114,7 +4077,7 @@
       <w:r>
         <w:drawing>
           <wp:inline distT="0" distB="0" distL="0" distR="0">
-            <wp:extent cx="4095750" cy="3009900"/>
+            <wp:extent cx="5334000" cy="885825"/>
             <wp:effectExtent t="0" r="0" b="0" l="0"/>
             <wp:docPr id="1" name="" descr="" title=""/>
             <wp:cNvGraphicFramePr>
@@ -4139,7 +4102,7 @@
                   <pic:spPr bwMode="auto">
                     <a:xfrm>
                       <a:off x="0" y="0"/>
-                      <a:ext cx="4095750" cy="3009900"/>
+                      <a:ext cx="5334000" cy="885825"/>
                     </a:xfrm>
                     <a:prstGeom prst="rect">
                       <a:avLst/>
@@ -4165,7 +4128,7 @@
           <w:sz w:val="21"/>
           <w:szCs w:val="21"/>
         </w:rPr>
-        <w:t xml:space="preserve">Gambar 4.2 Penjualan per produk (Total Sales by Product)</w:t>
+        <w:t xml:space="preserve">Gambar 3.3 Measure Total Revenue pada Power BI</w:t>
       </w:r>
     </w:p>
     <w:p>
@@ -4177,7 +4140,7 @@
         <w:rPr>
           <w:rFonts w:ascii="Times New Roman" w:cs="Times New Roman" w:eastAsia="Times New Roman" w:hAnsi="Times New Roman"/>
         </w:rPr>
-        <w:t xml:space="preserve">Gambar 4.2 menyajikan penjualan per nama produk dari yang tertinggi. ActiveWear Smartwatch memimpin dengan sekitar 39 ribu, disusul SoundWave Headphones dan SoundWave Novel. Pengelompokan memakai nama produk sehingga satu nama dapat mewakili beberapa ProductID.</w:t>
+        <w:t xml:space="preserve">Gambar 3.3 menampilkan measure Total Revenue yang menjumlahkan kolom TotalValue. Measure ini menjadi dasar bagi measure lain, seperti Avg Order Value dan Revenue per Customer.</w:t>
       </w:r>
     </w:p>
     <w:p>
@@ -4188,7 +4151,7 @@
       <w:r>
         <w:drawing>
           <wp:inline distT="0" distB="0" distL="0" distR="0">
-            <wp:extent cx="3810000" cy="2781300"/>
+            <wp:extent cx="5334000" cy="885825"/>
             <wp:effectExtent t="0" r="0" b="0" l="0"/>
             <wp:docPr id="1" name="" descr="" title=""/>
             <wp:cNvGraphicFramePr>
@@ -4213,7 +4176,7 @@
                   <pic:spPr bwMode="auto">
                     <a:xfrm>
                       <a:off x="0" y="0"/>
-                      <a:ext cx="3810000" cy="2781300"/>
+                      <a:ext cx="5334000" cy="885825"/>
                     </a:xfrm>
                     <a:prstGeom prst="rect">
                       <a:avLst/>
@@ -4239,7 +4202,7 @@
           <w:sz w:val="21"/>
           <w:szCs w:val="21"/>
         </w:rPr>
-        <w:t xml:space="preserve">Gambar 4.3 Kontribusi per kategori (Total Sales by Category)</w:t>
+        <w:t xml:space="preserve">Gambar 3.4 Measure Revenue Share % pada Power BI</w:t>
       </w:r>
     </w:p>
     <w:p>
@@ -4251,7 +4214,7 @@
         <w:rPr>
           <w:rFonts w:ascii="Times New Roman" w:cs="Times New Roman" w:eastAsia="Times New Roman" w:hAnsi="Times New Roman"/>
         </w:rPr>
-        <w:t xml:space="preserve">Gambar 4.3 menunjukkan kontribusi tiap kategori: Books 27,85%, Electronics 26,20%, Clothing 24,08%, dan Home Decor 21,87%. Books dan Electronics bersama-sama menyumbang sekitar 54% pendapatan.</w:t>
+        <w:t xml:space="preserve">Gambar 3.4 menampilkan measure Revenue Share % dengan format persentase. Fungsi ALL menghapus filter pada Region sehingga penyebut berupa total seluruh wilayah, sedangkan pembilangnya mengikuti wilayah pada baris tabel.</w:t>
       </w:r>
     </w:p>
     <w:p>
@@ -4263,7 +4226,56 @@
         <w:rPr>
           <w:rFonts w:ascii="Times New Roman" w:cs="Times New Roman" w:eastAsia="Times New Roman" w:hAnsi="Times New Roman"/>
         </w:rPr>
-        <w:t xml:space="preserve">4.1.2 Customer Behavior Report</w:t>
+        <w:t xml:space="preserve">3.5 Rancangan Dashboard</w:t>
+      </w:r>
+    </w:p>
+    <w:p>
+      <w:pPr>
+        <w:spacing w:after="120" w:line="300"/>
+        <w:jc w:val="both"/>
+      </w:pPr>
+      <w:r>
+        <w:rPr>
+          <w:rFonts w:ascii="Times New Roman" w:cs="Times New Roman" w:eastAsia="Times New Roman" w:hAnsi="Times New Roman"/>
+        </w:rPr>
+        <w:t xml:space="preserve">Dashboard terdiri atas tiga halaman: Revenue Report (penjualan), Customer Behavior Report (perilaku pelanggan), dan KPI Summary (ringkasan indikator kinerja utama). Interaktivitas disediakan oleh slicer Region dan slicer waktu (tahun, kuartal, bulan, dan quantity).</w:t>
+      </w:r>
+    </w:p>
+    <w:p>
+      <w:pPr>
+        <w:pStyle w:val="Heading1"/>
+        <w:spacing w:after="200" w:before="240"/>
+        <w:jc w:val="center"/>
+      </w:pPr>
+      <w:r>
+        <w:rPr>
+          <w:rFonts w:ascii="Times New Roman" w:cs="Times New Roman" w:eastAsia="Times New Roman" w:hAnsi="Times New Roman"/>
+        </w:rPr>
+        <w:t xml:space="preserve">BAB IV  HASIL DAN PEMBAHASAN</w:t>
+      </w:r>
+    </w:p>
+    <w:p>
+      <w:pPr>
+        <w:pStyle w:val="Heading2"/>
+        <w:spacing w:after="100" w:before="200"/>
+      </w:pPr>
+      <w:r>
+        <w:rPr>
+          <w:rFonts w:ascii="Times New Roman" w:cs="Times New Roman" w:eastAsia="Times New Roman" w:hAnsi="Times New Roman"/>
+        </w:rPr>
+        <w:t xml:space="preserve">4.1 Dashboard Power BI</w:t>
+      </w:r>
+    </w:p>
+    <w:p>
+      <w:pPr>
+        <w:pStyle w:val="Heading2"/>
+        <w:spacing w:after="100" w:before="200"/>
+      </w:pPr>
+      <w:r>
+        <w:rPr>
+          <w:rFonts w:ascii="Times New Roman" w:cs="Times New Roman" w:eastAsia="Times New Roman" w:hAnsi="Times New Roman"/>
+        </w:rPr>
+        <w:t xml:space="preserve">4.1.1 Revenue Report</w:t>
       </w:r>
     </w:p>
     <w:p>
@@ -4274,7 +4286,7 @@
       <w:r>
         <w:drawing>
           <wp:inline distT="0" distB="0" distL="0" distR="0">
-            <wp:extent cx="5334000" cy="2952750"/>
+            <wp:extent cx="5143500" cy="2200275"/>
             <wp:effectExtent t="0" r="0" b="0" l="0"/>
             <wp:docPr id="1" name="" descr="" title=""/>
             <wp:cNvGraphicFramePr>
@@ -4299,7 +4311,7 @@
                   <pic:spPr bwMode="auto">
                     <a:xfrm>
                       <a:off x="0" y="0"/>
-                      <a:ext cx="5334000" cy="2952750"/>
+                      <a:ext cx="5143500" cy="2200275"/>
                     </a:xfrm>
                     <a:prstGeom prst="rect">
                       <a:avLst/>
@@ -4325,7 +4337,7 @@
           <w:sz w:val="21"/>
           <w:szCs w:val="21"/>
         </w:rPr>
-        <w:t xml:space="preserve">Gambar 4.4 Halaman Laporan Perilaku Pelanggan</w:t>
+        <w:t xml:space="preserve">Gambar 4.1 Tren pendapatan bulanan (Total Revenue by Month)</w:t>
       </w:r>
     </w:p>
     <w:p>
@@ -4337,7 +4349,7 @@
         <w:rPr>
           <w:rFonts w:ascii="Times New Roman" w:cs="Times New Roman" w:eastAsia="Times New Roman" w:hAnsi="Times New Roman"/>
         </w:rPr>
-        <w:t xml:space="preserve">Gambar 4.4 menampilkan halaman perilaku pelanggan yang memuat dua grafik menurut wilayah serta slicer Region dan waktu (tahun, kuartal, bulan, dan quantity). Grafik kiri menunjukkan pendapatan per pelanggan, dan grafik kanan menunjukkan jumlah pelanggan aktif, yaitu South America 59, Europe 50, North America 46, dan Asia 44 (total 199).</w:t>
+        <w:t xml:space="preserve">Gambar 4.1 memperlihatkan pendapatan bulanan sepanjang 2024. Pendapatan mencapai puncak pada Juli (sekitar 71 ribu) dan September (sekitar 70 ribu), serta terendah pada November (sekitar 38 ribu). Pola ini menunjukkan adanya musiman dalam penjualan.</w:t>
       </w:r>
     </w:p>
     <w:p>
@@ -4348,7 +4360,7 @@
       <w:r>
         <w:drawing>
           <wp:inline distT="0" distB="0" distL="0" distR="0">
-            <wp:extent cx="3619500" cy="2790825"/>
+            <wp:extent cx="4095750" cy="3009900"/>
             <wp:effectExtent t="0" r="0" b="0" l="0"/>
             <wp:docPr id="1" name="" descr="" title=""/>
             <wp:cNvGraphicFramePr>
@@ -4373,7 +4385,7 @@
                   <pic:spPr bwMode="auto">
                     <a:xfrm>
                       <a:off x="0" y="0"/>
-                      <a:ext cx="3619500" cy="2790825"/>
+                      <a:ext cx="4095750" cy="3009900"/>
                     </a:xfrm>
                     <a:prstGeom prst="rect">
                       <a:avLst/>
@@ -4399,7 +4411,7 @@
           <w:sz w:val="21"/>
           <w:szCs w:val="21"/>
         </w:rPr>
-        <w:t xml:space="preserve">Gambar 4.5 Pendapatan per pelanggan menurut wilayah (Revenue per Customer by Region)</w:t>
+        <w:t xml:space="preserve">Gambar 4.2 Penjualan per produk (Total Sales by Product)</w:t>
       </w:r>
     </w:p>
     <w:p>
@@ -4411,19 +4423,7 @@
         <w:rPr>
           <w:rFonts w:ascii="Times New Roman" w:cs="Times New Roman" w:eastAsia="Times New Roman" w:hAnsi="Times New Roman"/>
         </w:rPr>
-        <w:t xml:space="preserve">Gambar 4.5 memperlihatkan rata-rata pendapatan per pelanggan aktif. South America tertinggi (3.717,84), disusul Asia (3.456,25), Europe (3.325,09), dan North America (3.311,16). Asia memiliki pelanggan paling sedikit, tetapi nilai per pelanggannya melampaui Europe dan North America.</w:t>
-      </w:r>
-    </w:p>
-    <w:p>
-      <w:pPr>
-        <w:pStyle w:val="Heading2"/>
-        <w:spacing w:after="100" w:before="200"/>
-      </w:pPr>
-      <w:r>
-        <w:rPr>
-          <w:rFonts w:ascii="Times New Roman" w:cs="Times New Roman" w:eastAsia="Times New Roman" w:hAnsi="Times New Roman"/>
-        </w:rPr>
-        <w:t xml:space="preserve">4.1.3 KPI Summary</w:t>
+        <w:t xml:space="preserve">Gambar 4.2 menyajikan penjualan per nama produk dari yang tertinggi. ActiveWear Smartwatch memimpin dengan sekitar 39 ribu, disusul SoundWave Headphones dan SoundWave Novel. Pengelompokan memakai nama produk sehingga satu nama dapat mewakili beberapa ProductID.</w:t>
       </w:r>
     </w:p>
     <w:p>
@@ -4434,7 +4434,7 @@
       <w:r>
         <w:drawing>
           <wp:inline distT="0" distB="0" distL="0" distR="0">
-            <wp:extent cx="5334000" cy="742950"/>
+            <wp:extent cx="3810000" cy="2781300"/>
             <wp:effectExtent t="0" r="0" b="0" l="0"/>
             <wp:docPr id="1" name="" descr="" title=""/>
             <wp:cNvGraphicFramePr>
@@ -4459,7 +4459,7 @@
                   <pic:spPr bwMode="auto">
                     <a:xfrm>
                       <a:off x="0" y="0"/>
-                      <a:ext cx="5334000" cy="742950"/>
+                      <a:ext cx="3810000" cy="2781300"/>
                     </a:xfrm>
                     <a:prstGeom prst="rect">
                       <a:avLst/>
@@ -4485,7 +4485,31 @@
           <w:sz w:val="21"/>
           <w:szCs w:val="21"/>
         </w:rPr>
-        <w:t xml:space="preserve">Gambar 4.6 Kartu KPI pada halaman Laporan Ringkasan KPI</w:t>
+        <w:t xml:space="preserve">Gambar 4.3 Kontribusi per kategori (Total Sales by Category)</w:t>
+      </w:r>
+    </w:p>
+    <w:p>
+      <w:pPr>
+        <w:spacing w:after="120" w:line="300"/>
+        <w:jc w:val="both"/>
+      </w:pPr>
+      <w:r>
+        <w:rPr>
+          <w:rFonts w:ascii="Times New Roman" w:cs="Times New Roman" w:eastAsia="Times New Roman" w:hAnsi="Times New Roman"/>
+        </w:rPr>
+        <w:t xml:space="preserve">Gambar 4.3 menunjukkan kontribusi tiap kategori: Books 27,85%, Electronics 26,20%, Clothing 24,08%, dan Home Decor 21,87%. Books dan Electronics bersama-sama menyumbang sekitar 54% pendapatan.</w:t>
+      </w:r>
+    </w:p>
+    <w:p>
+      <w:pPr>
+        <w:pStyle w:val="Heading2"/>
+        <w:spacing w:after="100" w:before="200"/>
+      </w:pPr>
+      <w:r>
+        <w:rPr>
+          <w:rFonts w:ascii="Times New Roman" w:cs="Times New Roman" w:eastAsia="Times New Roman" w:hAnsi="Times New Roman"/>
+        </w:rPr>
+        <w:t xml:space="preserve">4.1.2 Customer Behavior Report</w:t>
       </w:r>
     </w:p>
     <w:p>
@@ -4496,7 +4520,7 @@
       <w:r>
         <w:drawing>
           <wp:inline distT="0" distB="0" distL="0" distR="0">
-            <wp:extent cx="3810000" cy="1676400"/>
+            <wp:extent cx="5334000" cy="2952750"/>
             <wp:effectExtent t="0" r="0" b="0" l="0"/>
             <wp:docPr id="1" name="" descr="" title=""/>
             <wp:cNvGraphicFramePr>
@@ -4521,7 +4545,7 @@
                   <pic:spPr bwMode="auto">
                     <a:xfrm>
                       <a:off x="0" y="0"/>
-                      <a:ext cx="3810000" cy="1676400"/>
+                      <a:ext cx="5334000" cy="2952750"/>
                     </a:xfrm>
                     <a:prstGeom prst="rect">
                       <a:avLst/>
@@ -4547,7 +4571,19 @@
           <w:sz w:val="21"/>
           <w:szCs w:val="21"/>
         </w:rPr>
-        <w:t xml:space="preserve">Gambar 4.7 Tabel perbandingan wilayah</w:t>
+        <w:t xml:space="preserve">Gambar 4.4 Halaman Laporan Perilaku Pelanggan</w:t>
+      </w:r>
+    </w:p>
+    <w:p>
+      <w:pPr>
+        <w:spacing w:after="120" w:line="300"/>
+        <w:jc w:val="both"/>
+      </w:pPr>
+      <w:r>
+        <w:rPr>
+          <w:rFonts w:ascii="Times New Roman" w:cs="Times New Roman" w:eastAsia="Times New Roman" w:hAnsi="Times New Roman"/>
+        </w:rPr>
+        <w:t xml:space="preserve">Gambar 4.4 menampilkan halaman perilaku pelanggan yang memuat dua grafik menurut wilayah serta slicer Region dan waktu (tahun, kuartal, bulan, dan quantity). Grafik kiri menunjukkan pendapatan per pelanggan, dan grafik kanan menunjukkan jumlah pelanggan aktif, yaitu South America 59, Europe 50, North America 46, dan Asia 44 (total 199).</w:t>
       </w:r>
     </w:p>
     <w:p>
@@ -4558,7 +4594,7 @@
       <w:r>
         <w:drawing>
           <wp:inline distT="0" distB="0" distL="0" distR="0">
-            <wp:extent cx="4953000" cy="1390650"/>
+            <wp:extent cx="3619500" cy="2790825"/>
             <wp:effectExtent t="0" r="0" b="0" l="0"/>
             <wp:docPr id="1" name="" descr="" title=""/>
             <wp:cNvGraphicFramePr>
@@ -4583,7 +4619,7 @@
                   <pic:spPr bwMode="auto">
                     <a:xfrm>
                       <a:off x="0" y="0"/>
-                      <a:ext cx="4953000" cy="1390650"/>
+                      <a:ext cx="3619500" cy="2790825"/>
                     </a:xfrm>
                     <a:prstGeom prst="rect">
                       <a:avLst/>
@@ -4609,7 +4645,31 @@
           <w:sz w:val="21"/>
           <w:szCs w:val="21"/>
         </w:rPr>
-        <w:t xml:space="preserve">Gambar 4.8 Grafik garis Total Revenue by Month</w:t>
+        <w:t xml:space="preserve">Gambar 4.5 Pendapatan per pelanggan menurut wilayah (Revenue per Customer by Region)</w:t>
+      </w:r>
+    </w:p>
+    <w:p>
+      <w:pPr>
+        <w:spacing w:after="120" w:line="300"/>
+        <w:jc w:val="both"/>
+      </w:pPr>
+      <w:r>
+        <w:rPr>
+          <w:rFonts w:ascii="Times New Roman" w:cs="Times New Roman" w:eastAsia="Times New Roman" w:hAnsi="Times New Roman"/>
+        </w:rPr>
+        <w:t xml:space="preserve">Gambar 4.5 memperlihatkan rata-rata pendapatan per pelanggan aktif. South America tertinggi (3.717,84), disusul Asia (3.456,25), Europe (3.325,09), dan North America (3.311,16). Asia memiliki pelanggan paling sedikit, tetapi nilai per pelanggannya melampaui Europe dan North America.</w:t>
+      </w:r>
+    </w:p>
+    <w:p>
+      <w:pPr>
+        <w:pStyle w:val="Heading2"/>
+        <w:spacing w:after="100" w:before="200"/>
+      </w:pPr>
+      <w:r>
+        <w:rPr>
+          <w:rFonts w:ascii="Times New Roman" w:cs="Times New Roman" w:eastAsia="Times New Roman" w:hAnsi="Times New Roman"/>
+        </w:rPr>
+        <w:t xml:space="preserve">4.1.3 KPI Summary</w:t>
       </w:r>
     </w:p>
     <w:p>
@@ -4620,69 +4680,7 @@
       <w:r>
         <w:drawing>
           <wp:inline distT="0" distB="0" distL="0" distR="0">
-            <wp:extent cx="2857500" cy="2085975"/>
-            <wp:effectExtent t="0" r="0" b="0" l="0"/>
-            <wp:docPr id="1" name="" descr="" title=""/>
-            <wp:cNvGraphicFramePr>
-              <a:graphicFrameLocks xmlns:a="http://schemas.openxmlformats.org/drawingml/2006/main" noChangeAspect="1"/>
-            </wp:cNvGraphicFramePr>
-            <a:graphic xmlns:a="http://schemas.openxmlformats.org/drawingml/2006/main">
-              <a:graphicData uri="http://schemas.openxmlformats.org/drawingml/2006/picture">
-                <pic:pic xmlns:pic="http://schemas.openxmlformats.org/drawingml/2006/picture">
-                  <pic:nvPicPr>
-                    <pic:cNvPr id="0" name="" descr=""/>
-                    <pic:cNvPicPr>
-                      <a:picLocks noChangeAspect="1" noChangeArrowheads="1"/>
-                    </pic:cNvPicPr>
-                  </pic:nvPicPr>
-                  <pic:blipFill>
-                    <a:blip r:embed="rId14" cstate="none"/>
-                    <a:srcRect/>
-                    <a:stretch>
-                      <a:fillRect/>
-                    </a:stretch>
-                  </pic:blipFill>
-                  <pic:spPr bwMode="auto">
-                    <a:xfrm>
-                      <a:off x="0" y="0"/>
-                      <a:ext cx="2857500" cy="2085975"/>
-                    </a:xfrm>
-                    <a:prstGeom prst="rect">
-                      <a:avLst/>
-                    </a:prstGeom>
-                  </pic:spPr>
-                </pic:pic>
-              </a:graphicData>
-            </a:graphic>
-          </wp:inline>
-        </w:drawing>
-      </w:r>
-    </w:p>
-    <w:p>
-      <w:pPr>
-        <w:spacing w:after="160"/>
-        <w:jc w:val="center"/>
-      </w:pPr>
-      <w:r>
-        <w:rPr>
-          <w:rFonts w:ascii="Times New Roman" w:cs="Times New Roman" w:eastAsia="Times New Roman" w:hAnsi="Times New Roman"/>
-          <w:i/>
-          <w:iCs/>
-          <w:sz w:val="21"/>
-          <w:szCs w:val="21"/>
-        </w:rPr>
-        <w:t xml:space="preserve">Gambar 4.9 Grafik batang Total Revenue by Category</w:t>
-      </w:r>
-    </w:p>
-    <w:p>
-      <w:pPr>
-        <w:spacing w:after="60" w:before="100"/>
-        <w:jc w:val="center"/>
-      </w:pPr>
-      <w:r>
-        <w:drawing>
-          <wp:inline distT="0" distB="0" distL="0" distR="0">
-            <wp:extent cx="1619250" cy="781050"/>
+            <wp:extent cx="5334000" cy="742950"/>
             <wp:effectExtent t="0" r="0" b="0" l="0"/>
             <wp:docPr id="1" name="" descr="" title=""/>
             <wp:cNvGraphicFramePr>
@@ -4707,7 +4705,7 @@
                   <pic:spPr bwMode="auto">
                     <a:xfrm>
                       <a:off x="0" y="0"/>
-                      <a:ext cx="1619250" cy="781050"/>
+                      <a:ext cx="5334000" cy="742950"/>
                     </a:xfrm>
                     <a:prstGeom prst="rect">
                       <a:avLst/>
@@ -4733,7 +4731,7 @@
           <w:sz w:val="21"/>
           <w:szCs w:val="21"/>
         </w:rPr>
-        <w:t xml:space="preserve">Gambar 4.10 Slicer Region</w:t>
+        <w:t xml:space="preserve">Gambar 4.6 Kartu KPI pada halaman Laporan Ringkasan KPI</w:t>
       </w:r>
     </w:p>
     <w:p>
@@ -4744,7 +4742,7 @@
       <w:r>
         <w:drawing>
           <wp:inline distT="0" distB="0" distL="0" distR="0">
-            <wp:extent cx="1619250" cy="762000"/>
+            <wp:extent cx="3810000" cy="1676400"/>
             <wp:effectExtent t="0" r="0" b="0" l="0"/>
             <wp:docPr id="1" name="" descr="" title=""/>
             <wp:cNvGraphicFramePr>
@@ -4769,7 +4767,7 @@
                   <pic:spPr bwMode="auto">
                     <a:xfrm>
                       <a:off x="0" y="0"/>
-                      <a:ext cx="1619250" cy="762000"/>
+                      <a:ext cx="3810000" cy="1676400"/>
                     </a:xfrm>
                     <a:prstGeom prst="rect">
                       <a:avLst/>
@@ -4795,43 +4793,7 @@
           <w:sz w:val="21"/>
           <w:szCs w:val="21"/>
         </w:rPr>
-        <w:t xml:space="preserve">Gambar 4.11 Slicer Year</w:t>
-      </w:r>
-    </w:p>
-    <w:p>
-      <w:pPr>
-        <w:spacing w:after="120" w:line="300"/>
-        <w:jc w:val="both"/>
-      </w:pPr>
-      <w:r>
-        <w:rPr>
-          <w:rFonts w:ascii="Times New Roman" w:cs="Times New Roman" w:eastAsia="Times New Roman" w:hAnsi="Times New Roman"/>
-        </w:rPr>
-        <w:t xml:space="preserve">Gambar 4.6 sampai 4.10 menampilkan komponen halaman ringkasan kinerja dalam satu halaman. Empat kartu menyajikan Total Revenue (689.995,56), Total Transactions (1.000), Total Unique Customers (199), dan Avg Order Value (690,00). Tabel (Gambar 4.7) menyajikan perbandingan antar wilayah dengan Revenue per Customer, Total Revenue, dan Revenue Share %, sedangkan grafik garis (Gambar 4.8) menunjukkan tren bulanan. Slicer Region dan Year (Gambar 4.10 dan 4.10) memungkinkan pengguna menyaring seluruh visual. Seluruh angka dihasilkan oleh measure DAX.</w:t>
-      </w:r>
-    </w:p>
-    <w:p>
-      <w:pPr>
-        <w:pStyle w:val="Heading2"/>
-        <w:spacing w:after="100" w:before="200"/>
-      </w:pPr>
-      <w:r>
-        <w:rPr>
-          <w:rFonts w:ascii="Times New Roman" w:cs="Times New Roman" w:eastAsia="Times New Roman" w:hAnsi="Times New Roman"/>
-        </w:rPr>
-        <w:t xml:space="preserve">4.1.4 Interaktivitas Dashboard</w:t>
-      </w:r>
-    </w:p>
-    <w:p>
-      <w:pPr>
-        <w:spacing w:after="120" w:line="300"/>
-        <w:jc w:val="both"/>
-      </w:pPr>
-      <w:r>
-        <w:rPr>
-          <w:rFonts w:ascii="Times New Roman" w:cs="Times New Roman" w:eastAsia="Times New Roman" w:hAnsi="Times New Roman"/>
-        </w:rPr>
-        <w:t xml:space="preserve">Slicer memungkinkan pengguna menyaring seluruh visual secara serentak. Perhitungan pada measure DAX diperbarui menurut konteks filter yang dipilih.</w:t>
+        <w:t xml:space="preserve">Gambar 4.7 Tabel perbandingan wilayah</w:t>
       </w:r>
     </w:p>
     <w:p>
@@ -4842,7 +4804,7 @@
       <w:r>
         <w:drawing>
           <wp:inline distT="0" distB="0" distL="0" distR="0">
-            <wp:extent cx="5143500" cy="2876550"/>
+            <wp:extent cx="4953000" cy="1390650"/>
             <wp:effectExtent t="0" r="0" b="0" l="0"/>
             <wp:docPr id="1" name="" descr="" title=""/>
             <wp:cNvGraphicFramePr>
@@ -4867,6 +4829,290 @@
                   <pic:spPr bwMode="auto">
                     <a:xfrm>
                       <a:off x="0" y="0"/>
+                      <a:ext cx="4953000" cy="1390650"/>
+                    </a:xfrm>
+                    <a:prstGeom prst="rect">
+                      <a:avLst/>
+                    </a:prstGeom>
+                  </pic:spPr>
+                </pic:pic>
+              </a:graphicData>
+            </a:graphic>
+          </wp:inline>
+        </w:drawing>
+      </w:r>
+    </w:p>
+    <w:p>
+      <w:pPr>
+        <w:spacing w:after="160"/>
+        <w:jc w:val="center"/>
+      </w:pPr>
+      <w:r>
+        <w:rPr>
+          <w:rFonts w:ascii="Times New Roman" w:cs="Times New Roman" w:eastAsia="Times New Roman" w:hAnsi="Times New Roman"/>
+          <w:i/>
+          <w:iCs/>
+          <w:sz w:val="21"/>
+          <w:szCs w:val="21"/>
+        </w:rPr>
+        <w:t xml:space="preserve">Gambar 4.8 Grafik garis Total Revenue by Month</w:t>
+      </w:r>
+    </w:p>
+    <w:p>
+      <w:pPr>
+        <w:spacing w:after="60" w:before="100"/>
+        <w:jc w:val="center"/>
+      </w:pPr>
+      <w:r>
+        <w:drawing>
+          <wp:inline distT="0" distB="0" distL="0" distR="0">
+            <wp:extent cx="2857500" cy="2085975"/>
+            <wp:effectExtent t="0" r="0" b="0" l="0"/>
+            <wp:docPr id="1" name="" descr="" title=""/>
+            <wp:cNvGraphicFramePr>
+              <a:graphicFrameLocks xmlns:a="http://schemas.openxmlformats.org/drawingml/2006/main" noChangeAspect="1"/>
+            </wp:cNvGraphicFramePr>
+            <a:graphic xmlns:a="http://schemas.openxmlformats.org/drawingml/2006/main">
+              <a:graphicData uri="http://schemas.openxmlformats.org/drawingml/2006/picture">
+                <pic:pic xmlns:pic="http://schemas.openxmlformats.org/drawingml/2006/picture">
+                  <pic:nvPicPr>
+                    <pic:cNvPr id="0" name="" descr=""/>
+                    <pic:cNvPicPr>
+                      <a:picLocks noChangeAspect="1" noChangeArrowheads="1"/>
+                    </pic:cNvPicPr>
+                  </pic:nvPicPr>
+                  <pic:blipFill>
+                    <a:blip r:embed="rId17" cstate="none"/>
+                    <a:srcRect/>
+                    <a:stretch>
+                      <a:fillRect/>
+                    </a:stretch>
+                  </pic:blipFill>
+                  <pic:spPr bwMode="auto">
+                    <a:xfrm>
+                      <a:off x="0" y="0"/>
+                      <a:ext cx="2857500" cy="2085975"/>
+                    </a:xfrm>
+                    <a:prstGeom prst="rect">
+                      <a:avLst/>
+                    </a:prstGeom>
+                  </pic:spPr>
+                </pic:pic>
+              </a:graphicData>
+            </a:graphic>
+          </wp:inline>
+        </w:drawing>
+      </w:r>
+    </w:p>
+    <w:p>
+      <w:pPr>
+        <w:spacing w:after="160"/>
+        <w:jc w:val="center"/>
+      </w:pPr>
+      <w:r>
+        <w:rPr>
+          <w:rFonts w:ascii="Times New Roman" w:cs="Times New Roman" w:eastAsia="Times New Roman" w:hAnsi="Times New Roman"/>
+          <w:i/>
+          <w:iCs/>
+          <w:sz w:val="21"/>
+          <w:szCs w:val="21"/>
+        </w:rPr>
+        <w:t xml:space="preserve">Gambar 4.9 Grafik batang Total Revenue by Category</w:t>
+      </w:r>
+    </w:p>
+    <w:p>
+      <w:pPr>
+        <w:spacing w:after="60" w:before="100"/>
+        <w:jc w:val="center"/>
+      </w:pPr>
+      <w:r>
+        <w:drawing>
+          <wp:inline distT="0" distB="0" distL="0" distR="0">
+            <wp:extent cx="1619250" cy="781050"/>
+            <wp:effectExtent t="0" r="0" b="0" l="0"/>
+            <wp:docPr id="1" name="" descr="" title=""/>
+            <wp:cNvGraphicFramePr>
+              <a:graphicFrameLocks xmlns:a="http://schemas.openxmlformats.org/drawingml/2006/main" noChangeAspect="1"/>
+            </wp:cNvGraphicFramePr>
+            <a:graphic xmlns:a="http://schemas.openxmlformats.org/drawingml/2006/main">
+              <a:graphicData uri="http://schemas.openxmlformats.org/drawingml/2006/picture">
+                <pic:pic xmlns:pic="http://schemas.openxmlformats.org/drawingml/2006/picture">
+                  <pic:nvPicPr>
+                    <pic:cNvPr id="0" name="" descr=""/>
+                    <pic:cNvPicPr>
+                      <a:picLocks noChangeAspect="1" noChangeArrowheads="1"/>
+                    </pic:cNvPicPr>
+                  </pic:nvPicPr>
+                  <pic:blipFill>
+                    <a:blip r:embed="rId23" cstate="none"/>
+                    <a:srcRect/>
+                    <a:stretch>
+                      <a:fillRect/>
+                    </a:stretch>
+                  </pic:blipFill>
+                  <pic:spPr bwMode="auto">
+                    <a:xfrm>
+                      <a:off x="0" y="0"/>
+                      <a:ext cx="1619250" cy="781050"/>
+                    </a:xfrm>
+                    <a:prstGeom prst="rect">
+                      <a:avLst/>
+                    </a:prstGeom>
+                  </pic:spPr>
+                </pic:pic>
+              </a:graphicData>
+            </a:graphic>
+          </wp:inline>
+        </w:drawing>
+      </w:r>
+    </w:p>
+    <w:p>
+      <w:pPr>
+        <w:spacing w:after="160"/>
+        <w:jc w:val="center"/>
+      </w:pPr>
+      <w:r>
+        <w:rPr>
+          <w:rFonts w:ascii="Times New Roman" w:cs="Times New Roman" w:eastAsia="Times New Roman" w:hAnsi="Times New Roman"/>
+          <w:i/>
+          <w:iCs/>
+          <w:sz w:val="21"/>
+          <w:szCs w:val="21"/>
+        </w:rPr>
+        <w:t xml:space="preserve">Gambar 4.10 Slicer Region</w:t>
+      </w:r>
+    </w:p>
+    <w:p>
+      <w:pPr>
+        <w:spacing w:after="60" w:before="100"/>
+        <w:jc w:val="center"/>
+      </w:pPr>
+      <w:r>
+        <w:drawing>
+          <wp:inline distT="0" distB="0" distL="0" distR="0">
+            <wp:extent cx="1619250" cy="762000"/>
+            <wp:effectExtent t="0" r="0" b="0" l="0"/>
+            <wp:docPr id="1" name="" descr="" title=""/>
+            <wp:cNvGraphicFramePr>
+              <a:graphicFrameLocks xmlns:a="http://schemas.openxmlformats.org/drawingml/2006/main" noChangeAspect="1"/>
+            </wp:cNvGraphicFramePr>
+            <a:graphic xmlns:a="http://schemas.openxmlformats.org/drawingml/2006/main">
+              <a:graphicData uri="http://schemas.openxmlformats.org/drawingml/2006/picture">
+                <pic:pic xmlns:pic="http://schemas.openxmlformats.org/drawingml/2006/picture">
+                  <pic:nvPicPr>
+                    <pic:cNvPr id="0" name="" descr=""/>
+                    <pic:cNvPicPr>
+                      <a:picLocks noChangeAspect="1" noChangeArrowheads="1"/>
+                    </pic:cNvPicPr>
+                  </pic:nvPicPr>
+                  <pic:blipFill>
+                    <a:blip r:embed="rId24" cstate="none"/>
+                    <a:srcRect/>
+                    <a:stretch>
+                      <a:fillRect/>
+                    </a:stretch>
+                  </pic:blipFill>
+                  <pic:spPr bwMode="auto">
+                    <a:xfrm>
+                      <a:off x="0" y="0"/>
+                      <a:ext cx="1619250" cy="762000"/>
+                    </a:xfrm>
+                    <a:prstGeom prst="rect">
+                      <a:avLst/>
+                    </a:prstGeom>
+                  </pic:spPr>
+                </pic:pic>
+              </a:graphicData>
+            </a:graphic>
+          </wp:inline>
+        </w:drawing>
+      </w:r>
+    </w:p>
+    <w:p>
+      <w:pPr>
+        <w:spacing w:after="160"/>
+        <w:jc w:val="center"/>
+      </w:pPr>
+      <w:r>
+        <w:rPr>
+          <w:rFonts w:ascii="Times New Roman" w:cs="Times New Roman" w:eastAsia="Times New Roman" w:hAnsi="Times New Roman"/>
+          <w:i/>
+          <w:iCs/>
+          <w:sz w:val="21"/>
+          <w:szCs w:val="21"/>
+        </w:rPr>
+        <w:t xml:space="preserve">Gambar 4.11 Slicer Year</w:t>
+      </w:r>
+    </w:p>
+    <w:p>
+      <w:pPr>
+        <w:spacing w:after="120" w:line="300"/>
+        <w:jc w:val="both"/>
+      </w:pPr>
+      <w:r>
+        <w:rPr>
+          <w:rFonts w:ascii="Times New Roman" w:cs="Times New Roman" w:eastAsia="Times New Roman" w:hAnsi="Times New Roman"/>
+        </w:rPr>
+        <w:t xml:space="preserve">Gambar 4.6 sampai 4.10 menampilkan komponen halaman ringkasan kinerja dalam satu halaman. Empat kartu menyajikan Total Revenue (689.995,56), Total Transactions (1.000), Total Unique Customers (199), dan Avg Order Value (690,00). Tabel (Gambar 4.7) menyajikan perbandingan antar wilayah dengan Revenue per Customer, Total Revenue, dan Revenue Share %, sedangkan grafik garis (Gambar 4.8) menunjukkan tren bulanan. Slicer Region dan Year (Gambar 4.10 dan 4.10) memungkinkan pengguna menyaring seluruh visual. Seluruh angka dihasilkan oleh measure DAX.</w:t>
+      </w:r>
+    </w:p>
+    <w:p>
+      <w:pPr>
+        <w:pStyle w:val="Heading2"/>
+        <w:spacing w:after="100" w:before="200"/>
+      </w:pPr>
+      <w:r>
+        <w:rPr>
+          <w:rFonts w:ascii="Times New Roman" w:cs="Times New Roman" w:eastAsia="Times New Roman" w:hAnsi="Times New Roman"/>
+        </w:rPr>
+        <w:t xml:space="preserve">4.1.4 Interaktivitas Dashboard</w:t>
+      </w:r>
+    </w:p>
+    <w:p>
+      <w:pPr>
+        <w:spacing w:after="120" w:line="300"/>
+        <w:jc w:val="both"/>
+      </w:pPr>
+      <w:r>
+        <w:rPr>
+          <w:rFonts w:ascii="Times New Roman" w:cs="Times New Roman" w:eastAsia="Times New Roman" w:hAnsi="Times New Roman"/>
+        </w:rPr>
+        <w:t xml:space="preserve">Slicer memungkinkan pengguna menyaring seluruh visual secara serentak. Perhitungan pada measure DAX diperbarui menurut konteks filter yang dipilih.</w:t>
+      </w:r>
+    </w:p>
+    <w:p>
+      <w:pPr>
+        <w:spacing w:after="60" w:before="100"/>
+        <w:jc w:val="center"/>
+      </w:pPr>
+      <w:r>
+        <w:drawing>
+          <wp:inline distT="0" distB="0" distL="0" distR="0">
+            <wp:extent cx="5143500" cy="2876550"/>
+            <wp:effectExtent t="0" r="0" b="0" l="0"/>
+            <wp:docPr id="1" name="" descr="" title=""/>
+            <wp:cNvGraphicFramePr>
+              <a:graphicFrameLocks xmlns:a="http://schemas.openxmlformats.org/drawingml/2006/main" noChangeAspect="1"/>
+            </wp:cNvGraphicFramePr>
+            <a:graphic xmlns:a="http://schemas.openxmlformats.org/drawingml/2006/main">
+              <a:graphicData uri="http://schemas.openxmlformats.org/drawingml/2006/picture">
+                <pic:pic xmlns:pic="http://schemas.openxmlformats.org/drawingml/2006/picture">
+                  <pic:nvPicPr>
+                    <pic:cNvPr id="0" name="" descr=""/>
+                    <pic:cNvPicPr>
+                      <a:picLocks noChangeAspect="1" noChangeArrowheads="1"/>
+                    </pic:cNvPicPr>
+                  </pic:nvPicPr>
+                  <pic:blipFill>
+                    <a:blip r:embed="rId25" cstate="none"/>
+                    <a:srcRect/>
+                    <a:stretch>
+                      <a:fillRect/>
+                    </a:stretch>
+                  </pic:blipFill>
+                  <pic:spPr bwMode="auto">
+                    <a:xfrm>
+                      <a:off x="0" y="0"/>
                       <a:ext cx="5143500" cy="2876550"/>
                     </a:xfrm>
                     <a:prstGeom prst="rect">
@@ -4932,7 +5178,7 @@
                     </pic:cNvPicPr>
                   </pic:nvPicPr>
                   <pic:blipFill>
-                    <a:blip r:embed="rId23" cstate="none"/>
+                    <a:blip r:embed="rId26" cstate="none"/>
                     <a:srcRect/>
                     <a:stretch>
                       <a:fillRect/>

</xml_diff>

<commit_message>
Use Power Query screenshots with Applied Steps for all three tables
Co-Authored-By: Claude Sonnet 5.5 <noreply@anthropic.com>
Claude-Session: https://claude.ai/code/session_017RLvirTSx84UWnroqbbqTM
</commit_message>
<xml_diff>
--- a/output/Laporan_UTS_BDASC_EverMart.docx
+++ b/output/Laporan_UTS_BDASC_EverMart.docx
@@ -3358,7 +3358,7 @@
       <w:r>
         <w:drawing>
           <wp:inline distT="0" distB="0" distL="0" distR="0">
-            <wp:extent cx="5334000" cy="2809875"/>
+            <wp:extent cx="4953000" cy="2419350"/>
             <wp:effectExtent t="0" r="0" b="0" l="0"/>
             <wp:docPr id="1" name="" descr="" title=""/>
             <wp:cNvGraphicFramePr>
@@ -3383,7 +3383,7 @@
                   <pic:spPr bwMode="auto">
                     <a:xfrm>
                       <a:off x="0" y="0"/>
-                      <a:ext cx="5334000" cy="2809875"/>
+                      <a:ext cx="4953000" cy="2419350"/>
                     </a:xfrm>
                     <a:prstGeom prst="rect">
                       <a:avLst/>
@@ -3409,7 +3409,7 @@
           <w:sz w:val="21"/>
           <w:szCs w:val="21"/>
         </w:rPr>
-        <w:t xml:space="preserve">Gambar 3.1 Data awal tabel Transactions pada Power Query</w:t>
+        <w:t xml:space="preserve">Gambar 3.1 Power Query tabel Customers dengan Applied Steps</w:t>
       </w:r>
     </w:p>
     <w:p>
@@ -3421,7 +3421,7 @@
         <w:rPr>
           <w:rFonts w:ascii="Times New Roman" w:cs="Times New Roman" w:eastAsia="Times New Roman" w:hAnsi="Times New Roman"/>
         </w:rPr>
-        <w:t xml:space="preserve">Gambar 3.1 memperlihatkan tabel Transactions pada Power Query Editor beserta profil kualitas tiap kolom. Seluruh kolom bernilai Valid 100%, dengan Error dan Empty 0%. TransactionID memiliki 1.000 nilai unik, CustomerID 199 nilai berbeda, dan ProductID 100 nilai berbeda. Formula pada baris rumus (Table.TransformColumnTypes) merupakan langkah Changed Type yang menetapkan tipe data tiap kolom.</w:t>
+        <w:t xml:space="preserve">Gambar 3.1 menunjukkan tabel Customers (4 kolom, 200 baris). Panel Applied Steps di sisi kanan memuat empat langkah: Source, Navigation, Promoted Headers, dan Changed Type. Profil kolom memperlihatkan Valid 100%, Error 0%, dan Empty 0%. CustomerID dan CustomerName masing-masing memiliki 200 nilai unik, Region memiliki 4 nilai berbeda, dan SignupDate bertipe tanggal.</w:t>
       </w:r>
     </w:p>
     <w:p>
@@ -3432,7 +3432,7 @@
       <w:r>
         <w:drawing>
           <wp:inline distT="0" distB="0" distL="0" distR="0">
-            <wp:extent cx="3810000" cy="3248025"/>
+            <wp:extent cx="4953000" cy="2505075"/>
             <wp:effectExtent t="0" r="0" b="0" l="0"/>
             <wp:docPr id="1" name="" descr="" title=""/>
             <wp:cNvGraphicFramePr>
@@ -3457,7 +3457,7 @@
                   <pic:spPr bwMode="auto">
                     <a:xfrm>
                       <a:off x="0" y="0"/>
-                      <a:ext cx="3810000" cy="3248025"/>
+                      <a:ext cx="4953000" cy="2505075"/>
                     </a:xfrm>
                     <a:prstGeom prst="rect">
                       <a:avLst/>
@@ -3483,7 +3483,7 @@
           <w:sz w:val="21"/>
           <w:szCs w:val="21"/>
         </w:rPr>
-        <w:t xml:space="preserve">Gambar 3.2 Profil kualitas kolom tabel Customers</w:t>
+        <w:t xml:space="preserve">Gambar 3.2 Power Query tabel Products dengan Applied Steps</w:t>
       </w:r>
     </w:p>
     <w:p>
@@ -3495,578 +3495,7 @@
         <w:rPr>
           <w:rFonts w:ascii="Times New Roman" w:cs="Times New Roman" w:eastAsia="Times New Roman" w:hAnsi="Times New Roman"/>
         </w:rPr>
-        <w:t xml:space="preserve">Gambar 3.2 menunjukkan tabel Customers yang berisi 200 pelanggan dengan CustomerID dan CustomerName unik, empat nilai Region, serta SignupDate bertipe tanggal. Tidak ditemukan nilai kosong maupun galat sehingga data siap dianalisis tanpa pembersihan tambahan.</w:t>
-      </w:r>
-    </w:p>
-    <w:p>
-      <w:pPr>
-        <w:pStyle w:val="Heading2"/>
-        <w:spacing w:after="100" w:before="200"/>
-      </w:pPr>
-      <w:r>
-        <w:rPr>
-          <w:rFonts w:ascii="Times New Roman" w:cs="Times New Roman" w:eastAsia="Times New Roman" w:hAnsi="Times New Roman"/>
-        </w:rPr>
-        <w:t xml:space="preserve">3.3 Model Data</w:t>
-      </w:r>
-    </w:p>
-    <w:p>
-      <w:pPr>
-        <w:spacing w:after="120" w:line="300"/>
-        <w:jc w:val="both"/>
-      </w:pPr>
-      <w:r>
-        <w:rPr>
-          <w:rFonts w:ascii="Times New Roman" w:cs="Times New Roman" w:eastAsia="Times New Roman" w:hAnsi="Times New Roman"/>
-        </w:rPr>
-        <w:t xml:space="preserve">Tabel Transactions berelasi banyak-ke-satu dengan Customers melalui CustomerID dan dengan Products melalui ProductID. Relasi ini memungkinkan filter pada dimensi (misalnya Region atau Category) memengaruhi seluruh perhitungan pada tabel fakta.</w:t>
-      </w:r>
-    </w:p>
-    <w:p>
-      <w:pPr>
-        <w:pStyle w:val="Heading2"/>
-        <w:spacing w:after="100" w:before="200"/>
-      </w:pPr>
-      <w:r>
-        <w:rPr>
-          <w:rFonts w:ascii="Times New Roman" w:cs="Times New Roman" w:eastAsia="Times New Roman" w:hAnsi="Times New Roman"/>
-        </w:rPr>
-        <w:t xml:space="preserve">3.4 Penggunaan DAX</w:t>
-      </w:r>
-    </w:p>
-    <w:p>
-      <w:pPr>
-        <w:spacing w:after="80" w:before="100"/>
-        <w:jc w:val="center"/>
-      </w:pPr>
-      <w:r>
-        <w:rPr>
-          <w:rFonts w:ascii="Times New Roman" w:cs="Times New Roman" w:eastAsia="Times New Roman" w:hAnsi="Times New Roman"/>
-          <w:b/>
-          <w:bCs/>
-          <w:sz w:val="22"/>
-          <w:szCs w:val="22"/>
-        </w:rPr>
-        <w:t xml:space="preserve">Tabel 3.1 Measure DAX yang digunakan</w:t>
-      </w:r>
-    </w:p>
-    <w:tbl>
-      <w:tblPr>
-        <w:tblW w:type="dxa" w:w="9360"/>
-        <w:tblBorders>
-          <w:top w:val="single" w:color="auto" w:sz="4"/>
-          <w:left w:val="single" w:color="auto" w:sz="4"/>
-          <w:bottom w:val="single" w:color="auto" w:sz="4"/>
-          <w:right w:val="single" w:color="auto" w:sz="4"/>
-          <w:insideH w:val="single" w:color="auto" w:sz="4"/>
-          <w:insideV w:val="single" w:color="auto" w:sz="4"/>
-        </w:tblBorders>
-      </w:tblPr>
-      <w:tblGrid>
-        <w:gridCol w:w="2700"/>
-        <w:gridCol w:w="6660"/>
-      </w:tblGrid>
-      <w:tr>
-        <w:trPr>
-          <w:tblHeader/>
-        </w:trPr>
-        <w:tc>
-          <w:tcPr>
-            <w:tcW w:type="dxa" w:w="2700"/>
-            <w:tcBorders>
-              <w:top w:val="single" w:color="888888" w:sz="4"/>
-              <w:left w:val="single" w:color="888888" w:sz="4"/>
-              <w:bottom w:val="single" w:color="888888" w:sz="4"/>
-              <w:right w:val="single" w:color="888888" w:sz="4"/>
-            </w:tcBorders>
-            <w:shd w:fill="D9E2F3" w:color="auto" w:val="clear"/>
-            <w:tcMar>
-              <w:top w:type="dxa" w:w="60"/>
-              <w:left w:type="dxa" w:w="100"/>
-              <w:bottom w:type="dxa" w:w="60"/>
-              <w:right w:type="dxa" w:w="100"/>
-            </w:tcMar>
-          </w:tcPr>
-          <w:p>
-            <w:pPr>
-              <w:jc w:val="center"/>
-            </w:pPr>
-            <w:r>
-              <w:rPr>
-                <w:rFonts w:ascii="Times New Roman" w:cs="Times New Roman" w:eastAsia="Times New Roman" w:hAnsi="Times New Roman"/>
-                <w:b/>
-                <w:bCs/>
-                <w:sz w:val="21"/>
-                <w:szCs w:val="21"/>
-              </w:rPr>
-              <w:t xml:space="preserve">Measure</w:t>
-            </w:r>
-          </w:p>
-        </w:tc>
-        <w:tc>
-          <w:tcPr>
-            <w:tcW w:type="dxa" w:w="6660"/>
-            <w:tcBorders>
-              <w:top w:val="single" w:color="888888" w:sz="4"/>
-              <w:left w:val="single" w:color="888888" w:sz="4"/>
-              <w:bottom w:val="single" w:color="888888" w:sz="4"/>
-              <w:right w:val="single" w:color="888888" w:sz="4"/>
-            </w:tcBorders>
-            <w:shd w:fill="D9E2F3" w:color="auto" w:val="clear"/>
-            <w:tcMar>
-              <w:top w:type="dxa" w:w="60"/>
-              <w:left w:type="dxa" w:w="100"/>
-              <w:bottom w:type="dxa" w:w="60"/>
-              <w:right w:type="dxa" w:w="100"/>
-            </w:tcMar>
-          </w:tcPr>
-          <w:p>
-            <w:pPr>
-              <w:jc w:val="center"/>
-            </w:pPr>
-            <w:r>
-              <w:rPr>
-                <w:rFonts w:ascii="Times New Roman" w:cs="Times New Roman" w:eastAsia="Times New Roman" w:hAnsi="Times New Roman"/>
-                <w:b/>
-                <w:bCs/>
-                <w:sz w:val="21"/>
-                <w:szCs w:val="21"/>
-              </w:rPr>
-              <w:t xml:space="preserve">Rumus DAX</w:t>
-            </w:r>
-          </w:p>
-        </w:tc>
-      </w:tr>
-      <w:tr>
-        <w:trPr>
-          <w:tblHeader w:val="false"/>
-        </w:trPr>
-        <w:tc>
-          <w:tcPr>
-            <w:tcW w:type="dxa" w:w="2700"/>
-            <w:tcBorders>
-              <w:top w:val="single" w:color="888888" w:sz="4"/>
-              <w:left w:val="single" w:color="888888" w:sz="4"/>
-              <w:bottom w:val="single" w:color="888888" w:sz="4"/>
-              <w:right w:val="single" w:color="888888" w:sz="4"/>
-            </w:tcBorders>
-            <w:tcMar>
-              <w:top w:type="dxa" w:w="60"/>
-              <w:left w:type="dxa" w:w="100"/>
-              <w:bottom w:type="dxa" w:w="60"/>
-              <w:right w:type="dxa" w:w="100"/>
-            </w:tcMar>
-          </w:tcPr>
-          <w:p>
-            <w:pPr>
-              <w:jc w:val="left"/>
-            </w:pPr>
-            <w:r>
-              <w:rPr>
-                <w:rFonts w:ascii="Times New Roman" w:cs="Times New Roman" w:eastAsia="Times New Roman" w:hAnsi="Times New Roman"/>
-                <w:b w:val="false"/>
-                <w:bCs w:val="false"/>
-                <w:sz w:val="21"/>
-                <w:szCs w:val="21"/>
-              </w:rPr>
-              <w:t xml:space="preserve">Total Revenue</w:t>
-            </w:r>
-          </w:p>
-        </w:tc>
-        <w:tc>
-          <w:tcPr>
-            <w:tcW w:type="dxa" w:w="6660"/>
-            <w:tcBorders>
-              <w:top w:val="single" w:color="888888" w:sz="4"/>
-              <w:left w:val="single" w:color="888888" w:sz="4"/>
-              <w:bottom w:val="single" w:color="888888" w:sz="4"/>
-              <w:right w:val="single" w:color="888888" w:sz="4"/>
-            </w:tcBorders>
-            <w:tcMar>
-              <w:top w:type="dxa" w:w="60"/>
-              <w:left w:type="dxa" w:w="100"/>
-              <w:bottom w:type="dxa" w:w="60"/>
-              <w:right w:type="dxa" w:w="100"/>
-            </w:tcMar>
-          </w:tcPr>
-          <w:p>
-            <w:pPr>
-              <w:jc w:val="left"/>
-            </w:pPr>
-            <w:r>
-              <w:rPr>
-                <w:rFonts w:ascii="Times New Roman" w:cs="Times New Roman" w:eastAsia="Times New Roman" w:hAnsi="Times New Roman"/>
-                <w:b w:val="false"/>
-                <w:bCs w:val="false"/>
-                <w:sz w:val="21"/>
-                <w:szCs w:val="21"/>
-              </w:rPr>
-              <w:t xml:space="preserve">SUM(Transactions[TotalValue])</w:t>
-            </w:r>
-          </w:p>
-        </w:tc>
-      </w:tr>
-      <w:tr>
-        <w:trPr>
-          <w:tblHeader w:val="false"/>
-        </w:trPr>
-        <w:tc>
-          <w:tcPr>
-            <w:tcW w:type="dxa" w:w="2700"/>
-            <w:tcBorders>
-              <w:top w:val="single" w:color="888888" w:sz="4"/>
-              <w:left w:val="single" w:color="888888" w:sz="4"/>
-              <w:bottom w:val="single" w:color="888888" w:sz="4"/>
-              <w:right w:val="single" w:color="888888" w:sz="4"/>
-            </w:tcBorders>
-            <w:tcMar>
-              <w:top w:type="dxa" w:w="60"/>
-              <w:left w:type="dxa" w:w="100"/>
-              <w:bottom w:type="dxa" w:w="60"/>
-              <w:right w:type="dxa" w:w="100"/>
-            </w:tcMar>
-          </w:tcPr>
-          <w:p>
-            <w:pPr>
-              <w:jc w:val="left"/>
-            </w:pPr>
-            <w:r>
-              <w:rPr>
-                <w:rFonts w:ascii="Times New Roman" w:cs="Times New Roman" w:eastAsia="Times New Roman" w:hAnsi="Times New Roman"/>
-                <w:b w:val="false"/>
-                <w:bCs w:val="false"/>
-                <w:sz w:val="21"/>
-                <w:szCs w:val="21"/>
-              </w:rPr>
-              <w:t xml:space="preserve">Total Transactions</w:t>
-            </w:r>
-          </w:p>
-        </w:tc>
-        <w:tc>
-          <w:tcPr>
-            <w:tcW w:type="dxa" w:w="6660"/>
-            <w:tcBorders>
-              <w:top w:val="single" w:color="888888" w:sz="4"/>
-              <w:left w:val="single" w:color="888888" w:sz="4"/>
-              <w:bottom w:val="single" w:color="888888" w:sz="4"/>
-              <w:right w:val="single" w:color="888888" w:sz="4"/>
-            </w:tcBorders>
-            <w:tcMar>
-              <w:top w:type="dxa" w:w="60"/>
-              <w:left w:type="dxa" w:w="100"/>
-              <w:bottom w:type="dxa" w:w="60"/>
-              <w:right w:type="dxa" w:w="100"/>
-            </w:tcMar>
-          </w:tcPr>
-          <w:p>
-            <w:pPr>
-              <w:jc w:val="left"/>
-            </w:pPr>
-            <w:r>
-              <w:rPr>
-                <w:rFonts w:ascii="Times New Roman" w:cs="Times New Roman" w:eastAsia="Times New Roman" w:hAnsi="Times New Roman"/>
-                <w:b w:val="false"/>
-                <w:bCs w:val="false"/>
-                <w:sz w:val="21"/>
-                <w:szCs w:val="21"/>
-              </w:rPr>
-              <w:t xml:space="preserve">DISTINCTCOUNT(Transactions[TransactionID])</w:t>
-            </w:r>
-          </w:p>
-        </w:tc>
-      </w:tr>
-      <w:tr>
-        <w:trPr>
-          <w:tblHeader w:val="false"/>
-        </w:trPr>
-        <w:tc>
-          <w:tcPr>
-            <w:tcW w:type="dxa" w:w="2700"/>
-            <w:tcBorders>
-              <w:top w:val="single" w:color="888888" w:sz="4"/>
-              <w:left w:val="single" w:color="888888" w:sz="4"/>
-              <w:bottom w:val="single" w:color="888888" w:sz="4"/>
-              <w:right w:val="single" w:color="888888" w:sz="4"/>
-            </w:tcBorders>
-            <w:tcMar>
-              <w:top w:type="dxa" w:w="60"/>
-              <w:left w:type="dxa" w:w="100"/>
-              <w:bottom w:type="dxa" w:w="60"/>
-              <w:right w:type="dxa" w:w="100"/>
-            </w:tcMar>
-          </w:tcPr>
-          <w:p>
-            <w:pPr>
-              <w:jc w:val="left"/>
-            </w:pPr>
-            <w:r>
-              <w:rPr>
-                <w:rFonts w:ascii="Times New Roman" w:cs="Times New Roman" w:eastAsia="Times New Roman" w:hAnsi="Times New Roman"/>
-                <w:b w:val="false"/>
-                <w:bCs w:val="false"/>
-                <w:sz w:val="21"/>
-                <w:szCs w:val="21"/>
-              </w:rPr>
-              <w:t xml:space="preserve">Total Unique Customers</w:t>
-            </w:r>
-          </w:p>
-        </w:tc>
-        <w:tc>
-          <w:tcPr>
-            <w:tcW w:type="dxa" w:w="6660"/>
-            <w:tcBorders>
-              <w:top w:val="single" w:color="888888" w:sz="4"/>
-              <w:left w:val="single" w:color="888888" w:sz="4"/>
-              <w:bottom w:val="single" w:color="888888" w:sz="4"/>
-              <w:right w:val="single" w:color="888888" w:sz="4"/>
-            </w:tcBorders>
-            <w:tcMar>
-              <w:top w:type="dxa" w:w="60"/>
-              <w:left w:type="dxa" w:w="100"/>
-              <w:bottom w:type="dxa" w:w="60"/>
-              <w:right w:type="dxa" w:w="100"/>
-            </w:tcMar>
-          </w:tcPr>
-          <w:p>
-            <w:pPr>
-              <w:jc w:val="left"/>
-            </w:pPr>
-            <w:r>
-              <w:rPr>
-                <w:rFonts w:ascii="Times New Roman" w:cs="Times New Roman" w:eastAsia="Times New Roman" w:hAnsi="Times New Roman"/>
-                <w:b w:val="false"/>
-                <w:bCs w:val="false"/>
-                <w:sz w:val="21"/>
-                <w:szCs w:val="21"/>
-              </w:rPr>
-              <w:t xml:space="preserve">DISTINCTCOUNT(Transactions[CustomerID])</w:t>
-            </w:r>
-          </w:p>
-        </w:tc>
-      </w:tr>
-      <w:tr>
-        <w:trPr>
-          <w:tblHeader w:val="false"/>
-        </w:trPr>
-        <w:tc>
-          <w:tcPr>
-            <w:tcW w:type="dxa" w:w="2700"/>
-            <w:tcBorders>
-              <w:top w:val="single" w:color="888888" w:sz="4"/>
-              <w:left w:val="single" w:color="888888" w:sz="4"/>
-              <w:bottom w:val="single" w:color="888888" w:sz="4"/>
-              <w:right w:val="single" w:color="888888" w:sz="4"/>
-            </w:tcBorders>
-            <w:tcMar>
-              <w:top w:type="dxa" w:w="60"/>
-              <w:left w:type="dxa" w:w="100"/>
-              <w:bottom w:type="dxa" w:w="60"/>
-              <w:right w:type="dxa" w:w="100"/>
-            </w:tcMar>
-          </w:tcPr>
-          <w:p>
-            <w:pPr>
-              <w:jc w:val="left"/>
-            </w:pPr>
-            <w:r>
-              <w:rPr>
-                <w:rFonts w:ascii="Times New Roman" w:cs="Times New Roman" w:eastAsia="Times New Roman" w:hAnsi="Times New Roman"/>
-                <w:b w:val="false"/>
-                <w:bCs w:val="false"/>
-                <w:sz w:val="21"/>
-                <w:szCs w:val="21"/>
-              </w:rPr>
-              <w:t xml:space="preserve">Avg Order Value</w:t>
-            </w:r>
-          </w:p>
-        </w:tc>
-        <w:tc>
-          <w:tcPr>
-            <w:tcW w:type="dxa" w:w="6660"/>
-            <w:tcBorders>
-              <w:top w:val="single" w:color="888888" w:sz="4"/>
-              <w:left w:val="single" w:color="888888" w:sz="4"/>
-              <w:bottom w:val="single" w:color="888888" w:sz="4"/>
-              <w:right w:val="single" w:color="888888" w:sz="4"/>
-            </w:tcBorders>
-            <w:tcMar>
-              <w:top w:type="dxa" w:w="60"/>
-              <w:left w:type="dxa" w:w="100"/>
-              <w:bottom w:type="dxa" w:w="60"/>
-              <w:right w:type="dxa" w:w="100"/>
-            </w:tcMar>
-          </w:tcPr>
-          <w:p>
-            <w:pPr>
-              <w:jc w:val="left"/>
-            </w:pPr>
-            <w:r>
-              <w:rPr>
-                <w:rFonts w:ascii="Times New Roman" w:cs="Times New Roman" w:eastAsia="Times New Roman" w:hAnsi="Times New Roman"/>
-                <w:b w:val="false"/>
-                <w:bCs w:val="false"/>
-                <w:sz w:val="21"/>
-                <w:szCs w:val="21"/>
-              </w:rPr>
-              <w:t xml:space="preserve">DIVIDE([Total Revenue], [Total Transactions])</w:t>
-            </w:r>
-          </w:p>
-        </w:tc>
-      </w:tr>
-      <w:tr>
-        <w:trPr>
-          <w:tblHeader w:val="false"/>
-        </w:trPr>
-        <w:tc>
-          <w:tcPr>
-            <w:tcW w:type="dxa" w:w="2700"/>
-            <w:tcBorders>
-              <w:top w:val="single" w:color="888888" w:sz="4"/>
-              <w:left w:val="single" w:color="888888" w:sz="4"/>
-              <w:bottom w:val="single" w:color="888888" w:sz="4"/>
-              <w:right w:val="single" w:color="888888" w:sz="4"/>
-            </w:tcBorders>
-            <w:tcMar>
-              <w:top w:type="dxa" w:w="60"/>
-              <w:left w:type="dxa" w:w="100"/>
-              <w:bottom w:type="dxa" w:w="60"/>
-              <w:right w:type="dxa" w:w="100"/>
-            </w:tcMar>
-          </w:tcPr>
-          <w:p>
-            <w:pPr>
-              <w:jc w:val="left"/>
-            </w:pPr>
-            <w:r>
-              <w:rPr>
-                <w:rFonts w:ascii="Times New Roman" w:cs="Times New Roman" w:eastAsia="Times New Roman" w:hAnsi="Times New Roman"/>
-                <w:b w:val="false"/>
-                <w:bCs w:val="false"/>
-                <w:sz w:val="21"/>
-                <w:szCs w:val="21"/>
-              </w:rPr>
-              <w:t xml:space="preserve">Revenue per Customer</w:t>
-            </w:r>
-          </w:p>
-        </w:tc>
-        <w:tc>
-          <w:tcPr>
-            <w:tcW w:type="dxa" w:w="6660"/>
-            <w:tcBorders>
-              <w:top w:val="single" w:color="888888" w:sz="4"/>
-              <w:left w:val="single" w:color="888888" w:sz="4"/>
-              <w:bottom w:val="single" w:color="888888" w:sz="4"/>
-              <w:right w:val="single" w:color="888888" w:sz="4"/>
-            </w:tcBorders>
-            <w:tcMar>
-              <w:top w:type="dxa" w:w="60"/>
-              <w:left w:type="dxa" w:w="100"/>
-              <w:bottom w:type="dxa" w:w="60"/>
-              <w:right w:type="dxa" w:w="100"/>
-            </w:tcMar>
-          </w:tcPr>
-          <w:p>
-            <w:pPr>
-              <w:jc w:val="left"/>
-            </w:pPr>
-            <w:r>
-              <w:rPr>
-                <w:rFonts w:ascii="Times New Roman" w:cs="Times New Roman" w:eastAsia="Times New Roman" w:hAnsi="Times New Roman"/>
-                <w:b w:val="false"/>
-                <w:bCs w:val="false"/>
-                <w:sz w:val="21"/>
-                <w:szCs w:val="21"/>
-              </w:rPr>
-              <w:t xml:space="preserve">DIVIDE([Total Revenue], [Total Unique Customers])</w:t>
-            </w:r>
-          </w:p>
-        </w:tc>
-      </w:tr>
-      <w:tr>
-        <w:trPr>
-          <w:tblHeader w:val="false"/>
-        </w:trPr>
-        <w:tc>
-          <w:tcPr>
-            <w:tcW w:type="dxa" w:w="2700"/>
-            <w:tcBorders>
-              <w:top w:val="single" w:color="888888" w:sz="4"/>
-              <w:left w:val="single" w:color="888888" w:sz="4"/>
-              <w:bottom w:val="single" w:color="888888" w:sz="4"/>
-              <w:right w:val="single" w:color="888888" w:sz="4"/>
-            </w:tcBorders>
-            <w:tcMar>
-              <w:top w:type="dxa" w:w="60"/>
-              <w:left w:type="dxa" w:w="100"/>
-              <w:bottom w:type="dxa" w:w="60"/>
-              <w:right w:type="dxa" w:w="100"/>
-            </w:tcMar>
-          </w:tcPr>
-          <w:p>
-            <w:pPr>
-              <w:jc w:val="left"/>
-            </w:pPr>
-            <w:r>
-              <w:rPr>
-                <w:rFonts w:ascii="Times New Roman" w:cs="Times New Roman" w:eastAsia="Times New Roman" w:hAnsi="Times New Roman"/>
-                <w:b w:val="false"/>
-                <w:bCs w:val="false"/>
-                <w:sz w:val="21"/>
-                <w:szCs w:val="21"/>
-              </w:rPr>
-              <w:t xml:space="preserve">Revenue Share %</w:t>
-            </w:r>
-          </w:p>
-        </w:tc>
-        <w:tc>
-          <w:tcPr>
-            <w:tcW w:type="dxa" w:w="6660"/>
-            <w:tcBorders>
-              <w:top w:val="single" w:color="888888" w:sz="4"/>
-              <w:left w:val="single" w:color="888888" w:sz="4"/>
-              <w:bottom w:val="single" w:color="888888" w:sz="4"/>
-              <w:right w:val="single" w:color="888888" w:sz="4"/>
-            </w:tcBorders>
-            <w:tcMar>
-              <w:top w:type="dxa" w:w="60"/>
-              <w:left w:type="dxa" w:w="100"/>
-              <w:bottom w:type="dxa" w:w="60"/>
-              <w:right w:type="dxa" w:w="100"/>
-            </w:tcMar>
-          </w:tcPr>
-          <w:p>
-            <w:pPr>
-              <w:jc w:val="left"/>
-            </w:pPr>
-            <w:r>
-              <w:rPr>
-                <w:rFonts w:ascii="Times New Roman" w:cs="Times New Roman" w:eastAsia="Times New Roman" w:hAnsi="Times New Roman"/>
-                <w:b w:val="false"/>
-                <w:bCs w:val="false"/>
-                <w:sz w:val="21"/>
-                <w:szCs w:val="21"/>
-              </w:rPr>
-              <w:t xml:space="preserve">DIVIDE([Total Revenue], CALCULATE([Total Revenue], ALL(Customers[Region])))</w:t>
-            </w:r>
-          </w:p>
-        </w:tc>
-      </w:tr>
-    </w:tbl>
-    <w:p>
-      <w:pPr>
-        <w:spacing w:after="100"/>
-      </w:pPr>
-    </w:p>
-    <w:p>
-      <w:pPr>
-        <w:spacing w:after="120" w:line="300"/>
-        <w:jc w:val="both"/>
-      </w:pPr>
-      <w:r>
-        <w:rPr>
-          <w:rFonts w:ascii="Times New Roman" w:cs="Times New Roman" w:eastAsia="Times New Roman" w:hAnsi="Times New Roman"/>
-        </w:rPr>
-        <w:t xml:space="preserve">Measure dihitung secara dinamis mengikuti konteks filter, berbeda dengan kolom hitungan yang dievaluasi per baris saat data dimuat.</w:t>
+        <w:t xml:space="preserve">Gambar 3.2 menunjukkan tabel Products (4 kolom, 100 baris) dengan empat langkah yang sama. ProductID memiliki 100 nilai unik, ProductName 66 nilai berbeda (41 unik) sehingga sebagian nama produk berulang, Category 4 nilai berbeda, dan Price bertipe desimal dengan 100 nilai berbeda. Tidak ada nilai kosong maupun galat.</w:t>
       </w:r>
     </w:p>
     <w:p>
@@ -4077,7 +3506,7 @@
       <w:r>
         <w:drawing>
           <wp:inline distT="0" distB="0" distL="0" distR="0">
-            <wp:extent cx="5334000" cy="885825"/>
+            <wp:extent cx="4953000" cy="2562225"/>
             <wp:effectExtent t="0" r="0" b="0" l="0"/>
             <wp:docPr id="1" name="" descr="" title=""/>
             <wp:cNvGraphicFramePr>
@@ -4102,7 +3531,7 @@
                   <pic:spPr bwMode="auto">
                     <a:xfrm>
                       <a:off x="0" y="0"/>
-                      <a:ext cx="5334000" cy="885825"/>
+                      <a:ext cx="4953000" cy="2562225"/>
                     </a:xfrm>
                     <a:prstGeom prst="rect">
                       <a:avLst/>
@@ -4128,7 +3557,7 @@
           <w:sz w:val="21"/>
           <w:szCs w:val="21"/>
         </w:rPr>
-        <w:t xml:space="preserve">Gambar 3.3 Measure Total Revenue pada Power BI</w:t>
+        <w:t xml:space="preserve">Gambar 3.3 Power Query tabel Transactions dengan Applied Steps</w:t>
       </w:r>
     </w:p>
     <w:p>
@@ -4140,7 +3569,578 @@
         <w:rPr>
           <w:rFonts w:ascii="Times New Roman" w:cs="Times New Roman" w:eastAsia="Times New Roman" w:hAnsi="Times New Roman"/>
         </w:rPr>
-        <w:t xml:space="preserve">Gambar 3.3 menampilkan measure Total Revenue yang menjumlahkan kolom TotalValue. Measure ini menjadi dasar bagi measure lain, seperti Avg Order Value dan Revenue per Customer.</w:t>
+        <w:t xml:space="preserve">Gambar 3.3 menunjukkan tabel Transactions (7 kolom, 1.000 baris). TransactionID dan TransactionDate masing-masing memiliki 1.000 nilai unik, CustomerID 199 nilai berbeda, ProductID 100 nilai berbeda, dan Quantity 4 nilai berbeda (1 sampai 4). Rumus pada baris formula (Table.TransformColumnTypes) merupakan langkah Changed Type yang menetapkan tipe data tiap kolom. Seluruh kolom bernilai Valid 100%, sehingga data siap dianalisis tanpa pembersihan tambahan.</w:t>
+      </w:r>
+    </w:p>
+    <w:p>
+      <w:pPr>
+        <w:pStyle w:val="Heading2"/>
+        <w:spacing w:after="100" w:before="200"/>
+      </w:pPr>
+      <w:r>
+        <w:rPr>
+          <w:rFonts w:ascii="Times New Roman" w:cs="Times New Roman" w:eastAsia="Times New Roman" w:hAnsi="Times New Roman"/>
+        </w:rPr>
+        <w:t xml:space="preserve">3.3 Model Data</w:t>
+      </w:r>
+    </w:p>
+    <w:p>
+      <w:pPr>
+        <w:spacing w:after="120" w:line="300"/>
+        <w:jc w:val="both"/>
+      </w:pPr>
+      <w:r>
+        <w:rPr>
+          <w:rFonts w:ascii="Times New Roman" w:cs="Times New Roman" w:eastAsia="Times New Roman" w:hAnsi="Times New Roman"/>
+        </w:rPr>
+        <w:t xml:space="preserve">Tabel Transactions berelasi banyak-ke-satu dengan Customers melalui CustomerID dan dengan Products melalui ProductID. Relasi ini memungkinkan filter pada dimensi (misalnya Region atau Category) memengaruhi seluruh perhitungan pada tabel fakta.</w:t>
+      </w:r>
+    </w:p>
+    <w:p>
+      <w:pPr>
+        <w:pStyle w:val="Heading2"/>
+        <w:spacing w:after="100" w:before="200"/>
+      </w:pPr>
+      <w:r>
+        <w:rPr>
+          <w:rFonts w:ascii="Times New Roman" w:cs="Times New Roman" w:eastAsia="Times New Roman" w:hAnsi="Times New Roman"/>
+        </w:rPr>
+        <w:t xml:space="preserve">3.4 Penggunaan DAX</w:t>
+      </w:r>
+    </w:p>
+    <w:p>
+      <w:pPr>
+        <w:spacing w:after="80" w:before="100"/>
+        <w:jc w:val="center"/>
+      </w:pPr>
+      <w:r>
+        <w:rPr>
+          <w:rFonts w:ascii="Times New Roman" w:cs="Times New Roman" w:eastAsia="Times New Roman" w:hAnsi="Times New Roman"/>
+          <w:b/>
+          <w:bCs/>
+          <w:sz w:val="22"/>
+          <w:szCs w:val="22"/>
+        </w:rPr>
+        <w:t xml:space="preserve">Tabel 3.1 Measure DAX yang digunakan</w:t>
+      </w:r>
+    </w:p>
+    <w:tbl>
+      <w:tblPr>
+        <w:tblW w:type="dxa" w:w="9360"/>
+        <w:tblBorders>
+          <w:top w:val="single" w:color="auto" w:sz="4"/>
+          <w:left w:val="single" w:color="auto" w:sz="4"/>
+          <w:bottom w:val="single" w:color="auto" w:sz="4"/>
+          <w:right w:val="single" w:color="auto" w:sz="4"/>
+          <w:insideH w:val="single" w:color="auto" w:sz="4"/>
+          <w:insideV w:val="single" w:color="auto" w:sz="4"/>
+        </w:tblBorders>
+      </w:tblPr>
+      <w:tblGrid>
+        <w:gridCol w:w="2700"/>
+        <w:gridCol w:w="6660"/>
+      </w:tblGrid>
+      <w:tr>
+        <w:trPr>
+          <w:tblHeader/>
+        </w:trPr>
+        <w:tc>
+          <w:tcPr>
+            <w:tcW w:type="dxa" w:w="2700"/>
+            <w:tcBorders>
+              <w:top w:val="single" w:color="888888" w:sz="4"/>
+              <w:left w:val="single" w:color="888888" w:sz="4"/>
+              <w:bottom w:val="single" w:color="888888" w:sz="4"/>
+              <w:right w:val="single" w:color="888888" w:sz="4"/>
+            </w:tcBorders>
+            <w:shd w:fill="D9E2F3" w:color="auto" w:val="clear"/>
+            <w:tcMar>
+              <w:top w:type="dxa" w:w="60"/>
+              <w:left w:type="dxa" w:w="100"/>
+              <w:bottom w:type="dxa" w:w="60"/>
+              <w:right w:type="dxa" w:w="100"/>
+            </w:tcMar>
+          </w:tcPr>
+          <w:p>
+            <w:pPr>
+              <w:jc w:val="center"/>
+            </w:pPr>
+            <w:r>
+              <w:rPr>
+                <w:rFonts w:ascii="Times New Roman" w:cs="Times New Roman" w:eastAsia="Times New Roman" w:hAnsi="Times New Roman"/>
+                <w:b/>
+                <w:bCs/>
+                <w:sz w:val="21"/>
+                <w:szCs w:val="21"/>
+              </w:rPr>
+              <w:t xml:space="preserve">Measure</w:t>
+            </w:r>
+          </w:p>
+        </w:tc>
+        <w:tc>
+          <w:tcPr>
+            <w:tcW w:type="dxa" w:w="6660"/>
+            <w:tcBorders>
+              <w:top w:val="single" w:color="888888" w:sz="4"/>
+              <w:left w:val="single" w:color="888888" w:sz="4"/>
+              <w:bottom w:val="single" w:color="888888" w:sz="4"/>
+              <w:right w:val="single" w:color="888888" w:sz="4"/>
+            </w:tcBorders>
+            <w:shd w:fill="D9E2F3" w:color="auto" w:val="clear"/>
+            <w:tcMar>
+              <w:top w:type="dxa" w:w="60"/>
+              <w:left w:type="dxa" w:w="100"/>
+              <w:bottom w:type="dxa" w:w="60"/>
+              <w:right w:type="dxa" w:w="100"/>
+            </w:tcMar>
+          </w:tcPr>
+          <w:p>
+            <w:pPr>
+              <w:jc w:val="center"/>
+            </w:pPr>
+            <w:r>
+              <w:rPr>
+                <w:rFonts w:ascii="Times New Roman" w:cs="Times New Roman" w:eastAsia="Times New Roman" w:hAnsi="Times New Roman"/>
+                <w:b/>
+                <w:bCs/>
+                <w:sz w:val="21"/>
+                <w:szCs w:val="21"/>
+              </w:rPr>
+              <w:t xml:space="preserve">Rumus DAX</w:t>
+            </w:r>
+          </w:p>
+        </w:tc>
+      </w:tr>
+      <w:tr>
+        <w:trPr>
+          <w:tblHeader w:val="false"/>
+        </w:trPr>
+        <w:tc>
+          <w:tcPr>
+            <w:tcW w:type="dxa" w:w="2700"/>
+            <w:tcBorders>
+              <w:top w:val="single" w:color="888888" w:sz="4"/>
+              <w:left w:val="single" w:color="888888" w:sz="4"/>
+              <w:bottom w:val="single" w:color="888888" w:sz="4"/>
+              <w:right w:val="single" w:color="888888" w:sz="4"/>
+            </w:tcBorders>
+            <w:tcMar>
+              <w:top w:type="dxa" w:w="60"/>
+              <w:left w:type="dxa" w:w="100"/>
+              <w:bottom w:type="dxa" w:w="60"/>
+              <w:right w:type="dxa" w:w="100"/>
+            </w:tcMar>
+          </w:tcPr>
+          <w:p>
+            <w:pPr>
+              <w:jc w:val="left"/>
+            </w:pPr>
+            <w:r>
+              <w:rPr>
+                <w:rFonts w:ascii="Times New Roman" w:cs="Times New Roman" w:eastAsia="Times New Roman" w:hAnsi="Times New Roman"/>
+                <w:b w:val="false"/>
+                <w:bCs w:val="false"/>
+                <w:sz w:val="21"/>
+                <w:szCs w:val="21"/>
+              </w:rPr>
+              <w:t xml:space="preserve">Total Revenue</w:t>
+            </w:r>
+          </w:p>
+        </w:tc>
+        <w:tc>
+          <w:tcPr>
+            <w:tcW w:type="dxa" w:w="6660"/>
+            <w:tcBorders>
+              <w:top w:val="single" w:color="888888" w:sz="4"/>
+              <w:left w:val="single" w:color="888888" w:sz="4"/>
+              <w:bottom w:val="single" w:color="888888" w:sz="4"/>
+              <w:right w:val="single" w:color="888888" w:sz="4"/>
+            </w:tcBorders>
+            <w:tcMar>
+              <w:top w:type="dxa" w:w="60"/>
+              <w:left w:type="dxa" w:w="100"/>
+              <w:bottom w:type="dxa" w:w="60"/>
+              <w:right w:type="dxa" w:w="100"/>
+            </w:tcMar>
+          </w:tcPr>
+          <w:p>
+            <w:pPr>
+              <w:jc w:val="left"/>
+            </w:pPr>
+            <w:r>
+              <w:rPr>
+                <w:rFonts w:ascii="Times New Roman" w:cs="Times New Roman" w:eastAsia="Times New Roman" w:hAnsi="Times New Roman"/>
+                <w:b w:val="false"/>
+                <w:bCs w:val="false"/>
+                <w:sz w:val="21"/>
+                <w:szCs w:val="21"/>
+              </w:rPr>
+              <w:t xml:space="preserve">SUM(Transactions[TotalValue])</w:t>
+            </w:r>
+          </w:p>
+        </w:tc>
+      </w:tr>
+      <w:tr>
+        <w:trPr>
+          <w:tblHeader w:val="false"/>
+        </w:trPr>
+        <w:tc>
+          <w:tcPr>
+            <w:tcW w:type="dxa" w:w="2700"/>
+            <w:tcBorders>
+              <w:top w:val="single" w:color="888888" w:sz="4"/>
+              <w:left w:val="single" w:color="888888" w:sz="4"/>
+              <w:bottom w:val="single" w:color="888888" w:sz="4"/>
+              <w:right w:val="single" w:color="888888" w:sz="4"/>
+            </w:tcBorders>
+            <w:tcMar>
+              <w:top w:type="dxa" w:w="60"/>
+              <w:left w:type="dxa" w:w="100"/>
+              <w:bottom w:type="dxa" w:w="60"/>
+              <w:right w:type="dxa" w:w="100"/>
+            </w:tcMar>
+          </w:tcPr>
+          <w:p>
+            <w:pPr>
+              <w:jc w:val="left"/>
+            </w:pPr>
+            <w:r>
+              <w:rPr>
+                <w:rFonts w:ascii="Times New Roman" w:cs="Times New Roman" w:eastAsia="Times New Roman" w:hAnsi="Times New Roman"/>
+                <w:b w:val="false"/>
+                <w:bCs w:val="false"/>
+                <w:sz w:val="21"/>
+                <w:szCs w:val="21"/>
+              </w:rPr>
+              <w:t xml:space="preserve">Total Transactions</w:t>
+            </w:r>
+          </w:p>
+        </w:tc>
+        <w:tc>
+          <w:tcPr>
+            <w:tcW w:type="dxa" w:w="6660"/>
+            <w:tcBorders>
+              <w:top w:val="single" w:color="888888" w:sz="4"/>
+              <w:left w:val="single" w:color="888888" w:sz="4"/>
+              <w:bottom w:val="single" w:color="888888" w:sz="4"/>
+              <w:right w:val="single" w:color="888888" w:sz="4"/>
+            </w:tcBorders>
+            <w:tcMar>
+              <w:top w:type="dxa" w:w="60"/>
+              <w:left w:type="dxa" w:w="100"/>
+              <w:bottom w:type="dxa" w:w="60"/>
+              <w:right w:type="dxa" w:w="100"/>
+            </w:tcMar>
+          </w:tcPr>
+          <w:p>
+            <w:pPr>
+              <w:jc w:val="left"/>
+            </w:pPr>
+            <w:r>
+              <w:rPr>
+                <w:rFonts w:ascii="Times New Roman" w:cs="Times New Roman" w:eastAsia="Times New Roman" w:hAnsi="Times New Roman"/>
+                <w:b w:val="false"/>
+                <w:bCs w:val="false"/>
+                <w:sz w:val="21"/>
+                <w:szCs w:val="21"/>
+              </w:rPr>
+              <w:t xml:space="preserve">DISTINCTCOUNT(Transactions[TransactionID])</w:t>
+            </w:r>
+          </w:p>
+        </w:tc>
+      </w:tr>
+      <w:tr>
+        <w:trPr>
+          <w:tblHeader w:val="false"/>
+        </w:trPr>
+        <w:tc>
+          <w:tcPr>
+            <w:tcW w:type="dxa" w:w="2700"/>
+            <w:tcBorders>
+              <w:top w:val="single" w:color="888888" w:sz="4"/>
+              <w:left w:val="single" w:color="888888" w:sz="4"/>
+              <w:bottom w:val="single" w:color="888888" w:sz="4"/>
+              <w:right w:val="single" w:color="888888" w:sz="4"/>
+            </w:tcBorders>
+            <w:tcMar>
+              <w:top w:type="dxa" w:w="60"/>
+              <w:left w:type="dxa" w:w="100"/>
+              <w:bottom w:type="dxa" w:w="60"/>
+              <w:right w:type="dxa" w:w="100"/>
+            </w:tcMar>
+          </w:tcPr>
+          <w:p>
+            <w:pPr>
+              <w:jc w:val="left"/>
+            </w:pPr>
+            <w:r>
+              <w:rPr>
+                <w:rFonts w:ascii="Times New Roman" w:cs="Times New Roman" w:eastAsia="Times New Roman" w:hAnsi="Times New Roman"/>
+                <w:b w:val="false"/>
+                <w:bCs w:val="false"/>
+                <w:sz w:val="21"/>
+                <w:szCs w:val="21"/>
+              </w:rPr>
+              <w:t xml:space="preserve">Total Unique Customers</w:t>
+            </w:r>
+          </w:p>
+        </w:tc>
+        <w:tc>
+          <w:tcPr>
+            <w:tcW w:type="dxa" w:w="6660"/>
+            <w:tcBorders>
+              <w:top w:val="single" w:color="888888" w:sz="4"/>
+              <w:left w:val="single" w:color="888888" w:sz="4"/>
+              <w:bottom w:val="single" w:color="888888" w:sz="4"/>
+              <w:right w:val="single" w:color="888888" w:sz="4"/>
+            </w:tcBorders>
+            <w:tcMar>
+              <w:top w:type="dxa" w:w="60"/>
+              <w:left w:type="dxa" w:w="100"/>
+              <w:bottom w:type="dxa" w:w="60"/>
+              <w:right w:type="dxa" w:w="100"/>
+            </w:tcMar>
+          </w:tcPr>
+          <w:p>
+            <w:pPr>
+              <w:jc w:val="left"/>
+            </w:pPr>
+            <w:r>
+              <w:rPr>
+                <w:rFonts w:ascii="Times New Roman" w:cs="Times New Roman" w:eastAsia="Times New Roman" w:hAnsi="Times New Roman"/>
+                <w:b w:val="false"/>
+                <w:bCs w:val="false"/>
+                <w:sz w:val="21"/>
+                <w:szCs w:val="21"/>
+              </w:rPr>
+              <w:t xml:space="preserve">DISTINCTCOUNT(Transactions[CustomerID])</w:t>
+            </w:r>
+          </w:p>
+        </w:tc>
+      </w:tr>
+      <w:tr>
+        <w:trPr>
+          <w:tblHeader w:val="false"/>
+        </w:trPr>
+        <w:tc>
+          <w:tcPr>
+            <w:tcW w:type="dxa" w:w="2700"/>
+            <w:tcBorders>
+              <w:top w:val="single" w:color="888888" w:sz="4"/>
+              <w:left w:val="single" w:color="888888" w:sz="4"/>
+              <w:bottom w:val="single" w:color="888888" w:sz="4"/>
+              <w:right w:val="single" w:color="888888" w:sz="4"/>
+            </w:tcBorders>
+            <w:tcMar>
+              <w:top w:type="dxa" w:w="60"/>
+              <w:left w:type="dxa" w:w="100"/>
+              <w:bottom w:type="dxa" w:w="60"/>
+              <w:right w:type="dxa" w:w="100"/>
+            </w:tcMar>
+          </w:tcPr>
+          <w:p>
+            <w:pPr>
+              <w:jc w:val="left"/>
+            </w:pPr>
+            <w:r>
+              <w:rPr>
+                <w:rFonts w:ascii="Times New Roman" w:cs="Times New Roman" w:eastAsia="Times New Roman" w:hAnsi="Times New Roman"/>
+                <w:b w:val="false"/>
+                <w:bCs w:val="false"/>
+                <w:sz w:val="21"/>
+                <w:szCs w:val="21"/>
+              </w:rPr>
+              <w:t xml:space="preserve">Avg Order Value</w:t>
+            </w:r>
+          </w:p>
+        </w:tc>
+        <w:tc>
+          <w:tcPr>
+            <w:tcW w:type="dxa" w:w="6660"/>
+            <w:tcBorders>
+              <w:top w:val="single" w:color="888888" w:sz="4"/>
+              <w:left w:val="single" w:color="888888" w:sz="4"/>
+              <w:bottom w:val="single" w:color="888888" w:sz="4"/>
+              <w:right w:val="single" w:color="888888" w:sz="4"/>
+            </w:tcBorders>
+            <w:tcMar>
+              <w:top w:type="dxa" w:w="60"/>
+              <w:left w:type="dxa" w:w="100"/>
+              <w:bottom w:type="dxa" w:w="60"/>
+              <w:right w:type="dxa" w:w="100"/>
+            </w:tcMar>
+          </w:tcPr>
+          <w:p>
+            <w:pPr>
+              <w:jc w:val="left"/>
+            </w:pPr>
+            <w:r>
+              <w:rPr>
+                <w:rFonts w:ascii="Times New Roman" w:cs="Times New Roman" w:eastAsia="Times New Roman" w:hAnsi="Times New Roman"/>
+                <w:b w:val="false"/>
+                <w:bCs w:val="false"/>
+                <w:sz w:val="21"/>
+                <w:szCs w:val="21"/>
+              </w:rPr>
+              <w:t xml:space="preserve">DIVIDE([Total Revenue], [Total Transactions])</w:t>
+            </w:r>
+          </w:p>
+        </w:tc>
+      </w:tr>
+      <w:tr>
+        <w:trPr>
+          <w:tblHeader w:val="false"/>
+        </w:trPr>
+        <w:tc>
+          <w:tcPr>
+            <w:tcW w:type="dxa" w:w="2700"/>
+            <w:tcBorders>
+              <w:top w:val="single" w:color="888888" w:sz="4"/>
+              <w:left w:val="single" w:color="888888" w:sz="4"/>
+              <w:bottom w:val="single" w:color="888888" w:sz="4"/>
+              <w:right w:val="single" w:color="888888" w:sz="4"/>
+            </w:tcBorders>
+            <w:tcMar>
+              <w:top w:type="dxa" w:w="60"/>
+              <w:left w:type="dxa" w:w="100"/>
+              <w:bottom w:type="dxa" w:w="60"/>
+              <w:right w:type="dxa" w:w="100"/>
+            </w:tcMar>
+          </w:tcPr>
+          <w:p>
+            <w:pPr>
+              <w:jc w:val="left"/>
+            </w:pPr>
+            <w:r>
+              <w:rPr>
+                <w:rFonts w:ascii="Times New Roman" w:cs="Times New Roman" w:eastAsia="Times New Roman" w:hAnsi="Times New Roman"/>
+                <w:b w:val="false"/>
+                <w:bCs w:val="false"/>
+                <w:sz w:val="21"/>
+                <w:szCs w:val="21"/>
+              </w:rPr>
+              <w:t xml:space="preserve">Revenue per Customer</w:t>
+            </w:r>
+          </w:p>
+        </w:tc>
+        <w:tc>
+          <w:tcPr>
+            <w:tcW w:type="dxa" w:w="6660"/>
+            <w:tcBorders>
+              <w:top w:val="single" w:color="888888" w:sz="4"/>
+              <w:left w:val="single" w:color="888888" w:sz="4"/>
+              <w:bottom w:val="single" w:color="888888" w:sz="4"/>
+              <w:right w:val="single" w:color="888888" w:sz="4"/>
+            </w:tcBorders>
+            <w:tcMar>
+              <w:top w:type="dxa" w:w="60"/>
+              <w:left w:type="dxa" w:w="100"/>
+              <w:bottom w:type="dxa" w:w="60"/>
+              <w:right w:type="dxa" w:w="100"/>
+            </w:tcMar>
+          </w:tcPr>
+          <w:p>
+            <w:pPr>
+              <w:jc w:val="left"/>
+            </w:pPr>
+            <w:r>
+              <w:rPr>
+                <w:rFonts w:ascii="Times New Roman" w:cs="Times New Roman" w:eastAsia="Times New Roman" w:hAnsi="Times New Roman"/>
+                <w:b w:val="false"/>
+                <w:bCs w:val="false"/>
+                <w:sz w:val="21"/>
+                <w:szCs w:val="21"/>
+              </w:rPr>
+              <w:t xml:space="preserve">DIVIDE([Total Revenue], [Total Unique Customers])</w:t>
+            </w:r>
+          </w:p>
+        </w:tc>
+      </w:tr>
+      <w:tr>
+        <w:trPr>
+          <w:tblHeader w:val="false"/>
+        </w:trPr>
+        <w:tc>
+          <w:tcPr>
+            <w:tcW w:type="dxa" w:w="2700"/>
+            <w:tcBorders>
+              <w:top w:val="single" w:color="888888" w:sz="4"/>
+              <w:left w:val="single" w:color="888888" w:sz="4"/>
+              <w:bottom w:val="single" w:color="888888" w:sz="4"/>
+              <w:right w:val="single" w:color="888888" w:sz="4"/>
+            </w:tcBorders>
+            <w:tcMar>
+              <w:top w:type="dxa" w:w="60"/>
+              <w:left w:type="dxa" w:w="100"/>
+              <w:bottom w:type="dxa" w:w="60"/>
+              <w:right w:type="dxa" w:w="100"/>
+            </w:tcMar>
+          </w:tcPr>
+          <w:p>
+            <w:pPr>
+              <w:jc w:val="left"/>
+            </w:pPr>
+            <w:r>
+              <w:rPr>
+                <w:rFonts w:ascii="Times New Roman" w:cs="Times New Roman" w:eastAsia="Times New Roman" w:hAnsi="Times New Roman"/>
+                <w:b w:val="false"/>
+                <w:bCs w:val="false"/>
+                <w:sz w:val="21"/>
+                <w:szCs w:val="21"/>
+              </w:rPr>
+              <w:t xml:space="preserve">Revenue Share %</w:t>
+            </w:r>
+          </w:p>
+        </w:tc>
+        <w:tc>
+          <w:tcPr>
+            <w:tcW w:type="dxa" w:w="6660"/>
+            <w:tcBorders>
+              <w:top w:val="single" w:color="888888" w:sz="4"/>
+              <w:left w:val="single" w:color="888888" w:sz="4"/>
+              <w:bottom w:val="single" w:color="888888" w:sz="4"/>
+              <w:right w:val="single" w:color="888888" w:sz="4"/>
+            </w:tcBorders>
+            <w:tcMar>
+              <w:top w:type="dxa" w:w="60"/>
+              <w:left w:type="dxa" w:w="100"/>
+              <w:bottom w:type="dxa" w:w="60"/>
+              <w:right w:type="dxa" w:w="100"/>
+            </w:tcMar>
+          </w:tcPr>
+          <w:p>
+            <w:pPr>
+              <w:jc w:val="left"/>
+            </w:pPr>
+            <w:r>
+              <w:rPr>
+                <w:rFonts w:ascii="Times New Roman" w:cs="Times New Roman" w:eastAsia="Times New Roman" w:hAnsi="Times New Roman"/>
+                <w:b w:val="false"/>
+                <w:bCs w:val="false"/>
+                <w:sz w:val="21"/>
+                <w:szCs w:val="21"/>
+              </w:rPr>
+              <w:t xml:space="preserve">DIVIDE([Total Revenue], CALCULATE([Total Revenue], ALL(Customers[Region])))</w:t>
+            </w:r>
+          </w:p>
+        </w:tc>
+      </w:tr>
+    </w:tbl>
+    <w:p>
+      <w:pPr>
+        <w:spacing w:after="100"/>
+      </w:pPr>
+    </w:p>
+    <w:p>
+      <w:pPr>
+        <w:spacing w:after="120" w:line="300"/>
+        <w:jc w:val="both"/>
+      </w:pPr>
+      <w:r>
+        <w:rPr>
+          <w:rFonts w:ascii="Times New Roman" w:cs="Times New Roman" w:eastAsia="Times New Roman" w:hAnsi="Times New Roman"/>
+        </w:rPr>
+        <w:t xml:space="preserve">Measure dihitung secara dinamis mengikuti konteks filter, berbeda dengan kolom hitungan yang dievaluasi per baris saat data dimuat.</w:t>
       </w:r>
     </w:p>
     <w:p>
@@ -4202,7 +4202,7 @@
           <w:sz w:val="21"/>
           <w:szCs w:val="21"/>
         </w:rPr>
-        <w:t xml:space="preserve">Gambar 3.4 Measure Revenue Share % pada Power BI</w:t>
+        <w:t xml:space="preserve">Gambar 3.4 Measure Total Revenue pada Power BI</w:t>
       </w:r>
     </w:p>
     <w:p>
@@ -4214,68 +4214,7 @@
         <w:rPr>
           <w:rFonts w:ascii="Times New Roman" w:cs="Times New Roman" w:eastAsia="Times New Roman" w:hAnsi="Times New Roman"/>
         </w:rPr>
-        <w:t xml:space="preserve">Gambar 3.4 menampilkan measure Revenue Share % dengan format persentase. Fungsi ALL menghapus filter pada Region sehingga penyebut berupa total seluruh wilayah, sedangkan pembilangnya mengikuti wilayah pada baris tabel.</w:t>
-      </w:r>
-    </w:p>
-    <w:p>
-      <w:pPr>
-        <w:pStyle w:val="Heading2"/>
-        <w:spacing w:after="100" w:before="200"/>
-      </w:pPr>
-      <w:r>
-        <w:rPr>
-          <w:rFonts w:ascii="Times New Roman" w:cs="Times New Roman" w:eastAsia="Times New Roman" w:hAnsi="Times New Roman"/>
-        </w:rPr>
-        <w:t xml:space="preserve">3.5 Rancangan Dashboard</w:t>
-      </w:r>
-    </w:p>
-    <w:p>
-      <w:pPr>
-        <w:spacing w:after="120" w:line="300"/>
-        <w:jc w:val="both"/>
-      </w:pPr>
-      <w:r>
-        <w:rPr>
-          <w:rFonts w:ascii="Times New Roman" w:cs="Times New Roman" w:eastAsia="Times New Roman" w:hAnsi="Times New Roman"/>
-        </w:rPr>
-        <w:t xml:space="preserve">Dashboard terdiri atas tiga halaman: Revenue Report (penjualan), Customer Behavior Report (perilaku pelanggan), dan KPI Summary (ringkasan indikator kinerja utama). Interaktivitas disediakan oleh slicer Region dan slicer waktu (tahun, kuartal, bulan, dan quantity).</w:t>
-      </w:r>
-    </w:p>
-    <w:p>
-      <w:pPr>
-        <w:pStyle w:val="Heading1"/>
-        <w:spacing w:after="200" w:before="240"/>
-        <w:jc w:val="center"/>
-      </w:pPr>
-      <w:r>
-        <w:rPr>
-          <w:rFonts w:ascii="Times New Roman" w:cs="Times New Roman" w:eastAsia="Times New Roman" w:hAnsi="Times New Roman"/>
-        </w:rPr>
-        <w:t xml:space="preserve">BAB IV  HASIL DAN PEMBAHASAN</w:t>
-      </w:r>
-    </w:p>
-    <w:p>
-      <w:pPr>
-        <w:pStyle w:val="Heading2"/>
-        <w:spacing w:after="100" w:before="200"/>
-      </w:pPr>
-      <w:r>
-        <w:rPr>
-          <w:rFonts w:ascii="Times New Roman" w:cs="Times New Roman" w:eastAsia="Times New Roman" w:hAnsi="Times New Roman"/>
-        </w:rPr>
-        <w:t xml:space="preserve">4.1 Dashboard Power BI</w:t>
-      </w:r>
-    </w:p>
-    <w:p>
-      <w:pPr>
-        <w:pStyle w:val="Heading2"/>
-        <w:spacing w:after="100" w:before="200"/>
-      </w:pPr>
-      <w:r>
-        <w:rPr>
-          <w:rFonts w:ascii="Times New Roman" w:cs="Times New Roman" w:eastAsia="Times New Roman" w:hAnsi="Times New Roman"/>
-        </w:rPr>
-        <w:t xml:space="preserve">4.1.1 Revenue Report</w:t>
+        <w:t xml:space="preserve">Gambar 3.4 menampilkan measure Total Revenue yang menjumlahkan kolom TotalValue. Measure ini menjadi dasar bagi measure lain, seperti Avg Order Value dan Revenue per Customer.</w:t>
       </w:r>
     </w:p>
     <w:p>
@@ -4286,7 +4225,7 @@
       <w:r>
         <w:drawing>
           <wp:inline distT="0" distB="0" distL="0" distR="0">
-            <wp:extent cx="5143500" cy="2200275"/>
+            <wp:extent cx="5334000" cy="885825"/>
             <wp:effectExtent t="0" r="0" b="0" l="0"/>
             <wp:docPr id="1" name="" descr="" title=""/>
             <wp:cNvGraphicFramePr>
@@ -4311,7 +4250,7 @@
                   <pic:spPr bwMode="auto">
                     <a:xfrm>
                       <a:off x="0" y="0"/>
-                      <a:ext cx="5143500" cy="2200275"/>
+                      <a:ext cx="5334000" cy="885825"/>
                     </a:xfrm>
                     <a:prstGeom prst="rect">
                       <a:avLst/>
@@ -4337,7 +4276,7 @@
           <w:sz w:val="21"/>
           <w:szCs w:val="21"/>
         </w:rPr>
-        <w:t xml:space="preserve">Gambar 4.1 Tren pendapatan bulanan (Total Revenue by Month)</w:t>
+        <w:t xml:space="preserve">Gambar 3.5 Measure Revenue Share % pada Power BI</w:t>
       </w:r>
     </w:p>
     <w:p>
@@ -4349,7 +4288,68 @@
         <w:rPr>
           <w:rFonts w:ascii="Times New Roman" w:cs="Times New Roman" w:eastAsia="Times New Roman" w:hAnsi="Times New Roman"/>
         </w:rPr>
-        <w:t xml:space="preserve">Gambar 4.1 memperlihatkan pendapatan bulanan sepanjang 2024. Pendapatan mencapai puncak pada Juli (sekitar 71 ribu) dan September (sekitar 70 ribu), serta terendah pada November (sekitar 38 ribu). Pola ini menunjukkan adanya musiman dalam penjualan.</w:t>
+        <w:t xml:space="preserve">Gambar 3.5 menampilkan measure Revenue Share % dengan format persentase. Fungsi ALL menghapus filter pada Region sehingga penyebut berupa total seluruh wilayah, sedangkan pembilangnya mengikuti wilayah pada baris tabel.</w:t>
+      </w:r>
+    </w:p>
+    <w:p>
+      <w:pPr>
+        <w:pStyle w:val="Heading2"/>
+        <w:spacing w:after="100" w:before="200"/>
+      </w:pPr>
+      <w:r>
+        <w:rPr>
+          <w:rFonts w:ascii="Times New Roman" w:cs="Times New Roman" w:eastAsia="Times New Roman" w:hAnsi="Times New Roman"/>
+        </w:rPr>
+        <w:t xml:space="preserve">3.5 Rancangan Dashboard</w:t>
+      </w:r>
+    </w:p>
+    <w:p>
+      <w:pPr>
+        <w:spacing w:after="120" w:line="300"/>
+        <w:jc w:val="both"/>
+      </w:pPr>
+      <w:r>
+        <w:rPr>
+          <w:rFonts w:ascii="Times New Roman" w:cs="Times New Roman" w:eastAsia="Times New Roman" w:hAnsi="Times New Roman"/>
+        </w:rPr>
+        <w:t xml:space="preserve">Dashboard terdiri atas tiga halaman: Revenue Report (penjualan), Customer Behavior Report (perilaku pelanggan), dan KPI Summary (ringkasan indikator kinerja utama). Interaktivitas disediakan oleh slicer Region dan slicer waktu (tahun, kuartal, bulan, dan quantity).</w:t>
+      </w:r>
+    </w:p>
+    <w:p>
+      <w:pPr>
+        <w:pStyle w:val="Heading1"/>
+        <w:spacing w:after="200" w:before="240"/>
+        <w:jc w:val="center"/>
+      </w:pPr>
+      <w:r>
+        <w:rPr>
+          <w:rFonts w:ascii="Times New Roman" w:cs="Times New Roman" w:eastAsia="Times New Roman" w:hAnsi="Times New Roman"/>
+        </w:rPr>
+        <w:t xml:space="preserve">BAB IV  HASIL DAN PEMBAHASAN</w:t>
+      </w:r>
+    </w:p>
+    <w:p>
+      <w:pPr>
+        <w:pStyle w:val="Heading2"/>
+        <w:spacing w:after="100" w:before="200"/>
+      </w:pPr>
+      <w:r>
+        <w:rPr>
+          <w:rFonts w:ascii="Times New Roman" w:cs="Times New Roman" w:eastAsia="Times New Roman" w:hAnsi="Times New Roman"/>
+        </w:rPr>
+        <w:t xml:space="preserve">4.1 Dashboard Power BI</w:t>
+      </w:r>
+    </w:p>
+    <w:p>
+      <w:pPr>
+        <w:pStyle w:val="Heading2"/>
+        <w:spacing w:after="100" w:before="200"/>
+      </w:pPr>
+      <w:r>
+        <w:rPr>
+          <w:rFonts w:ascii="Times New Roman" w:cs="Times New Roman" w:eastAsia="Times New Roman" w:hAnsi="Times New Roman"/>
+        </w:rPr>
+        <w:t xml:space="preserve">4.1.1 Revenue Report</w:t>
       </w:r>
     </w:p>
     <w:p>
@@ -4360,7 +4360,7 @@
       <w:r>
         <w:drawing>
           <wp:inline distT="0" distB="0" distL="0" distR="0">
-            <wp:extent cx="4095750" cy="3009900"/>
+            <wp:extent cx="5143500" cy="2200275"/>
             <wp:effectExtent t="0" r="0" b="0" l="0"/>
             <wp:docPr id="1" name="" descr="" title=""/>
             <wp:cNvGraphicFramePr>
@@ -4385,7 +4385,7 @@
                   <pic:spPr bwMode="auto">
                     <a:xfrm>
                       <a:off x="0" y="0"/>
-                      <a:ext cx="4095750" cy="3009900"/>
+                      <a:ext cx="5143500" cy="2200275"/>
                     </a:xfrm>
                     <a:prstGeom prst="rect">
                       <a:avLst/>
@@ -4411,7 +4411,7 @@
           <w:sz w:val="21"/>
           <w:szCs w:val="21"/>
         </w:rPr>
-        <w:t xml:space="preserve">Gambar 4.2 Penjualan per produk (Total Sales by Product)</w:t>
+        <w:t xml:space="preserve">Gambar 4.1 Tren pendapatan bulanan (Total Revenue by Month)</w:t>
       </w:r>
     </w:p>
     <w:p>
@@ -4423,7 +4423,7 @@
         <w:rPr>
           <w:rFonts w:ascii="Times New Roman" w:cs="Times New Roman" w:eastAsia="Times New Roman" w:hAnsi="Times New Roman"/>
         </w:rPr>
-        <w:t xml:space="preserve">Gambar 4.2 menyajikan penjualan per nama produk dari yang tertinggi. ActiveWear Smartwatch memimpin dengan sekitar 39 ribu, disusul SoundWave Headphones dan SoundWave Novel. Pengelompokan memakai nama produk sehingga satu nama dapat mewakili beberapa ProductID.</w:t>
+        <w:t xml:space="preserve">Gambar 4.1 memperlihatkan pendapatan bulanan sepanjang 2024. Pendapatan mencapai puncak pada Juli (sekitar 71 ribu) dan September (sekitar 70 ribu), serta terendah pada November (sekitar 38 ribu). Pola ini menunjukkan adanya musiman dalam penjualan.</w:t>
       </w:r>
     </w:p>
     <w:p>
@@ -4434,7 +4434,7 @@
       <w:r>
         <w:drawing>
           <wp:inline distT="0" distB="0" distL="0" distR="0">
-            <wp:extent cx="3810000" cy="2781300"/>
+            <wp:extent cx="4095750" cy="3009900"/>
             <wp:effectExtent t="0" r="0" b="0" l="0"/>
             <wp:docPr id="1" name="" descr="" title=""/>
             <wp:cNvGraphicFramePr>
@@ -4459,7 +4459,7 @@
                   <pic:spPr bwMode="auto">
                     <a:xfrm>
                       <a:off x="0" y="0"/>
-                      <a:ext cx="3810000" cy="2781300"/>
+                      <a:ext cx="4095750" cy="3009900"/>
                     </a:xfrm>
                     <a:prstGeom prst="rect">
                       <a:avLst/>
@@ -4485,7 +4485,7 @@
           <w:sz w:val="21"/>
           <w:szCs w:val="21"/>
         </w:rPr>
-        <w:t xml:space="preserve">Gambar 4.3 Kontribusi per kategori (Total Sales by Category)</w:t>
+        <w:t xml:space="preserve">Gambar 4.2 Penjualan per produk (Total Sales by Product)</w:t>
       </w:r>
     </w:p>
     <w:p>
@@ -4497,19 +4497,7 @@
         <w:rPr>
           <w:rFonts w:ascii="Times New Roman" w:cs="Times New Roman" w:eastAsia="Times New Roman" w:hAnsi="Times New Roman"/>
         </w:rPr>
-        <w:t xml:space="preserve">Gambar 4.3 menunjukkan kontribusi tiap kategori: Books 27,85%, Electronics 26,20%, Clothing 24,08%, dan Home Decor 21,87%. Books dan Electronics bersama-sama menyumbang sekitar 54% pendapatan.</w:t>
-      </w:r>
-    </w:p>
-    <w:p>
-      <w:pPr>
-        <w:pStyle w:val="Heading2"/>
-        <w:spacing w:after="100" w:before="200"/>
-      </w:pPr>
-      <w:r>
-        <w:rPr>
-          <w:rFonts w:ascii="Times New Roman" w:cs="Times New Roman" w:eastAsia="Times New Roman" w:hAnsi="Times New Roman"/>
-        </w:rPr>
-        <w:t xml:space="preserve">4.1.2 Customer Behavior Report</w:t>
+        <w:t xml:space="preserve">Gambar 4.2 menyajikan penjualan per nama produk dari yang tertinggi. ActiveWear Smartwatch memimpin dengan sekitar 39 ribu, disusul SoundWave Headphones dan SoundWave Novel. Pengelompokan memakai nama produk sehingga satu nama dapat mewakili beberapa ProductID.</w:t>
       </w:r>
     </w:p>
     <w:p>
@@ -4520,7 +4508,7 @@
       <w:r>
         <w:drawing>
           <wp:inline distT="0" distB="0" distL="0" distR="0">
-            <wp:extent cx="5334000" cy="2952750"/>
+            <wp:extent cx="3810000" cy="2781300"/>
             <wp:effectExtent t="0" r="0" b="0" l="0"/>
             <wp:docPr id="1" name="" descr="" title=""/>
             <wp:cNvGraphicFramePr>
@@ -4545,7 +4533,7 @@
                   <pic:spPr bwMode="auto">
                     <a:xfrm>
                       <a:off x="0" y="0"/>
-                      <a:ext cx="5334000" cy="2952750"/>
+                      <a:ext cx="3810000" cy="2781300"/>
                     </a:xfrm>
                     <a:prstGeom prst="rect">
                       <a:avLst/>
@@ -4571,7 +4559,7 @@
           <w:sz w:val="21"/>
           <w:szCs w:val="21"/>
         </w:rPr>
-        <w:t xml:space="preserve">Gambar 4.4 Halaman Laporan Perilaku Pelanggan</w:t>
+        <w:t xml:space="preserve">Gambar 4.3 Kontribusi per kategori (Total Sales by Category)</w:t>
       </w:r>
     </w:p>
     <w:p>
@@ -4583,7 +4571,19 @@
         <w:rPr>
           <w:rFonts w:ascii="Times New Roman" w:cs="Times New Roman" w:eastAsia="Times New Roman" w:hAnsi="Times New Roman"/>
         </w:rPr>
-        <w:t xml:space="preserve">Gambar 4.4 menampilkan halaman perilaku pelanggan yang memuat dua grafik menurut wilayah serta slicer Region dan waktu (tahun, kuartal, bulan, dan quantity). Grafik kiri menunjukkan pendapatan per pelanggan, dan grafik kanan menunjukkan jumlah pelanggan aktif, yaitu South America 59, Europe 50, North America 46, dan Asia 44 (total 199).</w:t>
+        <w:t xml:space="preserve">Gambar 4.3 menunjukkan kontribusi tiap kategori: Books 27,85%, Electronics 26,20%, Clothing 24,08%, dan Home Decor 21,87%. Books dan Electronics bersama-sama menyumbang sekitar 54% pendapatan.</w:t>
+      </w:r>
+    </w:p>
+    <w:p>
+      <w:pPr>
+        <w:pStyle w:val="Heading2"/>
+        <w:spacing w:after="100" w:before="200"/>
+      </w:pPr>
+      <w:r>
+        <w:rPr>
+          <w:rFonts w:ascii="Times New Roman" w:cs="Times New Roman" w:eastAsia="Times New Roman" w:hAnsi="Times New Roman"/>
+        </w:rPr>
+        <w:t xml:space="preserve">4.1.2 Customer Behavior Report</w:t>
       </w:r>
     </w:p>
     <w:p>
@@ -4594,7 +4594,7 @@
       <w:r>
         <w:drawing>
           <wp:inline distT="0" distB="0" distL="0" distR="0">
-            <wp:extent cx="3619500" cy="2790825"/>
+            <wp:extent cx="5334000" cy="2952750"/>
             <wp:effectExtent t="0" r="0" b="0" l="0"/>
             <wp:docPr id="1" name="" descr="" title=""/>
             <wp:cNvGraphicFramePr>
@@ -4619,7 +4619,7 @@
                   <pic:spPr bwMode="auto">
                     <a:xfrm>
                       <a:off x="0" y="0"/>
-                      <a:ext cx="3619500" cy="2790825"/>
+                      <a:ext cx="5334000" cy="2952750"/>
                     </a:xfrm>
                     <a:prstGeom prst="rect">
                       <a:avLst/>
@@ -4645,7 +4645,7 @@
           <w:sz w:val="21"/>
           <w:szCs w:val="21"/>
         </w:rPr>
-        <w:t xml:space="preserve">Gambar 4.5 Pendapatan per pelanggan menurut wilayah (Revenue per Customer by Region)</w:t>
+        <w:t xml:space="preserve">Gambar 4.4 Halaman Laporan Perilaku Pelanggan</w:t>
       </w:r>
     </w:p>
     <w:p>
@@ -4657,19 +4657,7 @@
         <w:rPr>
           <w:rFonts w:ascii="Times New Roman" w:cs="Times New Roman" w:eastAsia="Times New Roman" w:hAnsi="Times New Roman"/>
         </w:rPr>
-        <w:t xml:space="preserve">Gambar 4.5 memperlihatkan rata-rata pendapatan per pelanggan aktif. South America tertinggi (3.717,84), disusul Asia (3.456,25), Europe (3.325,09), dan North America (3.311,16). Asia memiliki pelanggan paling sedikit, tetapi nilai per pelanggannya melampaui Europe dan North America.</w:t>
-      </w:r>
-    </w:p>
-    <w:p>
-      <w:pPr>
-        <w:pStyle w:val="Heading2"/>
-        <w:spacing w:after="100" w:before="200"/>
-      </w:pPr>
-      <w:r>
-        <w:rPr>
-          <w:rFonts w:ascii="Times New Roman" w:cs="Times New Roman" w:eastAsia="Times New Roman" w:hAnsi="Times New Roman"/>
-        </w:rPr>
-        <w:t xml:space="preserve">4.1.3 KPI Summary</w:t>
+        <w:t xml:space="preserve">Gambar 4.4 menampilkan halaman perilaku pelanggan yang memuat dua grafik menurut wilayah serta slicer Region dan waktu (tahun, kuartal, bulan, dan quantity). Grafik kiri menunjukkan pendapatan per pelanggan, dan grafik kanan menunjukkan jumlah pelanggan aktif, yaitu South America 59, Europe 50, North America 46, dan Asia 44 (total 199).</w:t>
       </w:r>
     </w:p>
     <w:p>
@@ -4680,7 +4668,7 @@
       <w:r>
         <w:drawing>
           <wp:inline distT="0" distB="0" distL="0" distR="0">
-            <wp:extent cx="5334000" cy="742950"/>
+            <wp:extent cx="3619500" cy="2790825"/>
             <wp:effectExtent t="0" r="0" b="0" l="0"/>
             <wp:docPr id="1" name="" descr="" title=""/>
             <wp:cNvGraphicFramePr>
@@ -4705,7 +4693,7 @@
                   <pic:spPr bwMode="auto">
                     <a:xfrm>
                       <a:off x="0" y="0"/>
-                      <a:ext cx="5334000" cy="742950"/>
+                      <a:ext cx="3619500" cy="2790825"/>
                     </a:xfrm>
                     <a:prstGeom prst="rect">
                       <a:avLst/>
@@ -4731,7 +4719,31 @@
           <w:sz w:val="21"/>
           <w:szCs w:val="21"/>
         </w:rPr>
-        <w:t xml:space="preserve">Gambar 4.6 Kartu KPI pada halaman Laporan Ringkasan KPI</w:t>
+        <w:t xml:space="preserve">Gambar 4.5 Pendapatan per pelanggan menurut wilayah (Revenue per Customer by Region)</w:t>
+      </w:r>
+    </w:p>
+    <w:p>
+      <w:pPr>
+        <w:spacing w:after="120" w:line="300"/>
+        <w:jc w:val="both"/>
+      </w:pPr>
+      <w:r>
+        <w:rPr>
+          <w:rFonts w:ascii="Times New Roman" w:cs="Times New Roman" w:eastAsia="Times New Roman" w:hAnsi="Times New Roman"/>
+        </w:rPr>
+        <w:t xml:space="preserve">Gambar 4.5 memperlihatkan rata-rata pendapatan per pelanggan aktif. South America tertinggi (3.717,84), disusul Asia (3.456,25), Europe (3.325,09), dan North America (3.311,16). Asia memiliki pelanggan paling sedikit, tetapi nilai per pelanggannya melampaui Europe dan North America.</w:t>
+      </w:r>
+    </w:p>
+    <w:p>
+      <w:pPr>
+        <w:pStyle w:val="Heading2"/>
+        <w:spacing w:after="100" w:before="200"/>
+      </w:pPr>
+      <w:r>
+        <w:rPr>
+          <w:rFonts w:ascii="Times New Roman" w:cs="Times New Roman" w:eastAsia="Times New Roman" w:hAnsi="Times New Roman"/>
+        </w:rPr>
+        <w:t xml:space="preserve">4.1.3 KPI Summary</w:t>
       </w:r>
     </w:p>
     <w:p>
@@ -4742,7 +4754,7 @@
       <w:r>
         <w:drawing>
           <wp:inline distT="0" distB="0" distL="0" distR="0">
-            <wp:extent cx="3810000" cy="1676400"/>
+            <wp:extent cx="5334000" cy="742950"/>
             <wp:effectExtent t="0" r="0" b="0" l="0"/>
             <wp:docPr id="1" name="" descr="" title=""/>
             <wp:cNvGraphicFramePr>
@@ -4767,7 +4779,7 @@
                   <pic:spPr bwMode="auto">
                     <a:xfrm>
                       <a:off x="0" y="0"/>
-                      <a:ext cx="3810000" cy="1676400"/>
+                      <a:ext cx="5334000" cy="742950"/>
                     </a:xfrm>
                     <a:prstGeom prst="rect">
                       <a:avLst/>
@@ -4793,7 +4805,7 @@
           <w:sz w:val="21"/>
           <w:szCs w:val="21"/>
         </w:rPr>
-        <w:t xml:space="preserve">Gambar 4.7 Tabel perbandingan wilayah</w:t>
+        <w:t xml:space="preserve">Gambar 4.6 Kartu KPI pada halaman Laporan Ringkasan KPI</w:t>
       </w:r>
     </w:p>
     <w:p>
@@ -4804,7 +4816,7 @@
       <w:r>
         <w:drawing>
           <wp:inline distT="0" distB="0" distL="0" distR="0">
-            <wp:extent cx="4953000" cy="1390650"/>
+            <wp:extent cx="3810000" cy="1676400"/>
             <wp:effectExtent t="0" r="0" b="0" l="0"/>
             <wp:docPr id="1" name="" descr="" title=""/>
             <wp:cNvGraphicFramePr>
@@ -4829,7 +4841,7 @@
                   <pic:spPr bwMode="auto">
                     <a:xfrm>
                       <a:off x="0" y="0"/>
-                      <a:ext cx="4953000" cy="1390650"/>
+                      <a:ext cx="3810000" cy="1676400"/>
                     </a:xfrm>
                     <a:prstGeom prst="rect">
                       <a:avLst/>
@@ -4855,7 +4867,7 @@
           <w:sz w:val="21"/>
           <w:szCs w:val="21"/>
         </w:rPr>
-        <w:t xml:space="preserve">Gambar 4.8 Grafik garis Total Revenue by Month</w:t>
+        <w:t xml:space="preserve">Gambar 4.7 Tabel perbandingan wilayah</w:t>
       </w:r>
     </w:p>
     <w:p>
@@ -4866,69 +4878,7 @@
       <w:r>
         <w:drawing>
           <wp:inline distT="0" distB="0" distL="0" distR="0">
-            <wp:extent cx="2857500" cy="2085975"/>
-            <wp:effectExtent t="0" r="0" b="0" l="0"/>
-            <wp:docPr id="1" name="" descr="" title=""/>
-            <wp:cNvGraphicFramePr>
-              <a:graphicFrameLocks xmlns:a="http://schemas.openxmlformats.org/drawingml/2006/main" noChangeAspect="1"/>
-            </wp:cNvGraphicFramePr>
-            <a:graphic xmlns:a="http://schemas.openxmlformats.org/drawingml/2006/main">
-              <a:graphicData uri="http://schemas.openxmlformats.org/drawingml/2006/picture">
-                <pic:pic xmlns:pic="http://schemas.openxmlformats.org/drawingml/2006/picture">
-                  <pic:nvPicPr>
-                    <pic:cNvPr id="0" name="" descr=""/>
-                    <pic:cNvPicPr>
-                      <a:picLocks noChangeAspect="1" noChangeArrowheads="1"/>
-                    </pic:cNvPicPr>
-                  </pic:nvPicPr>
-                  <pic:blipFill>
-                    <a:blip r:embed="rId17" cstate="none"/>
-                    <a:srcRect/>
-                    <a:stretch>
-                      <a:fillRect/>
-                    </a:stretch>
-                  </pic:blipFill>
-                  <pic:spPr bwMode="auto">
-                    <a:xfrm>
-                      <a:off x="0" y="0"/>
-                      <a:ext cx="2857500" cy="2085975"/>
-                    </a:xfrm>
-                    <a:prstGeom prst="rect">
-                      <a:avLst/>
-                    </a:prstGeom>
-                  </pic:spPr>
-                </pic:pic>
-              </a:graphicData>
-            </a:graphic>
-          </wp:inline>
-        </w:drawing>
-      </w:r>
-    </w:p>
-    <w:p>
-      <w:pPr>
-        <w:spacing w:after="160"/>
-        <w:jc w:val="center"/>
-      </w:pPr>
-      <w:r>
-        <w:rPr>
-          <w:rFonts w:ascii="Times New Roman" w:cs="Times New Roman" w:eastAsia="Times New Roman" w:hAnsi="Times New Roman"/>
-          <w:i/>
-          <w:iCs/>
-          <w:sz w:val="21"/>
-          <w:szCs w:val="21"/>
-        </w:rPr>
-        <w:t xml:space="preserve">Gambar 4.9 Grafik batang Total Revenue by Category</w:t>
-      </w:r>
-    </w:p>
-    <w:p>
-      <w:pPr>
-        <w:spacing w:after="60" w:before="100"/>
-        <w:jc w:val="center"/>
-      </w:pPr>
-      <w:r>
-        <w:drawing>
-          <wp:inline distT="0" distB="0" distL="0" distR="0">
-            <wp:extent cx="1619250" cy="781050"/>
+            <wp:extent cx="4953000" cy="1390650"/>
             <wp:effectExtent t="0" r="0" b="0" l="0"/>
             <wp:docPr id="1" name="" descr="" title=""/>
             <wp:cNvGraphicFramePr>
@@ -4953,7 +4903,7 @@
                   <pic:spPr bwMode="auto">
                     <a:xfrm>
                       <a:off x="0" y="0"/>
-                      <a:ext cx="1619250" cy="781050"/>
+                      <a:ext cx="4953000" cy="1390650"/>
                     </a:xfrm>
                     <a:prstGeom prst="rect">
                       <a:avLst/>
@@ -4979,7 +4929,7 @@
           <w:sz w:val="21"/>
           <w:szCs w:val="21"/>
         </w:rPr>
-        <w:t xml:space="preserve">Gambar 4.10 Slicer Region</w:t>
+        <w:t xml:space="preserve">Gambar 4.8 Grafik garis Total Revenue by Month</w:t>
       </w:r>
     </w:p>
     <w:p>
@@ -4990,7 +4940,69 @@
       <w:r>
         <w:drawing>
           <wp:inline distT="0" distB="0" distL="0" distR="0">
-            <wp:extent cx="1619250" cy="762000"/>
+            <wp:extent cx="2857500" cy="2085975"/>
+            <wp:effectExtent t="0" r="0" b="0" l="0"/>
+            <wp:docPr id="1" name="" descr="" title=""/>
+            <wp:cNvGraphicFramePr>
+              <a:graphicFrameLocks xmlns:a="http://schemas.openxmlformats.org/drawingml/2006/main" noChangeAspect="1"/>
+            </wp:cNvGraphicFramePr>
+            <a:graphic xmlns:a="http://schemas.openxmlformats.org/drawingml/2006/main">
+              <a:graphicData uri="http://schemas.openxmlformats.org/drawingml/2006/picture">
+                <pic:pic xmlns:pic="http://schemas.openxmlformats.org/drawingml/2006/picture">
+                  <pic:nvPicPr>
+                    <pic:cNvPr id="0" name="" descr=""/>
+                    <pic:cNvPicPr>
+                      <a:picLocks noChangeAspect="1" noChangeArrowheads="1"/>
+                    </pic:cNvPicPr>
+                  </pic:nvPicPr>
+                  <pic:blipFill>
+                    <a:blip r:embed="rId18" cstate="none"/>
+                    <a:srcRect/>
+                    <a:stretch>
+                      <a:fillRect/>
+                    </a:stretch>
+                  </pic:blipFill>
+                  <pic:spPr bwMode="auto">
+                    <a:xfrm>
+                      <a:off x="0" y="0"/>
+                      <a:ext cx="2857500" cy="2085975"/>
+                    </a:xfrm>
+                    <a:prstGeom prst="rect">
+                      <a:avLst/>
+                    </a:prstGeom>
+                  </pic:spPr>
+                </pic:pic>
+              </a:graphicData>
+            </a:graphic>
+          </wp:inline>
+        </w:drawing>
+      </w:r>
+    </w:p>
+    <w:p>
+      <w:pPr>
+        <w:spacing w:after="160"/>
+        <w:jc w:val="center"/>
+      </w:pPr>
+      <w:r>
+        <w:rPr>
+          <w:rFonts w:ascii="Times New Roman" w:cs="Times New Roman" w:eastAsia="Times New Roman" w:hAnsi="Times New Roman"/>
+          <w:i/>
+          <w:iCs/>
+          <w:sz w:val="21"/>
+          <w:szCs w:val="21"/>
+        </w:rPr>
+        <w:t xml:space="preserve">Gambar 4.9 Grafik batang Total Revenue by Category</w:t>
+      </w:r>
+    </w:p>
+    <w:p>
+      <w:pPr>
+        <w:spacing w:after="60" w:before="100"/>
+        <w:jc w:val="center"/>
+      </w:pPr>
+      <w:r>
+        <w:drawing>
+          <wp:inline distT="0" distB="0" distL="0" distR="0">
+            <wp:extent cx="1619250" cy="781050"/>
             <wp:effectExtent t="0" r="0" b="0" l="0"/>
             <wp:docPr id="1" name="" descr="" title=""/>
             <wp:cNvGraphicFramePr>
@@ -5015,7 +5027,7 @@
                   <pic:spPr bwMode="auto">
                     <a:xfrm>
                       <a:off x="0" y="0"/>
-                      <a:ext cx="1619250" cy="762000"/>
+                      <a:ext cx="1619250" cy="781050"/>
                     </a:xfrm>
                     <a:prstGeom prst="rect">
                       <a:avLst/>
@@ -5041,43 +5053,7 @@
           <w:sz w:val="21"/>
           <w:szCs w:val="21"/>
         </w:rPr>
-        <w:t xml:space="preserve">Gambar 4.11 Slicer Year</w:t>
-      </w:r>
-    </w:p>
-    <w:p>
-      <w:pPr>
-        <w:spacing w:after="120" w:line="300"/>
-        <w:jc w:val="both"/>
-      </w:pPr>
-      <w:r>
-        <w:rPr>
-          <w:rFonts w:ascii="Times New Roman" w:cs="Times New Roman" w:eastAsia="Times New Roman" w:hAnsi="Times New Roman"/>
-        </w:rPr>
-        <w:t xml:space="preserve">Gambar 4.6 sampai 4.10 menampilkan komponen halaman ringkasan kinerja dalam satu halaman. Empat kartu menyajikan Total Revenue (689.995,56), Total Transactions (1.000), Total Unique Customers (199), dan Avg Order Value (690,00). Tabel (Gambar 4.7) menyajikan perbandingan antar wilayah dengan Revenue per Customer, Total Revenue, dan Revenue Share %, sedangkan grafik garis (Gambar 4.8) menunjukkan tren bulanan. Slicer Region dan Year (Gambar 4.10 dan 4.10) memungkinkan pengguna menyaring seluruh visual. Seluruh angka dihasilkan oleh measure DAX.</w:t>
-      </w:r>
-    </w:p>
-    <w:p>
-      <w:pPr>
-        <w:pStyle w:val="Heading2"/>
-        <w:spacing w:after="100" w:before="200"/>
-      </w:pPr>
-      <w:r>
-        <w:rPr>
-          <w:rFonts w:ascii="Times New Roman" w:cs="Times New Roman" w:eastAsia="Times New Roman" w:hAnsi="Times New Roman"/>
-        </w:rPr>
-        <w:t xml:space="preserve">4.1.4 Interaktivitas Dashboard</w:t>
-      </w:r>
-    </w:p>
-    <w:p>
-      <w:pPr>
-        <w:spacing w:after="120" w:line="300"/>
-        <w:jc w:val="both"/>
-      </w:pPr>
-      <w:r>
-        <w:rPr>
-          <w:rFonts w:ascii="Times New Roman" w:cs="Times New Roman" w:eastAsia="Times New Roman" w:hAnsi="Times New Roman"/>
-        </w:rPr>
-        <w:t xml:space="preserve">Slicer memungkinkan pengguna menyaring seluruh visual secara serentak. Perhitungan pada measure DAX diperbarui menurut konteks filter yang dipilih.</w:t>
+        <w:t xml:space="preserve">Gambar 4.10 Slicer Region</w:t>
       </w:r>
     </w:p>
     <w:p>
@@ -5088,7 +5064,7 @@
       <w:r>
         <w:drawing>
           <wp:inline distT="0" distB="0" distL="0" distR="0">
-            <wp:extent cx="5143500" cy="2876550"/>
+            <wp:extent cx="1619250" cy="762000"/>
             <wp:effectExtent t="0" r="0" b="0" l="0"/>
             <wp:docPr id="1" name="" descr="" title=""/>
             <wp:cNvGraphicFramePr>
@@ -5113,6 +5089,104 @@
                   <pic:spPr bwMode="auto">
                     <a:xfrm>
                       <a:off x="0" y="0"/>
+                      <a:ext cx="1619250" cy="762000"/>
+                    </a:xfrm>
+                    <a:prstGeom prst="rect">
+                      <a:avLst/>
+                    </a:prstGeom>
+                  </pic:spPr>
+                </pic:pic>
+              </a:graphicData>
+            </a:graphic>
+          </wp:inline>
+        </w:drawing>
+      </w:r>
+    </w:p>
+    <w:p>
+      <w:pPr>
+        <w:spacing w:after="160"/>
+        <w:jc w:val="center"/>
+      </w:pPr>
+      <w:r>
+        <w:rPr>
+          <w:rFonts w:ascii="Times New Roman" w:cs="Times New Roman" w:eastAsia="Times New Roman" w:hAnsi="Times New Roman"/>
+          <w:i/>
+          <w:iCs/>
+          <w:sz w:val="21"/>
+          <w:szCs w:val="21"/>
+        </w:rPr>
+        <w:t xml:space="preserve">Gambar 4.11 Slicer Year</w:t>
+      </w:r>
+    </w:p>
+    <w:p>
+      <w:pPr>
+        <w:spacing w:after="120" w:line="300"/>
+        <w:jc w:val="both"/>
+      </w:pPr>
+      <w:r>
+        <w:rPr>
+          <w:rFonts w:ascii="Times New Roman" w:cs="Times New Roman" w:eastAsia="Times New Roman" w:hAnsi="Times New Roman"/>
+        </w:rPr>
+        <w:t xml:space="preserve">Gambar 4.6 sampai 4.10 menampilkan komponen halaman ringkasan kinerja dalam satu halaman. Empat kartu menyajikan Total Revenue (689.995,56), Total Transactions (1.000), Total Unique Customers (199), dan Avg Order Value (690,00). Tabel (Gambar 4.7) menyajikan perbandingan antar wilayah dengan Revenue per Customer, Total Revenue, dan Revenue Share %, sedangkan grafik garis (Gambar 4.8) menunjukkan tren bulanan. Slicer Region dan Year (Gambar 4.10 dan 4.10) memungkinkan pengguna menyaring seluruh visual. Seluruh angka dihasilkan oleh measure DAX.</w:t>
+      </w:r>
+    </w:p>
+    <w:p>
+      <w:pPr>
+        <w:pStyle w:val="Heading2"/>
+        <w:spacing w:after="100" w:before="200"/>
+      </w:pPr>
+      <w:r>
+        <w:rPr>
+          <w:rFonts w:ascii="Times New Roman" w:cs="Times New Roman" w:eastAsia="Times New Roman" w:hAnsi="Times New Roman"/>
+        </w:rPr>
+        <w:t xml:space="preserve">4.1.4 Interaktivitas Dashboard</w:t>
+      </w:r>
+    </w:p>
+    <w:p>
+      <w:pPr>
+        <w:spacing w:after="120" w:line="300"/>
+        <w:jc w:val="both"/>
+      </w:pPr>
+      <w:r>
+        <w:rPr>
+          <w:rFonts w:ascii="Times New Roman" w:cs="Times New Roman" w:eastAsia="Times New Roman" w:hAnsi="Times New Roman"/>
+        </w:rPr>
+        <w:t xml:space="preserve">Slicer memungkinkan pengguna menyaring seluruh visual secara serentak. Perhitungan pada measure DAX diperbarui menurut konteks filter yang dipilih.</w:t>
+      </w:r>
+    </w:p>
+    <w:p>
+      <w:pPr>
+        <w:spacing w:after="60" w:before="100"/>
+        <w:jc w:val="center"/>
+      </w:pPr>
+      <w:r>
+        <w:drawing>
+          <wp:inline distT="0" distB="0" distL="0" distR="0">
+            <wp:extent cx="5143500" cy="2876550"/>
+            <wp:effectExtent t="0" r="0" b="0" l="0"/>
+            <wp:docPr id="1" name="" descr="" title=""/>
+            <wp:cNvGraphicFramePr>
+              <a:graphicFrameLocks xmlns:a="http://schemas.openxmlformats.org/drawingml/2006/main" noChangeAspect="1"/>
+            </wp:cNvGraphicFramePr>
+            <a:graphic xmlns:a="http://schemas.openxmlformats.org/drawingml/2006/main">
+              <a:graphicData uri="http://schemas.openxmlformats.org/drawingml/2006/picture">
+                <pic:pic xmlns:pic="http://schemas.openxmlformats.org/drawingml/2006/picture">
+                  <pic:nvPicPr>
+                    <pic:cNvPr id="0" name="" descr=""/>
+                    <pic:cNvPicPr>
+                      <a:picLocks noChangeAspect="1" noChangeArrowheads="1"/>
+                    </pic:cNvPicPr>
+                  </pic:nvPicPr>
+                  <pic:blipFill>
+                    <a:blip r:embed="rId26" cstate="none"/>
+                    <a:srcRect/>
+                    <a:stretch>
+                      <a:fillRect/>
+                    </a:stretch>
+                  </pic:blipFill>
+                  <pic:spPr bwMode="auto">
+                    <a:xfrm>
+                      <a:off x="0" y="0"/>
                       <a:ext cx="5143500" cy="2876550"/>
                     </a:xfrm>
                     <a:prstGeom prst="rect">
@@ -5178,7 +5252,7 @@
                     </pic:cNvPicPr>
                   </pic:nvPicPr>
                   <pic:blipFill>
-                    <a:blip r:embed="rId26" cstate="none"/>
+                    <a:blip r:embed="rId27" cstate="none"/>
                     <a:srcRect/>
                     <a:stretch>
                       <a:fillRect/>

</xml_diff>